<commit_message>
Revise resume: remove photo, add DEMA cert, update achievements & interests
- Remove profile photo; centered clean header
- Reorder certifications and add DEMA drone bootcamp (NIT Jalandhar, 27/30)
- Update achievements: GATE CS qualified, 170+ DSA + 16th GfG leaderboard, mental wellness app with team of two
- Replace Leadership with Technical Interests; add Extra-Curricular & Languages
- Update README (no photo)
</commit_message>
<xml_diff>
--- a/Rahul_Chaudhary_Resume.docx
+++ b/Rahul_Chaudhary_Resume.docx
@@ -2,210 +2,130 @@
 <file path=word/document.xml><?xml version="1.0" encoding="utf-8"?>
 <w:document xmlns:wpc="http://schemas.microsoft.com/office/word/2010/wordprocessingCanvas" xmlns:mo="http://schemas.microsoft.com/office/mac/office/2008/main" xmlns:mc="http://schemas.openxmlformats.org/markup-compatibility/2006" xmlns:mv="urn:schemas-microsoft-com:mac:vml" xmlns:o="urn:schemas-microsoft-com:office:office" xmlns:r="http://schemas.openxmlformats.org/officeDocument/2006/relationships" xmlns:m="http://schemas.openxmlformats.org/officeDocument/2006/math" xmlns:v="urn:schemas-microsoft-com:vml" xmlns:wp14="http://schemas.microsoft.com/office/word/2010/wordprocessingDrawing" xmlns:wp="http://schemas.openxmlformats.org/drawingml/2006/wordprocessingDrawing" xmlns:w10="urn:schemas-microsoft-com:office:word" xmlns:w="http://schemas.openxmlformats.org/wordprocessingml/2006/main" xmlns:w14="http://schemas.microsoft.com/office/word/2010/wordml" xmlns:wpg="http://schemas.microsoft.com/office/word/2010/wordprocessingGroup" xmlns:wpi="http://schemas.microsoft.com/office/word/2010/wordprocessingInk" xmlns:wne="http://schemas.microsoft.com/office/word/2006/wordml" xmlns:wps="http://schemas.microsoft.com/office/word/2010/wordprocessingShape" mc:Ignorable="w14 wp14">
   <w:body>
-    <w:tbl>
-      <w:tblPr>
-        <w:tblW w:type="auto" w:w="0"/>
-        <w:tblLayout w:type="fixed"/>
-        <w:tblLook w:firstColumn="1" w:firstRow="1" w:lastColumn="0" w:lastRow="0" w:noHBand="0" w:noVBand="1" w:val="04A0"/>
-        <w:tblBorders>
-          <w:top w:val="none" w:sz="0"/>
-          <w:left w:val="none" w:sz="0"/>
-          <w:bottom w:val="none" w:sz="0"/>
-          <w:right w:val="none" w:sz="0"/>
-          <w:insideH w:val="none" w:sz="0"/>
-          <w:insideV w:val="none" w:sz="0"/>
-        </w:tblBorders>
-      </w:tblPr>
-      <w:tblGrid>
-        <w:gridCol w:w="1800"/>
-        <w:gridCol w:w="8712"/>
-      </w:tblGrid>
-      <w:tr>
-        <w:tc>
-          <w:tcPr>
-            <w:tcW w:type="dxa" w:w="1800"/>
-            <w:shd w:val="clear" w:color="auto" w:fill="E0F2FE"/>
-            <w:tcBorders>
-              <w:top w:val="dashed" w:sz="8" w:space="0" w:color="0EA5E9"/>
-              <w:left w:val="dashed" w:sz="8" w:space="0" w:color="0EA5E9"/>
-              <w:bottom w:val="dashed" w:sz="8" w:space="0" w:color="0EA5E9"/>
-              <w:right w:val="dashed" w:sz="8" w:space="0" w:color="0EA5E9"/>
-            </w:tcBorders>
-            <w:vAlign w:val="center"/>
-            <w:tcMar>
-              <w:top w:w="180" w:type="dxa"/>
-              <w:bottom w:w="180" w:type="dxa"/>
-              <w:start w:w="60" w:type="dxa"/>
-              <w:end w:w="60" w:type="dxa"/>
-            </w:tcMar>
-          </w:tcPr>
-          <w:p>
-            <w:pPr>
-              <w:spacing w:before="0" w:after="0" w:line="252" w:lineRule="auto"/>
-              <w:jc w:val="center"/>
-            </w:pPr>
-            <w:r>
-              <w:rPr>
-                <w:rFonts w:ascii="Calibri" w:hAnsi="Calibri"/>
-                <w:b/>
-                <w:i w:val="0"/>
-                <w:color w:val="0369A1"/>
-                <w:sz w:val="17"/>
-              </w:rPr>
-              <w:t>PHOTO</w:t>
-            </w:r>
-          </w:p>
-          <w:p>
-            <w:pPr>
-              <w:spacing w:before="0" w:after="0" w:line="252" w:lineRule="auto"/>
-              <w:jc w:val="center"/>
-            </w:pPr>
-            <w:r>
-              <w:rPr>
-                <w:rFonts w:ascii="Calibri" w:hAnsi="Calibri"/>
-                <w:b w:val="0"/>
-                <w:i w:val="0"/>
-                <w:color w:val="0369A1"/>
-                <w:sz w:val="15"/>
-              </w:rPr>
-              <w:t>Insert photo</w:t>
-            </w:r>
-          </w:p>
-        </w:tc>
-        <w:tc>
-          <w:tcPr>
-            <w:tcW w:type="dxa" w:w="8712"/>
-            <w:vAlign w:val="center"/>
-            <w:tcMar>
-              <w:top w:w="20" w:type="dxa"/>
-              <w:bottom w:w="20" w:type="dxa"/>
-              <w:start w:w="180" w:type="dxa"/>
-              <w:end w:w="40" w:type="dxa"/>
-            </w:tcMar>
-          </w:tcPr>
-          <w:p>
-            <w:pPr>
-              <w:spacing w:before="0" w:after="20" w:line="240" w:lineRule="auto"/>
-            </w:pPr>
-            <w:r>
-              <w:rPr>
-                <w:rFonts w:ascii="Calibri" w:hAnsi="Calibri"/>
-                <w:b/>
-                <w:i w:val="0"/>
-                <w:color w:val="0369A1"/>
-                <w:sz w:val="48"/>
-              </w:rPr>
-              <w:t>RAHUL CHAUDHARY</w:t>
-            </w:r>
-          </w:p>
-          <w:p>
-            <w:pPr>
-              <w:spacing w:before="0" w:after="100" w:line="240" w:lineRule="auto"/>
-            </w:pPr>
-            <w:r>
-              <w:rPr>
-                <w:rFonts w:ascii="Calibri" w:hAnsi="Calibri"/>
-                <w:b/>
-                <w:i w:val="0"/>
-                <w:color w:val="1F2937"/>
-                <w:sz w:val="24"/>
-              </w:rPr>
-              <w:t>Generative AI Engineer  |  Full Stack Developer</w:t>
-            </w:r>
-          </w:p>
-          <w:p>
-            <w:pPr>
-              <w:spacing w:before="0" w:after="20" w:line="269" w:lineRule="auto"/>
-            </w:pPr>
-            <w:r>
-              <w:rPr>
-                <w:rFonts w:ascii="Calibri" w:hAnsi="Calibri"/>
-                <w:b w:val="0"/>
-                <w:i w:val="0"/>
-                <w:color w:val="4B5563"/>
-                <w:sz w:val="19"/>
-              </w:rPr>
-              <w:t>Chandigarh, India</w:t>
-            </w:r>
-            <w:r>
-              <w:rPr>
-                <w:rFonts w:ascii="Calibri" w:hAnsi="Calibri"/>
-                <w:b w:val="0"/>
-                <w:i w:val="0"/>
-                <w:color w:val="0EA5E9"/>
-                <w:sz w:val="19"/>
-              </w:rPr>
-              <w:t xml:space="preserve">   •   </w:t>
-            </w:r>
-            <w:r>
-              <w:rPr>
-                <w:rFonts w:ascii="Calibri" w:hAnsi="Calibri"/>
-                <w:b w:val="0"/>
-                <w:i w:val="0"/>
-                <w:color w:val="4B5563"/>
-                <w:sz w:val="19"/>
-              </w:rPr>
-              <w:t>+91 78190 22307</w:t>
-            </w:r>
-            <w:r>
-              <w:rPr>
-                <w:rFonts w:ascii="Calibri" w:hAnsi="Calibri"/>
-                <w:b w:val="0"/>
-                <w:i w:val="0"/>
-                <w:color w:val="0EA5E9"/>
-                <w:sz w:val="19"/>
-              </w:rPr>
-              <w:t xml:space="preserve">   •   </w:t>
-            </w:r>
-            <w:r>
-              <w:rPr>
-                <w:rFonts w:ascii="Calibri" w:hAnsi="Calibri"/>
-                <w:b w:val="0"/>
-                <w:i w:val="0"/>
-                <w:color w:val="4B5563"/>
-                <w:sz w:val="19"/>
-              </w:rPr>
-              <w:t>rahulch19905@gmail.com</w:t>
-            </w:r>
-          </w:p>
-          <w:p>
-            <w:pPr>
-              <w:spacing w:before="0" w:after="0" w:line="269" w:lineRule="auto"/>
-            </w:pPr>
-            <w:r>
-              <w:rPr>
-                <w:rFonts w:ascii="Calibri" w:hAnsi="Calibri"/>
-                <w:b w:val="0"/>
-                <w:i w:val="0"/>
-                <w:color w:val="4B5563"/>
-                <w:sz w:val="19"/>
-              </w:rPr>
-              <w:t>linkedin.com/in/rahul-chaudhary-9a7b82310</w:t>
-            </w:r>
-            <w:r>
-              <w:rPr>
-                <w:rFonts w:ascii="Calibri" w:hAnsi="Calibri"/>
-                <w:b w:val="0"/>
-                <w:i w:val="0"/>
-                <w:color w:val="0EA5E9"/>
-                <w:sz w:val="19"/>
-              </w:rPr>
-              <w:t xml:space="preserve">   •   </w:t>
-            </w:r>
-            <w:r>
-              <w:rPr>
-                <w:rFonts w:ascii="Calibri" w:hAnsi="Calibri"/>
-                <w:b w:val="0"/>
-                <w:i w:val="0"/>
-                <w:color w:val="4B5563"/>
-                <w:sz w:val="19"/>
-              </w:rPr>
-              <w:t>github.com/RRNauhwar</w:t>
-            </w:r>
-          </w:p>
-        </w:tc>
-      </w:tr>
-    </w:tbl>
+    <w:p>
+      <w:pPr>
+        <w:spacing w:before="0" w:after="20" w:line="240" w:lineRule="auto"/>
+        <w:jc w:val="center"/>
+      </w:pPr>
+      <w:r>
+        <w:rPr>
+          <w:rFonts w:ascii="Calibri" w:hAnsi="Calibri"/>
+          <w:b/>
+          <w:i w:val="0"/>
+          <w:color w:val="0369A1"/>
+          <w:sz w:val="52"/>
+        </w:rPr>
+        <w:t>RAHUL CHAUDHARY</w:t>
+      </w:r>
+    </w:p>
+    <w:p>
+      <w:pPr>
+        <w:spacing w:before="0" w:after="100" w:line="240" w:lineRule="auto"/>
+        <w:jc w:val="center"/>
+      </w:pPr>
+      <w:r>
+        <w:rPr>
+          <w:rFonts w:ascii="Calibri" w:hAnsi="Calibri"/>
+          <w:b/>
+          <w:i w:val="0"/>
+          <w:color w:val="1F2937"/>
+          <w:sz w:val="25"/>
+        </w:rPr>
+        <w:t>Generative AI Engineer  |  Full Stack Developer</w:t>
+      </w:r>
+    </w:p>
+    <w:p>
+      <w:pPr>
+        <w:spacing w:before="0" w:after="20" w:line="276" w:lineRule="auto"/>
+        <w:jc w:val="center"/>
+      </w:pPr>
+      <w:r>
+        <w:rPr>
+          <w:rFonts w:ascii="Calibri" w:hAnsi="Calibri"/>
+          <w:b w:val="0"/>
+          <w:i w:val="0"/>
+          <w:color w:val="4B5563"/>
+          <w:sz w:val="19"/>
+        </w:rPr>
+        <w:t>Chandigarh, India</w:t>
+      </w:r>
+      <w:r>
+        <w:rPr>
+          <w:rFonts w:ascii="Calibri" w:hAnsi="Calibri"/>
+          <w:b w:val="0"/>
+          <w:i w:val="0"/>
+          <w:color w:val="0EA5E9"/>
+          <w:sz w:val="19"/>
+        </w:rPr>
+        <w:t xml:space="preserve">   •   </w:t>
+      </w:r>
+      <w:r>
+        <w:rPr>
+          <w:rFonts w:ascii="Calibri" w:hAnsi="Calibri"/>
+          <w:b w:val="0"/>
+          <w:i w:val="0"/>
+          <w:color w:val="4B5563"/>
+          <w:sz w:val="19"/>
+        </w:rPr>
+        <w:t>+91 78190 22307</w:t>
+      </w:r>
+      <w:r>
+        <w:rPr>
+          <w:rFonts w:ascii="Calibri" w:hAnsi="Calibri"/>
+          <w:b w:val="0"/>
+          <w:i w:val="0"/>
+          <w:color w:val="0EA5E9"/>
+          <w:sz w:val="19"/>
+        </w:rPr>
+        <w:t xml:space="preserve">   •   </w:t>
+      </w:r>
+      <w:r>
+        <w:rPr>
+          <w:rFonts w:ascii="Calibri" w:hAnsi="Calibri"/>
+          <w:b w:val="0"/>
+          <w:i w:val="0"/>
+          <w:color w:val="4B5563"/>
+          <w:sz w:val="19"/>
+        </w:rPr>
+        <w:t>rahulch19905@gmail.com</w:t>
+      </w:r>
+    </w:p>
+    <w:p>
+      <w:pPr>
+        <w:spacing w:before="0" w:after="0" w:line="276" w:lineRule="auto"/>
+        <w:jc w:val="center"/>
+      </w:pPr>
+      <w:r>
+        <w:rPr>
+          <w:rFonts w:ascii="Calibri" w:hAnsi="Calibri"/>
+          <w:b w:val="0"/>
+          <w:i w:val="0"/>
+          <w:color w:val="4B5563"/>
+          <w:sz w:val="19"/>
+        </w:rPr>
+        <w:t>linkedin.com/in/rahul-chaudhary-9a7b82310</w:t>
+      </w:r>
+      <w:r>
+        <w:rPr>
+          <w:rFonts w:ascii="Calibri" w:hAnsi="Calibri"/>
+          <w:b w:val="0"/>
+          <w:i w:val="0"/>
+          <w:color w:val="0EA5E9"/>
+          <w:sz w:val="19"/>
+        </w:rPr>
+        <w:t xml:space="preserve">   •   </w:t>
+      </w:r>
+      <w:r>
+        <w:rPr>
+          <w:rFonts w:ascii="Calibri" w:hAnsi="Calibri"/>
+          <w:b w:val="0"/>
+          <w:i w:val="0"/>
+          <w:color w:val="4B5563"/>
+          <w:sz w:val="19"/>
+        </w:rPr>
+        <w:t>github.com/RRNauhwar</w:t>
+      </w:r>
+    </w:p>
     <w:p>
       <w:pPr>
         <w:spacing w:before="80" w:after="120" w:line="240" w:lineRule="auto"/>
@@ -1962,6 +1882,52 @@
           <w:color w:val="1F2937"/>
           <w:sz w:val="20"/>
         </w:rPr>
+        <w:t xml:space="preserve">100 Days of Code: The Complete Python Pro Bootcamp </w:t>
+      </w:r>
+      <w:r>
+        <w:rPr>
+          <w:rFonts w:ascii="Calibri" w:hAnsi="Calibri"/>
+          <w:b w:val="0"/>
+          <w:i w:val="0"/>
+          <w:color w:val="0369A1"/>
+          <w:sz w:val="19"/>
+        </w:rPr>
+        <w:t xml:space="preserve">(Dr. Angela Yu – Udemy) – </w:t>
+      </w:r>
+      <w:r>
+        <w:rPr>
+          <w:rFonts w:ascii="Calibri" w:hAnsi="Calibri"/>
+          <w:b w:val="0"/>
+          <w:i w:val="0"/>
+          <w:color w:val="4B5563"/>
+          <w:sz w:val="19"/>
+        </w:rPr>
+        <w:t>100 hands-on Python projects spanning automation, APIs, and web apps.</w:t>
+      </w:r>
+    </w:p>
+    <w:p>
+      <w:pPr>
+        <w:spacing w:before="0" w:after="60" w:line="259" w:lineRule="auto"/>
+        <w:ind w:left="403" w:hanging="230"/>
+      </w:pPr>
+      <w:r>
+        <w:rPr>
+          <w:rFonts w:ascii="Calibri" w:hAnsi="Calibri"/>
+          <w:b/>
+          <w:i w:val="0"/>
+          <w:color w:val="0EA5E9"/>
+          <w:sz w:val="21"/>
+        </w:rPr>
+        <w:t xml:space="preserve">•  </w:t>
+      </w:r>
+      <w:r>
+        <w:rPr>
+          <w:rFonts w:ascii="Calibri" w:hAnsi="Calibri"/>
+          <w:b/>
+          <w:i w:val="0"/>
+          <w:color w:val="1F2937"/>
+          <w:sz w:val="20"/>
+        </w:rPr>
         <w:t xml:space="preserve">Full Stack Generative &amp; Agentic AI with Python </w:t>
       </w:r>
       <w:r>
@@ -2008,7 +1974,7 @@
           <w:color w:val="1F2937"/>
           <w:sz w:val="20"/>
         </w:rPr>
-        <w:t xml:space="preserve">100 Days of Code: The Complete Python Pro Bootcamp </w:t>
+        <w:t xml:space="preserve">Complete Web Development Course </w:t>
       </w:r>
       <w:r>
         <w:rPr>
@@ -2018,7 +1984,7 @@
           <w:color w:val="0369A1"/>
           <w:sz w:val="19"/>
         </w:rPr>
-        <w:t xml:space="preserve">(Dr. Angela Yu – Udemy) – </w:t>
+        <w:t xml:space="preserve">(Hitesh Choudhary – Udemy) – </w:t>
       </w:r>
       <w:r>
         <w:rPr>
@@ -2028,7 +1994,7 @@
           <w:color w:val="4B5563"/>
           <w:sz w:val="19"/>
         </w:rPr>
-        <w:t>100 hands-on Python projects spanning automation, APIs, and web apps.</w:t>
+        <w:t>End-to-end full stack web development, from front end to back end.</w:t>
       </w:r>
     </w:p>
     <w:p>
@@ -2054,7 +2020,7 @@
           <w:color w:val="1F2937"/>
           <w:sz w:val="20"/>
         </w:rPr>
-        <w:t xml:space="preserve">Complete Web Development Course </w:t>
+        <w:t xml:space="preserve">DEMA: Drone Engineering, Mechanics &amp; Applications Bootcamp </w:t>
       </w:r>
       <w:r>
         <w:rPr>
@@ -2064,7 +2030,7 @@
           <w:color w:val="0369A1"/>
           <w:sz w:val="19"/>
         </w:rPr>
-        <w:t xml:space="preserve">(Hitesh Choudhary – Udemy) – </w:t>
+        <w:t xml:space="preserve">(NIT Jalandhar &amp; CCET – MeitY, Govt. of India) – </w:t>
       </w:r>
       <w:r>
         <w:rPr>
@@ -2074,7 +2040,7 @@
           <w:color w:val="4B5563"/>
           <w:sz w:val="19"/>
         </w:rPr>
-        <w:t>End-to-end full stack web development, from front end to back end.</w:t>
+        <w:t>5-day bootcamp on UAV systems, drone mechanics, and embedded applications; scored 27/30 in the skill test.</w:t>
       </w:r>
     </w:p>
     <w:tbl>
@@ -2152,7 +2118,7 @@
           <w:color w:val="4B5563"/>
           <w:sz w:val="21"/>
         </w:rPr>
-        <w:t>Solved 170+ Data Structures &amp; Algorithms problems on GeeksforGeeks.</w:t>
+        <w:t>Qualified the GATE Computer Science examination while pursuing a B.E. in Electronics &amp; Communication Engineering.</w:t>
       </w:r>
     </w:p>
     <w:p>
@@ -2178,7 +2144,7 @@
           <w:color w:val="4B5563"/>
           <w:sz w:val="21"/>
         </w:rPr>
-        <w:t>Participated in the Hackfinity 2025 Hackathon and built an AI-powered mental wellness application.</w:t>
+        <w:t>Solved 170+ Data Structures &amp; Algorithms problems on GeeksforGeeks, ranking 16th on the institute leaderboard.</w:t>
       </w:r>
     </w:p>
     <w:p>
@@ -2204,7 +2170,7 @@
           <w:color w:val="4B5563"/>
           <w:sz w:val="21"/>
         </w:rPr>
-        <w:t>Appeared for the GATE examination while pursuing B.E. in Electronics &amp; Communication Engineering.</w:t>
+        <w:t>Built an AI-powered mental wellness application with a team of two at the Hackfinity 2025 Hackathon.</w:t>
       </w:r>
     </w:p>
     <w:tbl>
@@ -2248,7 +2214,7 @@
                 <w:color w:val="FFFFFF"/>
                 <w:sz w:val="22"/>
               </w:rPr>
-              <w:t>LEADERSHIP &amp; ACTIVITIES</w:t>
+              <w:t>TECHNICAL INTERESTS</w:t>
             </w:r>
           </w:p>
         </w:tc>
@@ -2261,7 +2227,7 @@
     </w:p>
     <w:p>
       <w:pPr>
-        <w:spacing w:before="0" w:after="40" w:line="264" w:lineRule="auto"/>
+        <w:spacing w:before="0" w:after="40" w:line="269" w:lineRule="auto"/>
         <w:ind w:left="144"/>
       </w:pPr>
       <w:r>
@@ -2272,32 +2238,64 @@
           <w:color w:val="4B5563"/>
           <w:sz w:val="20"/>
         </w:rPr>
-        <w:t>Member – Robotics Club, CCET</w:t>
+        <w:t>Generative AI  •  AI Automation  •  Agentic AI  •  Backend System Design</w:t>
       </w:r>
-      <w:r>
-        <w:rPr>
-          <w:rFonts w:ascii="Calibri" w:hAnsi="Calibri"/>
-          <w:b w:val="0"/>
-          <w:i w:val="0"/>
-          <w:color w:val="0EA5E9"/>
-          <w:sz w:val="20"/>
-        </w:rPr>
-        <w:t xml:space="preserve">      •      </w:t>
-      </w:r>
-      <w:r>
-        <w:rPr>
-          <w:rFonts w:ascii="Calibri" w:hAnsi="Calibri"/>
-          <w:b w:val="0"/>
-          <w:i w:val="0"/>
-          <w:color w:val="4B5563"/>
-          <w:sz w:val="20"/>
-        </w:rPr>
-        <w:t>Member – ACM Student Chapter</w:t>
-      </w:r>
+    </w:p>
+    <w:tbl>
+      <w:tblPr>
+        <w:tblW w:type="auto" w:w="0"/>
+        <w:jc w:val="center"/>
+        <w:tblLook w:firstColumn="1" w:firstRow="1" w:lastColumn="0" w:lastRow="0" w:noHBand="0" w:noVBand="1" w:val="04A0"/>
+        <w:tblBorders>
+          <w:top w:val="none" w:sz="0"/>
+          <w:left w:val="none" w:sz="0"/>
+          <w:bottom w:val="none" w:sz="0"/>
+          <w:right w:val="none" w:sz="0"/>
+          <w:insideH w:val="none" w:sz="0"/>
+          <w:insideV w:val="none" w:sz="0"/>
+        </w:tblBorders>
+      </w:tblPr>
+      <w:tblGrid>
+        <w:gridCol w:w="10512"/>
+      </w:tblGrid>
+      <w:tr>
+        <w:tc>
+          <w:tcPr>
+            <w:tcW w:type="dxa" w:w="10512"/>
+            <w:shd w:val="clear" w:color="auto" w:fill="0EA5E9"/>
+            <w:tcMar>
+              <w:top w:w="30" w:type="dxa"/>
+              <w:bottom w:w="30" w:type="dxa"/>
+              <w:start w:w="110" w:type="dxa"/>
+              <w:end w:w="110" w:type="dxa"/>
+            </w:tcMar>
+          </w:tcPr>
+          <w:p>
+            <w:pPr>
+              <w:spacing w:before="0" w:after="0" w:line="240" w:lineRule="auto"/>
+            </w:pPr>
+            <w:r>
+              <w:rPr>
+                <w:rFonts w:ascii="Calibri" w:hAnsi="Calibri"/>
+                <w:b/>
+                <w:i w:val="0"/>
+                <w:color w:val="FFFFFF"/>
+                <w:sz w:val="22"/>
+              </w:rPr>
+              <w:t>EXTRA-CURRICULAR &amp; LANGUAGES</w:t>
+            </w:r>
+          </w:p>
+        </w:tc>
+      </w:tr>
+    </w:tbl>
+    <w:p>
+      <w:pPr>
+        <w:spacing w:before="0" w:after="40" w:line="240" w:lineRule="auto"/>
+      </w:pPr>
     </w:p>
     <w:p>
       <w:pPr>
-        <w:spacing w:before="0" w:after="40" w:line="264" w:lineRule="auto"/>
+        <w:spacing w:before="0" w:after="60" w:line="269" w:lineRule="auto"/>
         <w:ind w:left="144"/>
       </w:pPr>
       <w:r>
@@ -2318,7 +2316,33 @@
           <w:color w:val="4B5563"/>
           <w:sz w:val="20"/>
         </w:rPr>
-        <w:t>Chess  •  Volleyball</w:t>
+        <w:t>Chess  •  Space &amp; Astronomy</w:t>
+      </w:r>
+    </w:p>
+    <w:p>
+      <w:pPr>
+        <w:spacing w:before="0" w:after="40" w:line="269" w:lineRule="auto"/>
+        <w:ind w:left="144"/>
+      </w:pPr>
+      <w:r>
+        <w:rPr>
+          <w:rFonts w:ascii="Calibri" w:hAnsi="Calibri"/>
+          <w:b/>
+          <w:i w:val="0"/>
+          <w:color w:val="0369A1"/>
+          <w:sz w:val="20"/>
+        </w:rPr>
+        <w:t xml:space="preserve">Languages: </w:t>
+      </w:r>
+      <w:r>
+        <w:rPr>
+          <w:rFonts w:ascii="Calibri" w:hAnsi="Calibri"/>
+          <w:b w:val="0"/>
+          <w:i w:val="0"/>
+          <w:color w:val="4B5563"/>
+          <w:sz w:val="20"/>
+        </w:rPr>
+        <w:t>English  •  Hindi  •  German (Beginner)</w:t>
       </w:r>
     </w:p>
     <w:sectPr>

</xml_diff>

<commit_message>
Rebuild resume to strictly follow CCET template on one page
- Embed official CCET logo in a template-style header (logo | identity | contact)
- Serif (Times New Roman) typography, education table, sky-blue section bars
- Compress to a single page (verified 1 page via HTML twin, ~0.42in slack)
- Merge skills to 4 lines; keep 4 projects (2 concise bullets each)
- Add HTML twin (index.html), PDF preview, and logo assets
- Update README with one-page verification notes
</commit_message>
<xml_diff>
--- a/Rahul_Chaudhary_Resume.docx
+++ b/Rahul_Chaudhary_Resume.docx
@@ -2,135 +2,294 @@
 <file path=word/document.xml><?xml version="1.0" encoding="utf-8"?>
 <w:document xmlns:wpc="http://schemas.microsoft.com/office/word/2010/wordprocessingCanvas" xmlns:mo="http://schemas.microsoft.com/office/mac/office/2008/main" xmlns:mc="http://schemas.openxmlformats.org/markup-compatibility/2006" xmlns:mv="urn:schemas-microsoft-com:mac:vml" xmlns:o="urn:schemas-microsoft-com:office:office" xmlns:r="http://schemas.openxmlformats.org/officeDocument/2006/relationships" xmlns:m="http://schemas.openxmlformats.org/officeDocument/2006/math" xmlns:v="urn:schemas-microsoft-com:vml" xmlns:wp14="http://schemas.microsoft.com/office/word/2010/wordprocessingDrawing" xmlns:wp="http://schemas.openxmlformats.org/drawingml/2006/wordprocessingDrawing" xmlns:w10="urn:schemas-microsoft-com:office:word" xmlns:w="http://schemas.openxmlformats.org/wordprocessingml/2006/main" xmlns:w14="http://schemas.microsoft.com/office/word/2010/wordml" xmlns:wpg="http://schemas.microsoft.com/office/word/2010/wordprocessingGroup" xmlns:wpi="http://schemas.microsoft.com/office/word/2010/wordprocessingInk" xmlns:wne="http://schemas.microsoft.com/office/word/2006/wordml" xmlns:wps="http://schemas.microsoft.com/office/word/2010/wordprocessingShape" mc:Ignorable="w14 wp14">
   <w:body>
+    <w:tbl>
+      <w:tblPr>
+        <w:tblW w:type="auto" w:w="0"/>
+        <w:tblLayout w:type="fixed"/>
+        <w:tblLook w:firstColumn="1" w:firstRow="1" w:lastColumn="0" w:lastRow="0" w:noHBand="0" w:noVBand="1" w:val="04A0"/>
+        <w:tblBorders>
+          <w:top w:val="none" w:sz="0"/>
+          <w:left w:val="none" w:sz="0"/>
+          <w:bottom w:val="none" w:sz="0"/>
+          <w:right w:val="none" w:sz="0"/>
+          <w:insideH w:val="none" w:sz="0"/>
+          <w:insideV w:val="none" w:sz="0"/>
+        </w:tblBorders>
+      </w:tblPr>
+      <w:tblGrid>
+        <w:gridCol w:w="1512"/>
+        <w:gridCol w:w="6264"/>
+        <w:gridCol w:w="3024"/>
+      </w:tblGrid>
+      <w:tr>
+        <w:tc>
+          <w:tcPr>
+            <w:tcW w:type="dxa" w:w="1512"/>
+            <w:vAlign w:val="center"/>
+            <w:tcMar>
+              <w:top w:w="0" w:type="dxa"/>
+              <w:bottom w:w="0" w:type="dxa"/>
+              <w:start w:w="0" w:type="dxa"/>
+              <w:end w:w="40" w:type="dxa"/>
+            </w:tcMar>
+          </w:tcPr>
+          <w:p>
+            <w:pPr>
+              <w:spacing w:before="0" w:after="0" w:line="240" w:lineRule="auto"/>
+              <w:jc w:val="left"/>
+            </w:pPr>
+            <w:r>
+              <w:drawing>
+                <wp:inline xmlns:a="http://schemas.openxmlformats.org/drawingml/2006/main" xmlns:pic="http://schemas.openxmlformats.org/drawingml/2006/picture">
+                  <wp:extent cx="868680" cy="844861"/>
+                  <wp:docPr id="1" name="Picture 1"/>
+                  <wp:cNvGraphicFramePr>
+                    <a:graphicFrameLocks noChangeAspect="1"/>
+                  </wp:cNvGraphicFramePr>
+                  <a:graphic>
+                    <a:graphicData uri="http://schemas.openxmlformats.org/drawingml/2006/picture">
+                      <pic:pic>
+                        <pic:nvPicPr>
+                          <pic:cNvPr id="0" name="ccet_logo.png"/>
+                          <pic:cNvPicPr/>
+                        </pic:nvPicPr>
+                        <pic:blipFill>
+                          <a:blip r:embed="rId9"/>
+                          <a:stretch>
+                            <a:fillRect/>
+                          </a:stretch>
+                        </pic:blipFill>
+                        <pic:spPr>
+                          <a:xfrm>
+                            <a:off x="0" y="0"/>
+                            <a:ext cx="868680" cy="844861"/>
+                          </a:xfrm>
+                          <a:prstGeom prst="rect"/>
+                        </pic:spPr>
+                      </pic:pic>
+                    </a:graphicData>
+                  </a:graphic>
+                </wp:inline>
+              </w:drawing>
+            </w:r>
+          </w:p>
+        </w:tc>
+        <w:tc>
+          <w:tcPr>
+            <w:tcW w:type="dxa" w:w="6264"/>
+            <w:vAlign w:val="center"/>
+            <w:tcMar>
+              <w:top w:w="0" w:type="dxa"/>
+              <w:bottom w:w="0" w:type="dxa"/>
+              <w:start w:w="60" w:type="dxa"/>
+              <w:end w:w="60" w:type="dxa"/>
+            </w:tcMar>
+          </w:tcPr>
+          <w:p>
+            <w:pPr>
+              <w:spacing w:before="0" w:after="0" w:line="240" w:lineRule="auto"/>
+            </w:pPr>
+            <w:r>
+              <w:rPr>
+                <w:rFonts w:ascii="Times New Roman" w:hAnsi="Times New Roman"/>
+                <w:b/>
+                <w:i w:val="0"/>
+                <w:color w:val="1A1A1A"/>
+                <w:sz w:val="38"/>
+              </w:rPr>
+              <w:t>RAHUL CHAUDHARY</w:t>
+            </w:r>
+          </w:p>
+          <w:p>
+            <w:pPr>
+              <w:spacing w:before="20" w:after="0" w:line="240" w:lineRule="auto"/>
+            </w:pPr>
+            <w:r>
+              <w:rPr>
+                <w:rFonts w:ascii="Times New Roman" w:hAnsi="Times New Roman"/>
+                <w:b/>
+                <w:i w:val="0"/>
+                <w:color w:val="0369A1"/>
+                <w:sz w:val="20"/>
+              </w:rPr>
+              <w:t>Generative AI Engineer  |  Full Stack Developer</w:t>
+            </w:r>
+          </w:p>
+          <w:p>
+            <w:pPr>
+              <w:spacing w:before="20" w:after="0" w:line="240" w:lineRule="auto"/>
+            </w:pPr>
+            <w:r>
+              <w:rPr>
+                <w:rFonts w:ascii="Times New Roman" w:hAnsi="Times New Roman"/>
+                <w:b w:val="0"/>
+                <w:i w:val="0"/>
+                <w:color w:val="333333"/>
+                <w:sz w:val="17"/>
+              </w:rPr>
+              <w:t>B.E. Electronics &amp; Communication Engineering</w:t>
+            </w:r>
+          </w:p>
+          <w:p>
+            <w:pPr>
+              <w:spacing w:before="0" w:after="0" w:line="240" w:lineRule="auto"/>
+            </w:pPr>
+            <w:r>
+              <w:rPr>
+                <w:rFonts w:ascii="Times New Roman" w:hAnsi="Times New Roman"/>
+                <w:b w:val="0"/>
+                <w:i w:val="0"/>
+                <w:color w:val="333333"/>
+                <w:sz w:val="17"/>
+              </w:rPr>
+              <w:t>Chandigarh College of Engineering &amp; Technology</w:t>
+            </w:r>
+          </w:p>
+        </w:tc>
+        <w:tc>
+          <w:tcPr>
+            <w:tcW w:type="dxa" w:w="3024"/>
+            <w:vAlign w:val="center"/>
+            <w:tcMar>
+              <w:top w:w="0" w:type="dxa"/>
+              <w:bottom w:w="0" w:type="dxa"/>
+              <w:start w:w="40" w:type="dxa"/>
+              <w:end w:w="0" w:type="dxa"/>
+            </w:tcMar>
+          </w:tcPr>
+          <w:p>
+            <w:pPr>
+              <w:spacing w:before="0" w:after="0" w:line="259" w:lineRule="auto"/>
+            </w:pPr>
+            <w:r>
+              <w:rPr>
+                <w:rFonts w:ascii="Times New Roman" w:hAnsi="Times New Roman"/>
+                <w:b/>
+                <w:i w:val="0"/>
+                <w:color w:val="0369A1"/>
+                <w:sz w:val="16"/>
+              </w:rPr>
+              <w:t xml:space="preserve">Phone: </w:t>
+            </w:r>
+            <w:r>
+              <w:rPr>
+                <w:rFonts w:ascii="Times New Roman" w:hAnsi="Times New Roman"/>
+                <w:b w:val="0"/>
+                <w:i w:val="0"/>
+                <w:color w:val="333333"/>
+                <w:sz w:val="16"/>
+              </w:rPr>
+              <w:t>+91 78190 22307</w:t>
+            </w:r>
+          </w:p>
+          <w:p>
+            <w:pPr>
+              <w:spacing w:before="0" w:after="0" w:line="259" w:lineRule="auto"/>
+            </w:pPr>
+            <w:r>
+              <w:rPr>
+                <w:rFonts w:ascii="Times New Roman" w:hAnsi="Times New Roman"/>
+                <w:b/>
+                <w:i w:val="0"/>
+                <w:color w:val="0369A1"/>
+                <w:sz w:val="16"/>
+              </w:rPr>
+              <w:t xml:space="preserve">Email: </w:t>
+            </w:r>
+            <w:r>
+              <w:rPr>
+                <w:rFonts w:ascii="Times New Roman" w:hAnsi="Times New Roman"/>
+                <w:b w:val="0"/>
+                <w:i w:val="0"/>
+                <w:color w:val="333333"/>
+                <w:sz w:val="16"/>
+              </w:rPr>
+              <w:t>rahulch19905@gmail.com</w:t>
+            </w:r>
+          </w:p>
+          <w:p>
+            <w:pPr>
+              <w:spacing w:before="0" w:after="0" w:line="259" w:lineRule="auto"/>
+            </w:pPr>
+            <w:r>
+              <w:rPr>
+                <w:rFonts w:ascii="Times New Roman" w:hAnsi="Times New Roman"/>
+                <w:b/>
+                <w:i w:val="0"/>
+                <w:color w:val="0369A1"/>
+                <w:sz w:val="16"/>
+              </w:rPr>
+              <w:t xml:space="preserve">LinkedIn: </w:t>
+            </w:r>
+            <w:r>
+              <w:rPr>
+                <w:rFonts w:ascii="Times New Roman" w:hAnsi="Times New Roman"/>
+                <w:b w:val="0"/>
+                <w:i w:val="0"/>
+                <w:color w:val="333333"/>
+                <w:sz w:val="16"/>
+              </w:rPr>
+              <w:t>in/rahul-chaudhary-9a7b82310</w:t>
+            </w:r>
+          </w:p>
+          <w:p>
+            <w:pPr>
+              <w:spacing w:before="0" w:after="0" w:line="259" w:lineRule="auto"/>
+            </w:pPr>
+            <w:r>
+              <w:rPr>
+                <w:rFonts w:ascii="Times New Roman" w:hAnsi="Times New Roman"/>
+                <w:b/>
+                <w:i w:val="0"/>
+                <w:color w:val="0369A1"/>
+                <w:sz w:val="16"/>
+              </w:rPr>
+              <w:t xml:space="preserve">GitHub: </w:t>
+            </w:r>
+            <w:r>
+              <w:rPr>
+                <w:rFonts w:ascii="Times New Roman" w:hAnsi="Times New Roman"/>
+                <w:b w:val="0"/>
+                <w:i w:val="0"/>
+                <w:color w:val="333333"/>
+                <w:sz w:val="16"/>
+              </w:rPr>
+              <w:t>github.com/RRNauhwar</w:t>
+            </w:r>
+          </w:p>
+          <w:p>
+            <w:pPr>
+              <w:spacing w:before="0" w:after="0" w:line="259" w:lineRule="auto"/>
+            </w:pPr>
+            <w:r>
+              <w:rPr>
+                <w:rFonts w:ascii="Times New Roman" w:hAnsi="Times New Roman"/>
+                <w:b/>
+                <w:i w:val="0"/>
+                <w:color w:val="0369A1"/>
+                <w:sz w:val="16"/>
+              </w:rPr>
+              <w:t xml:space="preserve">Location: </w:t>
+            </w:r>
+            <w:r>
+              <w:rPr>
+                <w:rFonts w:ascii="Times New Roman" w:hAnsi="Times New Roman"/>
+                <w:b w:val="0"/>
+                <w:i w:val="0"/>
+                <w:color w:val="333333"/>
+                <w:sz w:val="16"/>
+              </w:rPr>
+              <w:t>Chandigarh, India</w:t>
+            </w:r>
+          </w:p>
+        </w:tc>
+      </w:tr>
+    </w:tbl>
     <w:p>
       <w:pPr>
-        <w:spacing w:before="0" w:after="20" w:line="240" w:lineRule="auto"/>
-        <w:jc w:val="center"/>
-      </w:pPr>
-      <w:r>
-        <w:rPr>
-          <w:rFonts w:ascii="Calibri" w:hAnsi="Calibri"/>
-          <w:b/>
-          <w:i w:val="0"/>
-          <w:color w:val="0369A1"/>
-          <w:sz w:val="52"/>
-        </w:rPr>
-        <w:t>RAHUL CHAUDHARY</w:t>
-      </w:r>
-    </w:p>
-    <w:p>
-      <w:pPr>
-        <w:spacing w:before="0" w:after="100" w:line="240" w:lineRule="auto"/>
-        <w:jc w:val="center"/>
-      </w:pPr>
-      <w:r>
-        <w:rPr>
-          <w:rFonts w:ascii="Calibri" w:hAnsi="Calibri"/>
-          <w:b/>
-          <w:i w:val="0"/>
-          <w:color w:val="1F2937"/>
-          <w:sz w:val="25"/>
-        </w:rPr>
-        <w:t>Generative AI Engineer  |  Full Stack Developer</w:t>
-      </w:r>
-    </w:p>
-    <w:p>
-      <w:pPr>
-        <w:spacing w:before="0" w:after="20" w:line="276" w:lineRule="auto"/>
-        <w:jc w:val="center"/>
-      </w:pPr>
-      <w:r>
-        <w:rPr>
-          <w:rFonts w:ascii="Calibri" w:hAnsi="Calibri"/>
-          <w:b w:val="0"/>
-          <w:i w:val="0"/>
-          <w:color w:val="4B5563"/>
-          <w:sz w:val="19"/>
-        </w:rPr>
-        <w:t>Chandigarh, India</w:t>
-      </w:r>
-      <w:r>
-        <w:rPr>
-          <w:rFonts w:ascii="Calibri" w:hAnsi="Calibri"/>
-          <w:b w:val="0"/>
-          <w:i w:val="0"/>
-          <w:color w:val="0EA5E9"/>
-          <w:sz w:val="19"/>
-        </w:rPr>
-        <w:t xml:space="preserve">   •   </w:t>
-      </w:r>
-      <w:r>
-        <w:rPr>
-          <w:rFonts w:ascii="Calibri" w:hAnsi="Calibri"/>
-          <w:b w:val="0"/>
-          <w:i w:val="0"/>
-          <w:color w:val="4B5563"/>
-          <w:sz w:val="19"/>
-        </w:rPr>
-        <w:t>+91 78190 22307</w:t>
-      </w:r>
-      <w:r>
-        <w:rPr>
-          <w:rFonts w:ascii="Calibri" w:hAnsi="Calibri"/>
-          <w:b w:val="0"/>
-          <w:i w:val="0"/>
-          <w:color w:val="0EA5E9"/>
-          <w:sz w:val="19"/>
-        </w:rPr>
-        <w:t xml:space="preserve">   •   </w:t>
-      </w:r>
-      <w:r>
-        <w:rPr>
-          <w:rFonts w:ascii="Calibri" w:hAnsi="Calibri"/>
-          <w:b w:val="0"/>
-          <w:i w:val="0"/>
-          <w:color w:val="4B5563"/>
-          <w:sz w:val="19"/>
-        </w:rPr>
-        <w:t>rahulch19905@gmail.com</w:t>
-      </w:r>
-    </w:p>
-    <w:p>
-      <w:pPr>
-        <w:spacing w:before="0" w:after="0" w:line="276" w:lineRule="auto"/>
-        <w:jc w:val="center"/>
-      </w:pPr>
-      <w:r>
-        <w:rPr>
-          <w:rFonts w:ascii="Calibri" w:hAnsi="Calibri"/>
-          <w:b w:val="0"/>
-          <w:i w:val="0"/>
-          <w:color w:val="4B5563"/>
-          <w:sz w:val="19"/>
-        </w:rPr>
-        <w:t>linkedin.com/in/rahul-chaudhary-9a7b82310</w:t>
-      </w:r>
-      <w:r>
-        <w:rPr>
-          <w:rFonts w:ascii="Calibri" w:hAnsi="Calibri"/>
-          <w:b w:val="0"/>
-          <w:i w:val="0"/>
-          <w:color w:val="0EA5E9"/>
-          <w:sz w:val="19"/>
-        </w:rPr>
-        <w:t xml:space="preserve">   •   </w:t>
-      </w:r>
-      <w:r>
-        <w:rPr>
-          <w:rFonts w:ascii="Calibri" w:hAnsi="Calibri"/>
-          <w:b w:val="0"/>
-          <w:i w:val="0"/>
-          <w:color w:val="4B5563"/>
-          <w:sz w:val="19"/>
-        </w:rPr>
-        <w:t>github.com/RRNauhwar</w:t>
-      </w:r>
-    </w:p>
-    <w:p>
-      <w:pPr>
-        <w:spacing w:before="80" w:after="120" w:line="240" w:lineRule="auto"/>
+        <w:spacing w:before="60" w:after="60" w:line="240" w:lineRule="auto"/>
         <w:pBdr>
-          <w:bottom w:val="single" w:sz="18" w:space="1" w:color="0EA5E9"/>
+          <w:bottom w:val="single" w:sz="20" w:space="1" w:color="0369A1"/>
         </w:pBdr>
       </w:pPr>
     </w:p>
@@ -149,18 +308,18 @@
         </w:tblBorders>
       </w:tblPr>
       <w:tblGrid>
-        <w:gridCol w:w="10512"/>
+        <w:gridCol w:w="10800"/>
       </w:tblGrid>
       <w:tr>
         <w:tc>
           <w:tcPr>
-            <w:tcW w:type="dxa" w:w="10512"/>
+            <w:tcW w:type="dxa" w:w="10800"/>
             <w:shd w:val="clear" w:color="auto" w:fill="0EA5E9"/>
             <w:tcMar>
-              <w:top w:w="30" w:type="dxa"/>
-              <w:bottom w:w="30" w:type="dxa"/>
-              <w:start w:w="110" w:type="dxa"/>
-              <w:end w:w="110" w:type="dxa"/>
+              <w:top w:w="8" w:type="dxa"/>
+              <w:bottom w:w="8" w:type="dxa"/>
+              <w:start w:w="100" w:type="dxa"/>
+              <w:end w:w="100" w:type="dxa"/>
             </w:tcMar>
           </w:tcPr>
           <w:p>
@@ -169,79 +328,11 @@
             </w:pPr>
             <w:r>
               <w:rPr>
-                <w:rFonts w:ascii="Calibri" w:hAnsi="Calibri"/>
+                <w:rFonts w:ascii="Times New Roman" w:hAnsi="Times New Roman"/>
                 <w:b/>
                 <w:i w:val="0"/>
                 <w:color w:val="FFFFFF"/>
-                <w:sz w:val="22"/>
-              </w:rPr>
-              <w:t>PROFESSIONAL SUMMARY</w:t>
-            </w:r>
-          </w:p>
-        </w:tc>
-      </w:tr>
-    </w:tbl>
-    <w:p>
-      <w:pPr>
-        <w:spacing w:before="0" w:after="40" w:line="240" w:lineRule="auto"/>
-      </w:pPr>
-    </w:p>
-    <w:p>
-      <w:pPr>
-        <w:spacing w:before="0" w:after="120" w:line="269" w:lineRule="auto"/>
-        <w:jc w:val="both"/>
-      </w:pPr>
-      <w:r>
-        <w:rPr>
-          <w:rFonts w:ascii="Calibri" w:hAnsi="Calibri"/>
-          <w:b w:val="0"/>
-          <w:i w:val="0"/>
-          <w:color w:val="4B5563"/>
-          <w:sz w:val="21"/>
-        </w:rPr>
-        <w:t>Generative AI Engineer and Full Stack Developer who builds complete AI-powered products, from backend architecture to deployment. Experienced in developing LLM applications, RAG pipelines, and agentic AI workflows using the OpenAI and Gemini APIs, alongside production-ready React and Node.js platforms with secure authentication and scalable REST APIs. Skilled in backend engineering, workflow automation, and applied computer vision on embedded devices, with a focus on designing reliable systems that solve real-world problems.</w:t>
-      </w:r>
-    </w:p>
-    <w:tbl>
-      <w:tblPr>
-        <w:tblW w:type="auto" w:w="0"/>
-        <w:jc w:val="center"/>
-        <w:tblLook w:firstColumn="1" w:firstRow="1" w:lastColumn="0" w:lastRow="0" w:noHBand="0" w:noVBand="1" w:val="04A0"/>
-        <w:tblBorders>
-          <w:top w:val="none" w:sz="0"/>
-          <w:left w:val="none" w:sz="0"/>
-          <w:bottom w:val="none" w:sz="0"/>
-          <w:right w:val="none" w:sz="0"/>
-          <w:insideH w:val="none" w:sz="0"/>
-          <w:insideV w:val="none" w:sz="0"/>
-        </w:tblBorders>
-      </w:tblPr>
-      <w:tblGrid>
-        <w:gridCol w:w="10512"/>
-      </w:tblGrid>
-      <w:tr>
-        <w:tc>
-          <w:tcPr>
-            <w:tcW w:type="dxa" w:w="10512"/>
-            <w:shd w:val="clear" w:color="auto" w:fill="0EA5E9"/>
-            <w:tcMar>
-              <w:top w:w="30" w:type="dxa"/>
-              <w:bottom w:w="30" w:type="dxa"/>
-              <w:start w:w="110" w:type="dxa"/>
-              <w:end w:w="110" w:type="dxa"/>
-            </w:tcMar>
-          </w:tcPr>
-          <w:p>
-            <w:pPr>
-              <w:spacing w:before="0" w:after="0" w:line="240" w:lineRule="auto"/>
-            </w:pPr>
-            <w:r>
-              <w:rPr>
-                <w:rFonts w:ascii="Calibri" w:hAnsi="Calibri"/>
-                <w:b/>
-                <w:i w:val="0"/>
-                <w:color w:val="FFFFFF"/>
-                <w:sz w:val="22"/>
+                <w:sz w:val="20"/>
               </w:rPr>
               <w:t>EDUCATION</w:t>
             </w:r>
@@ -251,7 +342,7 @@
     </w:tbl>
     <w:p>
       <w:pPr>
-        <w:spacing w:before="0" w:after="40" w:line="240" w:lineRule="auto"/>
+        <w:spacing w:before="0" w:after="20" w:lineRule="exact" w:line="60"/>
       </w:pPr>
     </w:p>
     <w:tbl>
@@ -262,19 +353,19 @@
         <w:tblLook w:firstColumn="1" w:firstRow="1" w:lastColumn="0" w:lastRow="0" w:noHBand="0" w:noVBand="1" w:val="04A0"/>
       </w:tblPr>
       <w:tblGrid>
-        <w:gridCol w:w="2628"/>
-        <w:gridCol w:w="2628"/>
-        <w:gridCol w:w="2628"/>
-        <w:gridCol w:w="2628"/>
+        <w:gridCol w:w="2700"/>
+        <w:gridCol w:w="2700"/>
+        <w:gridCol w:w="2700"/>
+        <w:gridCol w:w="2700"/>
       </w:tblGrid>
       <w:tr>
         <w:tc>
           <w:tcPr>
-            <w:tcW w:type="dxa" w:w="4176"/>
+            <w:tcW w:type="dxa" w:w="4392"/>
             <w:shd w:val="clear" w:color="auto" w:fill="0369A1"/>
             <w:tcMar>
-              <w:top w:w="40" w:type="dxa"/>
-              <w:bottom w:w="40" w:type="dxa"/>
+              <w:top w:w="10" w:type="dxa"/>
+              <w:bottom w:w="10" w:type="dxa"/>
               <w:start w:w="90" w:type="dxa"/>
               <w:end w:w="90" w:type="dxa"/>
             </w:tcMar>
@@ -285,11 +376,11 @@
             </w:pPr>
             <w:r>
               <w:rPr>
-                <w:rFonts w:ascii="Calibri" w:hAnsi="Calibri"/>
+                <w:rFonts w:ascii="Times New Roman" w:hAnsi="Times New Roman"/>
                 <w:b/>
                 <w:i w:val="0"/>
                 <w:color w:val="FFFFFF"/>
-                <w:sz w:val="19"/>
+                <w:sz w:val="17"/>
               </w:rPr>
               <w:t>Qualification</w:t>
             </w:r>
@@ -297,11 +388,11 @@
         </w:tc>
         <w:tc>
           <w:tcPr>
-            <w:tcW w:type="dxa" w:w="3888"/>
+            <w:tcW w:type="dxa" w:w="4104"/>
             <w:shd w:val="clear" w:color="auto" w:fill="0369A1"/>
             <w:tcMar>
-              <w:top w:w="40" w:type="dxa"/>
-              <w:bottom w:w="40" w:type="dxa"/>
+              <w:top w:w="10" w:type="dxa"/>
+              <w:bottom w:w="10" w:type="dxa"/>
               <w:start w:w="90" w:type="dxa"/>
               <w:end w:w="90" w:type="dxa"/>
             </w:tcMar>
@@ -312,11 +403,11 @@
             </w:pPr>
             <w:r>
               <w:rPr>
-                <w:rFonts w:ascii="Calibri" w:hAnsi="Calibri"/>
+                <w:rFonts w:ascii="Times New Roman" w:hAnsi="Times New Roman"/>
                 <w:b/>
                 <w:i w:val="0"/>
                 <w:color w:val="FFFFFF"/>
-                <w:sz w:val="19"/>
+                <w:sz w:val="17"/>
               </w:rPr>
               <w:t>Institute</w:t>
             </w:r>
@@ -324,11 +415,11 @@
         </w:tc>
         <w:tc>
           <w:tcPr>
-            <w:tcW w:type="dxa" w:w="1368"/>
+            <w:tcW w:type="dxa" w:w="1224"/>
             <w:shd w:val="clear" w:color="auto" w:fill="0369A1"/>
             <w:tcMar>
-              <w:top w:w="40" w:type="dxa"/>
-              <w:bottom w:w="40" w:type="dxa"/>
+              <w:top w:w="10" w:type="dxa"/>
+              <w:bottom w:w="10" w:type="dxa"/>
               <w:start w:w="90" w:type="dxa"/>
               <w:end w:w="90" w:type="dxa"/>
             </w:tcMar>
@@ -339,11 +430,11 @@
             </w:pPr>
             <w:r>
               <w:rPr>
-                <w:rFonts w:ascii="Calibri" w:hAnsi="Calibri"/>
+                <w:rFonts w:ascii="Times New Roman" w:hAnsi="Times New Roman"/>
                 <w:b/>
                 <w:i w:val="0"/>
                 <w:color w:val="FFFFFF"/>
-                <w:sz w:val="19"/>
+                <w:sz w:val="17"/>
               </w:rPr>
               <w:t>Year</w:t>
             </w:r>
@@ -354,8 +445,8 @@
             <w:tcW w:type="dxa" w:w="1080"/>
             <w:shd w:val="clear" w:color="auto" w:fill="0369A1"/>
             <w:tcMar>
-              <w:top w:w="40" w:type="dxa"/>
-              <w:bottom w:w="40" w:type="dxa"/>
+              <w:top w:w="10" w:type="dxa"/>
+              <w:bottom w:w="10" w:type="dxa"/>
               <w:start w:w="90" w:type="dxa"/>
               <w:end w:w="90" w:type="dxa"/>
             </w:tcMar>
@@ -366,11 +457,11 @@
             </w:pPr>
             <w:r>
               <w:rPr>
-                <w:rFonts w:ascii="Calibri" w:hAnsi="Calibri"/>
+                <w:rFonts w:ascii="Times New Roman" w:hAnsi="Times New Roman"/>
                 <w:b/>
                 <w:i w:val="0"/>
                 <w:color w:val="FFFFFF"/>
-                <w:sz w:val="19"/>
+                <w:sz w:val="17"/>
               </w:rPr>
               <w:t>Score</w:t>
             </w:r>
@@ -380,26 +471,28 @@
       <w:tr>
         <w:tc>
           <w:tcPr>
-            <w:tcW w:type="dxa" w:w="4176"/>
-            <w:shd w:val="clear" w:color="auto" w:fill="FFFFFF"/>
+            <w:tcW w:type="dxa" w:w="4392"/>
             <w:tcMar>
-              <w:top w:w="40" w:type="dxa"/>
-              <w:bottom w:w="40" w:type="dxa"/>
+              <w:top w:w="10" w:type="dxa"/>
+              <w:bottom w:w="10" w:type="dxa"/>
               <w:start w:w="90" w:type="dxa"/>
               <w:end w:w="90" w:type="dxa"/>
             </w:tcMar>
+            <w:tcBorders>
+              <w:bottom w:val="single" w:sz="4" w:space="0" w:color="D0D7DE"/>
+            </w:tcBorders>
           </w:tcPr>
           <w:p>
             <w:pPr>
-              <w:spacing w:before="0" w:after="0" w:line="250" w:lineRule="auto"/>
+              <w:spacing w:before="0" w:after="0" w:line="240" w:lineRule="auto"/>
             </w:pPr>
             <w:r>
               <w:rPr>
-                <w:rFonts w:ascii="Calibri" w:hAnsi="Calibri"/>
+                <w:rFonts w:ascii="Times New Roman" w:hAnsi="Times New Roman"/>
                 <w:b/>
                 <w:i w:val="0"/>
-                <w:color w:val="1F2937"/>
-                <w:sz w:val="19"/>
+                <w:color w:val="1A1A1A"/>
+                <w:sz w:val="17"/>
               </w:rPr>
               <w:t>B.E., Electronics &amp; Communication Engineering</w:t>
             </w:r>
@@ -407,26 +500,28 @@
         </w:tc>
         <w:tc>
           <w:tcPr>
-            <w:tcW w:type="dxa" w:w="3888"/>
-            <w:shd w:val="clear" w:color="auto" w:fill="FFFFFF"/>
+            <w:tcW w:type="dxa" w:w="4104"/>
             <w:tcMar>
-              <w:top w:w="40" w:type="dxa"/>
-              <w:bottom w:w="40" w:type="dxa"/>
+              <w:top w:w="10" w:type="dxa"/>
+              <w:bottom w:w="10" w:type="dxa"/>
               <w:start w:w="90" w:type="dxa"/>
               <w:end w:w="90" w:type="dxa"/>
             </w:tcMar>
+            <w:tcBorders>
+              <w:bottom w:val="single" w:sz="4" w:space="0" w:color="D0D7DE"/>
+            </w:tcBorders>
           </w:tcPr>
           <w:p>
             <w:pPr>
-              <w:spacing w:before="0" w:after="0" w:line="250" w:lineRule="auto"/>
+              <w:spacing w:before="0" w:after="0" w:line="240" w:lineRule="auto"/>
             </w:pPr>
             <w:r>
               <w:rPr>
-                <w:rFonts w:ascii="Calibri" w:hAnsi="Calibri"/>
+                <w:rFonts w:ascii="Times New Roman" w:hAnsi="Times New Roman"/>
                 <w:b w:val="0"/>
                 <w:i w:val="0"/>
-                <w:color w:val="4B5563"/>
-                <w:sz w:val="19"/>
+                <w:color w:val="333333"/>
+                <w:sz w:val="17"/>
               </w:rPr>
               <w:t>Chandigarh College of Engineering &amp; Technology</w:t>
             </w:r>
@@ -434,26 +529,28 @@
         </w:tc>
         <w:tc>
           <w:tcPr>
-            <w:tcW w:type="dxa" w:w="1368"/>
-            <w:shd w:val="clear" w:color="auto" w:fill="FFFFFF"/>
+            <w:tcW w:type="dxa" w:w="1224"/>
             <w:tcMar>
-              <w:top w:w="40" w:type="dxa"/>
-              <w:bottom w:w="40" w:type="dxa"/>
+              <w:top w:w="10" w:type="dxa"/>
+              <w:bottom w:w="10" w:type="dxa"/>
               <w:start w:w="90" w:type="dxa"/>
               <w:end w:w="90" w:type="dxa"/>
             </w:tcMar>
+            <w:tcBorders>
+              <w:bottom w:val="single" w:sz="4" w:space="0" w:color="D0D7DE"/>
+            </w:tcBorders>
           </w:tcPr>
           <w:p>
             <w:pPr>
-              <w:spacing w:before="0" w:after="0" w:line="250" w:lineRule="auto"/>
+              <w:spacing w:before="0" w:after="0" w:line="240" w:lineRule="auto"/>
             </w:pPr>
             <w:r>
               <w:rPr>
-                <w:rFonts w:ascii="Calibri" w:hAnsi="Calibri"/>
+                <w:rFonts w:ascii="Times New Roman" w:hAnsi="Times New Roman"/>
                 <w:b w:val="0"/>
                 <w:i w:val="0"/>
-                <w:color w:val="4B5563"/>
-                <w:sz w:val="19"/>
+                <w:color w:val="333333"/>
+                <w:sz w:val="17"/>
               </w:rPr>
               <w:t>2023 – 2027*</w:t>
             </w:r>
@@ -462,25 +559,27 @@
         <w:tc>
           <w:tcPr>
             <w:tcW w:type="dxa" w:w="1080"/>
-            <w:shd w:val="clear" w:color="auto" w:fill="FFFFFF"/>
             <w:tcMar>
-              <w:top w:w="40" w:type="dxa"/>
-              <w:bottom w:w="40" w:type="dxa"/>
+              <w:top w:w="10" w:type="dxa"/>
+              <w:bottom w:w="10" w:type="dxa"/>
               <w:start w:w="90" w:type="dxa"/>
               <w:end w:w="90" w:type="dxa"/>
             </w:tcMar>
+            <w:tcBorders>
+              <w:bottom w:val="single" w:sz="4" w:space="0" w:color="D0D7DE"/>
+            </w:tcBorders>
           </w:tcPr>
           <w:p>
             <w:pPr>
-              <w:spacing w:before="0" w:after="0" w:line="250" w:lineRule="auto"/>
+              <w:spacing w:before="0" w:after="0" w:line="240" w:lineRule="auto"/>
             </w:pPr>
             <w:r>
               <w:rPr>
-                <w:rFonts w:ascii="Calibri" w:hAnsi="Calibri"/>
+                <w:rFonts w:ascii="Times New Roman" w:hAnsi="Times New Roman"/>
                 <w:b/>
                 <w:i w:val="0"/>
                 <w:color w:val="0369A1"/>
-                <w:sz w:val="19"/>
+                <w:sz w:val="17"/>
               </w:rPr>
               <w:t>7.37</w:t>
             </w:r>
@@ -490,26 +589,28 @@
       <w:tr>
         <w:tc>
           <w:tcPr>
-            <w:tcW w:type="dxa" w:w="4176"/>
-            <w:shd w:val="clear" w:color="auto" w:fill="E0F2FE"/>
+            <w:tcW w:type="dxa" w:w="4392"/>
             <w:tcMar>
-              <w:top w:w="40" w:type="dxa"/>
-              <w:bottom w:w="40" w:type="dxa"/>
+              <w:top w:w="10" w:type="dxa"/>
+              <w:bottom w:w="10" w:type="dxa"/>
               <w:start w:w="90" w:type="dxa"/>
               <w:end w:w="90" w:type="dxa"/>
             </w:tcMar>
+            <w:tcBorders>
+              <w:bottom w:val="single" w:sz="4" w:space="0" w:color="D0D7DE"/>
+            </w:tcBorders>
           </w:tcPr>
           <w:p>
             <w:pPr>
-              <w:spacing w:before="0" w:after="0" w:line="250" w:lineRule="auto"/>
+              <w:spacing w:before="0" w:after="0" w:line="240" w:lineRule="auto"/>
             </w:pPr>
             <w:r>
               <w:rPr>
-                <w:rFonts w:ascii="Calibri" w:hAnsi="Calibri"/>
+                <w:rFonts w:ascii="Times New Roman" w:hAnsi="Times New Roman"/>
                 <w:b/>
                 <w:i w:val="0"/>
-                <w:color w:val="1F2937"/>
-                <w:sz w:val="19"/>
+                <w:color w:val="1A1A1A"/>
+                <w:sz w:val="17"/>
               </w:rPr>
               <w:t>Senior Secondary (Class XII), CBSE</w:t>
             </w:r>
@@ -517,26 +618,28 @@
         </w:tc>
         <w:tc>
           <w:tcPr>
-            <w:tcW w:type="dxa" w:w="3888"/>
-            <w:shd w:val="clear" w:color="auto" w:fill="E0F2FE"/>
+            <w:tcW w:type="dxa" w:w="4104"/>
             <w:tcMar>
-              <w:top w:w="40" w:type="dxa"/>
-              <w:bottom w:w="40" w:type="dxa"/>
+              <w:top w:w="10" w:type="dxa"/>
+              <w:bottom w:w="10" w:type="dxa"/>
               <w:start w:w="90" w:type="dxa"/>
               <w:end w:w="90" w:type="dxa"/>
             </w:tcMar>
+            <w:tcBorders>
+              <w:bottom w:val="single" w:sz="4" w:space="0" w:color="D0D7DE"/>
+            </w:tcBorders>
           </w:tcPr>
           <w:p>
             <w:pPr>
-              <w:spacing w:before="0" w:after="0" w:line="250" w:lineRule="auto"/>
+              <w:spacing w:before="0" w:after="0" w:line="240" w:lineRule="auto"/>
             </w:pPr>
             <w:r>
               <w:rPr>
-                <w:rFonts w:ascii="Calibri" w:hAnsi="Calibri"/>
+                <w:rFonts w:ascii="Times New Roman" w:hAnsi="Times New Roman"/>
                 <w:b w:val="0"/>
                 <w:i w:val="0"/>
-                <w:color w:val="4B5563"/>
-                <w:sz w:val="19"/>
+                <w:color w:val="333333"/>
+                <w:sz w:val="17"/>
               </w:rPr>
               <w:t>Kanha Makhan Public School</w:t>
             </w:r>
@@ -544,26 +647,28 @@
         </w:tc>
         <w:tc>
           <w:tcPr>
-            <w:tcW w:type="dxa" w:w="1368"/>
-            <w:shd w:val="clear" w:color="auto" w:fill="E0F2FE"/>
+            <w:tcW w:type="dxa" w:w="1224"/>
             <w:tcMar>
-              <w:top w:w="40" w:type="dxa"/>
-              <w:bottom w:w="40" w:type="dxa"/>
+              <w:top w:w="10" w:type="dxa"/>
+              <w:bottom w:w="10" w:type="dxa"/>
               <w:start w:w="90" w:type="dxa"/>
               <w:end w:w="90" w:type="dxa"/>
             </w:tcMar>
+            <w:tcBorders>
+              <w:bottom w:val="single" w:sz="4" w:space="0" w:color="D0D7DE"/>
+            </w:tcBorders>
           </w:tcPr>
           <w:p>
             <w:pPr>
-              <w:spacing w:before="0" w:after="0" w:line="250" w:lineRule="auto"/>
+              <w:spacing w:before="0" w:after="0" w:line="240" w:lineRule="auto"/>
             </w:pPr>
             <w:r>
               <w:rPr>
-                <w:rFonts w:ascii="Calibri" w:hAnsi="Calibri"/>
+                <w:rFonts w:ascii="Times New Roman" w:hAnsi="Times New Roman"/>
                 <w:b w:val="0"/>
                 <w:i w:val="0"/>
-                <w:color w:val="4B5563"/>
-                <w:sz w:val="19"/>
+                <w:color w:val="333333"/>
+                <w:sz w:val="17"/>
               </w:rPr>
               <w:t>2021</w:t>
             </w:r>
@@ -572,25 +677,27 @@
         <w:tc>
           <w:tcPr>
             <w:tcW w:type="dxa" w:w="1080"/>
-            <w:shd w:val="clear" w:color="auto" w:fill="E0F2FE"/>
             <w:tcMar>
-              <w:top w:w="40" w:type="dxa"/>
-              <w:bottom w:w="40" w:type="dxa"/>
+              <w:top w:w="10" w:type="dxa"/>
+              <w:bottom w:w="10" w:type="dxa"/>
               <w:start w:w="90" w:type="dxa"/>
               <w:end w:w="90" w:type="dxa"/>
             </w:tcMar>
+            <w:tcBorders>
+              <w:bottom w:val="single" w:sz="4" w:space="0" w:color="D0D7DE"/>
+            </w:tcBorders>
           </w:tcPr>
           <w:p>
             <w:pPr>
-              <w:spacing w:before="0" w:after="0" w:line="250" w:lineRule="auto"/>
+              <w:spacing w:before="0" w:after="0" w:line="240" w:lineRule="auto"/>
             </w:pPr>
             <w:r>
               <w:rPr>
-                <w:rFonts w:ascii="Calibri" w:hAnsi="Calibri"/>
+                <w:rFonts w:ascii="Times New Roman" w:hAnsi="Times New Roman"/>
                 <w:b/>
                 <w:i w:val="0"/>
                 <w:color w:val="0369A1"/>
-                <w:sz w:val="19"/>
+                <w:sz w:val="17"/>
               </w:rPr>
               <w:t>82%</w:t>
             </w:r>
@@ -600,26 +707,28 @@
       <w:tr>
         <w:tc>
           <w:tcPr>
-            <w:tcW w:type="dxa" w:w="4176"/>
-            <w:shd w:val="clear" w:color="auto" w:fill="FFFFFF"/>
+            <w:tcW w:type="dxa" w:w="4392"/>
             <w:tcMar>
-              <w:top w:w="40" w:type="dxa"/>
-              <w:bottom w:w="40" w:type="dxa"/>
+              <w:top w:w="10" w:type="dxa"/>
+              <w:bottom w:w="10" w:type="dxa"/>
               <w:start w:w="90" w:type="dxa"/>
               <w:end w:w="90" w:type="dxa"/>
             </w:tcMar>
+            <w:tcBorders>
+              <w:bottom w:val="single" w:sz="4" w:space="0" w:color="D0D7DE"/>
+            </w:tcBorders>
           </w:tcPr>
           <w:p>
             <w:pPr>
-              <w:spacing w:before="0" w:after="0" w:line="250" w:lineRule="auto"/>
+              <w:spacing w:before="0" w:after="0" w:line="240" w:lineRule="auto"/>
             </w:pPr>
             <w:r>
               <w:rPr>
-                <w:rFonts w:ascii="Calibri" w:hAnsi="Calibri"/>
+                <w:rFonts w:ascii="Times New Roman" w:hAnsi="Times New Roman"/>
                 <w:b/>
                 <w:i w:val="0"/>
-                <w:color w:val="1F2937"/>
-                <w:sz w:val="19"/>
+                <w:color w:val="1A1A1A"/>
+                <w:sz w:val="17"/>
               </w:rPr>
               <w:t>Secondary (Class X), CBSE</w:t>
             </w:r>
@@ -627,26 +736,28 @@
         </w:tc>
         <w:tc>
           <w:tcPr>
-            <w:tcW w:type="dxa" w:w="3888"/>
-            <w:shd w:val="clear" w:color="auto" w:fill="FFFFFF"/>
+            <w:tcW w:type="dxa" w:w="4104"/>
             <w:tcMar>
-              <w:top w:w="40" w:type="dxa"/>
-              <w:bottom w:w="40" w:type="dxa"/>
+              <w:top w:w="10" w:type="dxa"/>
+              <w:bottom w:w="10" w:type="dxa"/>
               <w:start w:w="90" w:type="dxa"/>
               <w:end w:w="90" w:type="dxa"/>
             </w:tcMar>
+            <w:tcBorders>
+              <w:bottom w:val="single" w:sz="4" w:space="0" w:color="D0D7DE"/>
+            </w:tcBorders>
           </w:tcPr>
           <w:p>
             <w:pPr>
-              <w:spacing w:before="0" w:after="0" w:line="250" w:lineRule="auto"/>
+              <w:spacing w:before="0" w:after="0" w:line="240" w:lineRule="auto"/>
             </w:pPr>
             <w:r>
               <w:rPr>
-                <w:rFonts w:ascii="Calibri" w:hAnsi="Calibri"/>
+                <w:rFonts w:ascii="Times New Roman" w:hAnsi="Times New Roman"/>
                 <w:b w:val="0"/>
                 <w:i w:val="0"/>
-                <w:color w:val="4B5563"/>
-                <w:sz w:val="19"/>
+                <w:color w:val="333333"/>
+                <w:sz w:val="17"/>
               </w:rPr>
               <w:t>SRBS International School</w:t>
             </w:r>
@@ -654,26 +765,28 @@
         </w:tc>
         <w:tc>
           <w:tcPr>
-            <w:tcW w:type="dxa" w:w="1368"/>
-            <w:shd w:val="clear" w:color="auto" w:fill="FFFFFF"/>
+            <w:tcW w:type="dxa" w:w="1224"/>
             <w:tcMar>
-              <w:top w:w="40" w:type="dxa"/>
-              <w:bottom w:w="40" w:type="dxa"/>
+              <w:top w:w="10" w:type="dxa"/>
+              <w:bottom w:w="10" w:type="dxa"/>
               <w:start w:w="90" w:type="dxa"/>
               <w:end w:w="90" w:type="dxa"/>
             </w:tcMar>
+            <w:tcBorders>
+              <w:bottom w:val="single" w:sz="4" w:space="0" w:color="D0D7DE"/>
+            </w:tcBorders>
           </w:tcPr>
           <w:p>
             <w:pPr>
-              <w:spacing w:before="0" w:after="0" w:line="250" w:lineRule="auto"/>
+              <w:spacing w:before="0" w:after="0" w:line="240" w:lineRule="auto"/>
             </w:pPr>
             <w:r>
               <w:rPr>
-                <w:rFonts w:ascii="Calibri" w:hAnsi="Calibri"/>
+                <w:rFonts w:ascii="Times New Roman" w:hAnsi="Times New Roman"/>
                 <w:b w:val="0"/>
                 <w:i w:val="0"/>
-                <w:color w:val="4B5563"/>
-                <w:sz w:val="19"/>
+                <w:color w:val="333333"/>
+                <w:sz w:val="17"/>
               </w:rPr>
               <w:t>2019</w:t>
             </w:r>
@@ -682,25 +795,27 @@
         <w:tc>
           <w:tcPr>
             <w:tcW w:type="dxa" w:w="1080"/>
-            <w:shd w:val="clear" w:color="auto" w:fill="FFFFFF"/>
             <w:tcMar>
-              <w:top w:w="40" w:type="dxa"/>
-              <w:bottom w:w="40" w:type="dxa"/>
+              <w:top w:w="10" w:type="dxa"/>
+              <w:bottom w:w="10" w:type="dxa"/>
               <w:start w:w="90" w:type="dxa"/>
               <w:end w:w="90" w:type="dxa"/>
             </w:tcMar>
+            <w:tcBorders>
+              <w:bottom w:val="single" w:sz="4" w:space="0" w:color="D0D7DE"/>
+            </w:tcBorders>
           </w:tcPr>
           <w:p>
             <w:pPr>
-              <w:spacing w:before="0" w:after="0" w:line="250" w:lineRule="auto"/>
+              <w:spacing w:before="0" w:after="0" w:line="240" w:lineRule="auto"/>
             </w:pPr>
             <w:r>
               <w:rPr>
-                <w:rFonts w:ascii="Calibri" w:hAnsi="Calibri"/>
+                <w:rFonts w:ascii="Times New Roman" w:hAnsi="Times New Roman"/>
                 <w:b/>
                 <w:i w:val="0"/>
                 <w:color w:val="0369A1"/>
-                <w:sz w:val="19"/>
+                <w:sz w:val="17"/>
               </w:rPr>
               <w:t>91.8%</w:t>
             </w:r>
@@ -710,15 +825,15 @@
     </w:tbl>
     <w:p>
       <w:pPr>
-        <w:spacing w:before="40" w:after="80" w:line="240" w:lineRule="auto"/>
+        <w:spacing w:before="20" w:after="20" w:lineRule="exact" w:line="160"/>
       </w:pPr>
       <w:r>
         <w:rPr>
-          <w:rFonts w:ascii="Calibri" w:hAnsi="Calibri"/>
+          <w:rFonts w:ascii="Times New Roman" w:hAnsi="Times New Roman"/>
           <w:b w:val="0"/>
           <w:i/>
-          <w:color w:val="4B5563"/>
-          <w:sz w:val="16"/>
+          <w:color w:val="333333"/>
+          <w:sz w:val="15"/>
         </w:rPr>
         <w:t>*Expected graduation</w:t>
       </w:r>
@@ -738,18 +853,18 @@
         </w:tblBorders>
       </w:tblPr>
       <w:tblGrid>
-        <w:gridCol w:w="10512"/>
+        <w:gridCol w:w="10800"/>
       </w:tblGrid>
       <w:tr>
         <w:tc>
           <w:tcPr>
-            <w:tcW w:type="dxa" w:w="10512"/>
+            <w:tcW w:type="dxa" w:w="10800"/>
             <w:shd w:val="clear" w:color="auto" w:fill="0EA5E9"/>
             <w:tcMar>
-              <w:top w:w="30" w:type="dxa"/>
-              <w:bottom w:w="30" w:type="dxa"/>
-              <w:start w:w="110" w:type="dxa"/>
-              <w:end w:w="110" w:type="dxa"/>
+              <w:top w:w="8" w:type="dxa"/>
+              <w:bottom w:w="8" w:type="dxa"/>
+              <w:start w:w="100" w:type="dxa"/>
+              <w:end w:w="100" w:type="dxa"/>
             </w:tcMar>
           </w:tcPr>
           <w:p>
@@ -758,13 +873,13 @@
             </w:pPr>
             <w:r>
               <w:rPr>
-                <w:rFonts w:ascii="Calibri" w:hAnsi="Calibri"/>
+                <w:rFonts w:ascii="Times New Roman" w:hAnsi="Times New Roman"/>
                 <w:b/>
                 <w:i w:val="0"/>
                 <w:color w:val="FFFFFF"/>
-                <w:sz w:val="22"/>
+                <w:sz w:val="20"/>
               </w:rPr>
-              <w:t>TECHNICAL SKILLS</w:t>
+              <w:t>PROFESSIONAL SUMMARY</w:t>
             </w:r>
           </w:p>
         </w:tc>
@@ -772,163 +887,23 @@
     </w:tbl>
     <w:p>
       <w:pPr>
-        <w:spacing w:before="0" w:after="40" w:line="240" w:lineRule="auto"/>
+        <w:spacing w:before="0" w:after="20" w:lineRule="exact" w:line="60"/>
       </w:pPr>
     </w:p>
     <w:p>
       <w:pPr>
-        <w:spacing w:before="0" w:after="60" w:line="264" w:lineRule="auto"/>
-        <w:ind w:left="144"/>
+        <w:spacing w:before="0" w:after="40" w:lineRule="exact" w:line="206"/>
+        <w:jc w:val="both"/>
       </w:pPr>
       <w:r>
         <w:rPr>
-          <w:rFonts w:ascii="Calibri" w:hAnsi="Calibri"/>
-          <w:b/>
-          <w:i w:val="0"/>
-          <w:color w:val="0369A1"/>
-          <w:sz w:val="20"/>
-        </w:rPr>
-        <w:t xml:space="preserve">Programming Languages:  </w:t>
-      </w:r>
-      <w:r>
-        <w:rPr>
-          <w:rFonts w:ascii="Calibri" w:hAnsi="Calibri"/>
+          <w:rFonts w:ascii="Times New Roman" w:hAnsi="Times New Roman"/>
           <w:b w:val="0"/>
           <w:i w:val="0"/>
-          <w:color w:val="4B5563"/>
-          <w:sz w:val="20"/>
+          <w:color w:val="333333"/>
+          <w:sz w:val="18"/>
         </w:rPr>
-        <w:t>Python, JavaScript, Java, C++</w:t>
-      </w:r>
-    </w:p>
-    <w:p>
-      <w:pPr>
-        <w:spacing w:before="0" w:after="60" w:line="264" w:lineRule="auto"/>
-        <w:ind w:left="144"/>
-      </w:pPr>
-      <w:r>
-        <w:rPr>
-          <w:rFonts w:ascii="Calibri" w:hAnsi="Calibri"/>
-          <w:b/>
-          <w:i w:val="0"/>
-          <w:color w:val="0369A1"/>
-          <w:sz w:val="20"/>
-        </w:rPr>
-        <w:t xml:space="preserve">Web Development:  </w:t>
-      </w:r>
-      <w:r>
-        <w:rPr>
-          <w:rFonts w:ascii="Calibri" w:hAnsi="Calibri"/>
-          <w:b w:val="0"/>
-          <w:i w:val="0"/>
-          <w:color w:val="4B5563"/>
-          <w:sz w:val="20"/>
-        </w:rPr>
-        <w:t>React, Node.js, Express.js, REST APIs, HTML, CSS</w:t>
-      </w:r>
-    </w:p>
-    <w:p>
-      <w:pPr>
-        <w:spacing w:before="0" w:after="60" w:line="264" w:lineRule="auto"/>
-        <w:ind w:left="144"/>
-      </w:pPr>
-      <w:r>
-        <w:rPr>
-          <w:rFonts w:ascii="Calibri" w:hAnsi="Calibri"/>
-          <w:b/>
-          <w:i w:val="0"/>
-          <w:color w:val="0369A1"/>
-          <w:sz w:val="20"/>
-        </w:rPr>
-        <w:t xml:space="preserve">Databases:  </w:t>
-      </w:r>
-      <w:r>
-        <w:rPr>
-          <w:rFonts w:ascii="Calibri" w:hAnsi="Calibri"/>
-          <w:b w:val="0"/>
-          <w:i w:val="0"/>
-          <w:color w:val="4B5563"/>
-          <w:sz w:val="20"/>
-        </w:rPr>
-        <w:t>MongoDB, PostgreSQL, Supabase</w:t>
-      </w:r>
-    </w:p>
-    <w:p>
-      <w:pPr>
-        <w:spacing w:before="0" w:after="60" w:line="264" w:lineRule="auto"/>
-        <w:ind w:left="144"/>
-      </w:pPr>
-      <w:r>
-        <w:rPr>
-          <w:rFonts w:ascii="Calibri" w:hAnsi="Calibri"/>
-          <w:b/>
-          <w:i w:val="0"/>
-          <w:color w:val="0369A1"/>
-          <w:sz w:val="20"/>
-        </w:rPr>
-        <w:t xml:space="preserve">Generative AI:  </w:t>
-      </w:r>
-      <w:r>
-        <w:rPr>
-          <w:rFonts w:ascii="Calibri" w:hAnsi="Calibri"/>
-          <w:b w:val="0"/>
-          <w:i w:val="0"/>
-          <w:color w:val="4B5563"/>
-          <w:sz w:val="20"/>
-        </w:rPr>
-        <w:t>OpenAI API, Gemini API, Prompt Engineering, RAG, Agentic AI, Workflow Automation</w:t>
-      </w:r>
-    </w:p>
-    <w:p>
-      <w:pPr>
-        <w:spacing w:before="0" w:after="60" w:line="264" w:lineRule="auto"/>
-        <w:ind w:left="144"/>
-      </w:pPr>
-      <w:r>
-        <w:rPr>
-          <w:rFonts w:ascii="Calibri" w:hAnsi="Calibri"/>
-          <w:b/>
-          <w:i w:val="0"/>
-          <w:color w:val="0369A1"/>
-          <w:sz w:val="20"/>
-        </w:rPr>
-        <w:t xml:space="preserve">Tools &amp; Platforms:  </w:t>
-      </w:r>
-      <w:r>
-        <w:rPr>
-          <w:rFonts w:ascii="Calibri" w:hAnsi="Calibri"/>
-          <w:b w:val="0"/>
-          <w:i w:val="0"/>
-          <w:color w:val="4B5563"/>
-          <w:sz w:val="20"/>
-        </w:rPr>
-        <w:t>Git, GitHub, Docker, Postman, n8n</w:t>
-      </w:r>
-    </w:p>
-    <w:p>
-      <w:pPr>
-        <w:spacing w:before="0" w:after="60" w:line="264" w:lineRule="auto"/>
-        <w:ind w:left="144"/>
-      </w:pPr>
-      <w:r>
-        <w:rPr>
-          <w:rFonts w:ascii="Calibri" w:hAnsi="Calibri"/>
-          <w:b/>
-          <w:i w:val="0"/>
-          <w:color w:val="0369A1"/>
-          <w:sz w:val="20"/>
-        </w:rPr>
-        <w:t xml:space="preserve">Embedded &amp; Vision:  </w:t>
-      </w:r>
-      <w:r>
-        <w:rPr>
-          <w:rFonts w:ascii="Calibri" w:hAnsi="Calibri"/>
-          <w:b w:val="0"/>
-          <w:i w:val="0"/>
-          <w:color w:val="4B5563"/>
-          <w:sz w:val="20"/>
-        </w:rPr>
-        <w:t>Raspberry Pi, Computer Vision, YOLO, Object Detection</w:t>
+        <w:t>Generative AI Engineer and Full Stack Developer who builds complete AI-powered products end to end. Skilled in LLM applications, RAG pipelines, and agentic AI workflows with the OpenAI and Gemini APIs, plus production-ready React and Node.js platforms with secure authentication and scalable REST APIs. Focused on backend engineering, AI automation, and reliable systems that solve real-world problems.</w:t>
       </w:r>
     </w:p>
     <w:tbl>
@@ -946,18 +921,18 @@
         </w:tblBorders>
       </w:tblPr>
       <w:tblGrid>
-        <w:gridCol w:w="10512"/>
+        <w:gridCol w:w="10800"/>
       </w:tblGrid>
       <w:tr>
         <w:tc>
           <w:tcPr>
-            <w:tcW w:type="dxa" w:w="10512"/>
+            <w:tcW w:type="dxa" w:w="10800"/>
             <w:shd w:val="clear" w:color="auto" w:fill="0EA5E9"/>
             <w:tcMar>
-              <w:top w:w="30" w:type="dxa"/>
-              <w:bottom w:w="30" w:type="dxa"/>
-              <w:start w:w="110" w:type="dxa"/>
-              <w:end w:w="110" w:type="dxa"/>
+              <w:top w:w="8" w:type="dxa"/>
+              <w:bottom w:w="8" w:type="dxa"/>
+              <w:start w:w="100" w:type="dxa"/>
+              <w:end w:w="100" w:type="dxa"/>
             </w:tcMar>
           </w:tcPr>
           <w:p>
@@ -966,13 +941,13 @@
             </w:pPr>
             <w:r>
               <w:rPr>
-                <w:rFonts w:ascii="Calibri" w:hAnsi="Calibri"/>
+                <w:rFonts w:ascii="Times New Roman" w:hAnsi="Times New Roman"/>
                 <w:b/>
                 <w:i w:val="0"/>
                 <w:color w:val="FFFFFF"/>
-                <w:sz w:val="22"/>
+                <w:sz w:val="20"/>
               </w:rPr>
-              <w:t>EXPERIENCE</w:t>
+              <w:t>TECHNICAL SKILLS</w:t>
             </w:r>
           </w:p>
         </w:tc>
@@ -980,159 +955,111 @@
     </w:tbl>
     <w:p>
       <w:pPr>
-        <w:spacing w:before="0" w:after="40" w:line="240" w:lineRule="auto"/>
+        <w:spacing w:before="0" w:after="20" w:lineRule="exact" w:line="60"/>
       </w:pPr>
     </w:p>
     <w:p>
       <w:pPr>
-        <w:tabs>
-          <w:tab w:pos="10368" w:val="decimal"/>
-        </w:tabs>
-        <w:spacing w:before="0" w:after="20" w:line="252" w:lineRule="auto"/>
+        <w:spacing w:before="0" w:after="20" w:lineRule="exact" w:line="206"/>
+        <w:ind w:left="72"/>
       </w:pPr>
       <w:r>
         <w:rPr>
-          <w:rFonts w:ascii="Calibri" w:hAnsi="Calibri"/>
+          <w:rFonts w:ascii="Times New Roman" w:hAnsi="Times New Roman"/>
           <w:b/>
           <w:i w:val="0"/>
-          <w:color w:val="1F2937"/>
-          <w:sz w:val="22"/>
+          <w:color w:val="0369A1"/>
+          <w:sz w:val="18"/>
         </w:rPr>
-        <w:t>AI Automation Intern</w:t>
+        <w:t xml:space="preserve">Languages:  </w:t>
       </w:r>
       <w:r>
         <w:rPr>
-          <w:rFonts w:ascii="Calibri" w:hAnsi="Calibri"/>
-          <w:b/>
-          <w:i w:val="0"/>
-          <w:color w:val="0369A1"/>
-          <w:sz w:val="21"/>
-        </w:rPr>
-        <w:t xml:space="preserve">  |  D2 Automation</w:t>
-      </w:r>
-      <w:r>
-        <w:rPr>
-          <w:rFonts w:ascii="Calibri" w:hAnsi="Calibri"/>
+          <w:rFonts w:ascii="Times New Roman" w:hAnsi="Times New Roman"/>
           <w:b w:val="0"/>
           <w:i w:val="0"/>
-          <w:color w:val="1F2937"/>
-          <w:sz w:val="21"/>
+          <w:color w:val="333333"/>
+          <w:sz w:val="18"/>
         </w:rPr>
-        <w:tab/>
-      </w:r>
-      <w:r>
-        <w:rPr>
-          <w:rFonts w:ascii="Calibri" w:hAnsi="Calibri"/>
-          <w:b w:val="0"/>
-          <w:i/>
-          <w:color w:val="4B5563"/>
-          <w:sz w:val="19"/>
-        </w:rPr>
-        <w:t>June 2025 – July 2025</w:t>
+        <w:t>Python, JavaScript, Java, C++</w:t>
       </w:r>
     </w:p>
     <w:p>
       <w:pPr>
-        <w:spacing w:before="0" w:after="50" w:line="254" w:lineRule="auto"/>
-        <w:ind w:left="403" w:hanging="230"/>
+        <w:spacing w:before="0" w:after="20" w:lineRule="exact" w:line="206"/>
+        <w:ind w:left="72"/>
       </w:pPr>
       <w:r>
         <w:rPr>
-          <w:rFonts w:ascii="Calibri" w:hAnsi="Calibri"/>
+          <w:rFonts w:ascii="Times New Roman" w:hAnsi="Times New Roman"/>
           <w:b/>
           <w:i w:val="0"/>
-          <w:color w:val="0EA5E9"/>
-          <w:sz w:val="21"/>
+          <w:color w:val="0369A1"/>
+          <w:sz w:val="18"/>
         </w:rPr>
-        <w:t xml:space="preserve">•  </w:t>
+        <w:t xml:space="preserve">Web &amp; Databases:  </w:t>
       </w:r>
       <w:r>
         <w:rPr>
-          <w:rFonts w:ascii="Calibri" w:hAnsi="Calibri"/>
+          <w:rFonts w:ascii="Times New Roman" w:hAnsi="Times New Roman"/>
           <w:b w:val="0"/>
           <w:i w:val="0"/>
-          <w:color w:val="4B5563"/>
-          <w:sz w:val="21"/>
+          <w:color w:val="333333"/>
+          <w:sz w:val="18"/>
         </w:rPr>
-        <w:t>Designed and deployed AI automation workflows in n8n to orchestrate multi-step business processes and eliminate repetitive manual tasks.</w:t>
+        <w:t>React, Node.js, Express.js, REST APIs, MongoDB, PostgreSQL, Supabase</w:t>
       </w:r>
     </w:p>
     <w:p>
       <w:pPr>
-        <w:spacing w:before="0" w:after="50" w:line="254" w:lineRule="auto"/>
-        <w:ind w:left="403" w:hanging="230"/>
+        <w:spacing w:before="0" w:after="20" w:lineRule="exact" w:line="206"/>
+        <w:ind w:left="72"/>
       </w:pPr>
       <w:r>
         <w:rPr>
-          <w:rFonts w:ascii="Calibri" w:hAnsi="Calibri"/>
+          <w:rFonts w:ascii="Times New Roman" w:hAnsi="Times New Roman"/>
           <w:b/>
           <w:i w:val="0"/>
-          <w:color w:val="0EA5E9"/>
-          <w:sz w:val="21"/>
+          <w:color w:val="0369A1"/>
+          <w:sz w:val="18"/>
         </w:rPr>
-        <w:t xml:space="preserve">•  </w:t>
+        <w:t xml:space="preserve">Generative AI:  </w:t>
       </w:r>
       <w:r>
         <w:rPr>
-          <w:rFonts w:ascii="Calibri" w:hAnsi="Calibri"/>
+          <w:rFonts w:ascii="Times New Roman" w:hAnsi="Times New Roman"/>
           <w:b w:val="0"/>
           <w:i w:val="0"/>
-          <w:color w:val="4B5563"/>
-          <w:sz w:val="21"/>
+          <w:color w:val="333333"/>
+          <w:sz w:val="18"/>
         </w:rPr>
-        <w:t>Built a Telegram chatbot integrated with the OpenAI and Gemini APIs to handle user queries and deliver automated conversational responses.</w:t>
+        <w:t>OpenAI API, Gemini API, Prompt Engineering, RAG, Agentic AI, Workflow Automation</w:t>
       </w:r>
     </w:p>
     <w:p>
       <w:pPr>
-        <w:spacing w:before="0" w:after="50" w:line="254" w:lineRule="auto"/>
-        <w:ind w:left="403" w:hanging="230"/>
+        <w:spacing w:before="0" w:after="20" w:lineRule="exact" w:line="206"/>
+        <w:ind w:left="72"/>
       </w:pPr>
       <w:r>
         <w:rPr>
-          <w:rFonts w:ascii="Calibri" w:hAnsi="Calibri"/>
+          <w:rFonts w:ascii="Times New Roman" w:hAnsi="Times New Roman"/>
           <w:b/>
           <w:i w:val="0"/>
-          <w:color w:val="0EA5E9"/>
-          <w:sz w:val="21"/>
+          <w:color w:val="0369A1"/>
+          <w:sz w:val="18"/>
         </w:rPr>
-        <w:t xml:space="preserve">•  </w:t>
+        <w:t xml:space="preserve">Tools &amp; Embedded:  </w:t>
       </w:r>
       <w:r>
         <w:rPr>
-          <w:rFonts w:ascii="Calibri" w:hAnsi="Calibri"/>
+          <w:rFonts w:ascii="Times New Roman" w:hAnsi="Times New Roman"/>
           <w:b w:val="0"/>
           <w:i w:val="0"/>
-          <w:color w:val="4B5563"/>
-          <w:sz w:val="21"/>
+          <w:color w:val="333333"/>
+          <w:sz w:val="18"/>
         </w:rPr>
-        <w:t>Developed Python scripts and API integrations connecting third-party services and messaging platforms for event-driven task execution.</w:t>
-      </w:r>
-    </w:p>
-    <w:p>
-      <w:pPr>
-        <w:spacing w:before="0" w:after="50" w:line="254" w:lineRule="auto"/>
-        <w:ind w:left="403" w:hanging="230"/>
-      </w:pPr>
-      <w:r>
-        <w:rPr>
-          <w:rFonts w:ascii="Calibri" w:hAnsi="Calibri"/>
-          <w:b/>
-          <w:i w:val="0"/>
-          <w:color w:val="0EA5E9"/>
-          <w:sz w:val="21"/>
-        </w:rPr>
-        <w:t xml:space="preserve">•  </w:t>
-      </w:r>
-      <w:r>
-        <w:rPr>
-          <w:rFonts w:ascii="Calibri" w:hAnsi="Calibri"/>
-          <w:b w:val="0"/>
-          <w:i w:val="0"/>
-          <w:color w:val="4B5563"/>
-          <w:sz w:val="21"/>
-        </w:rPr>
-        <w:t>Engineered reusable automation pipelines, improving reliability and reducing turnaround time across internal operations.</w:t>
+        <w:t>Git, GitHub, Docker, Postman, n8n, Raspberry Pi, Computer Vision, YOLO</w:t>
       </w:r>
     </w:p>
     <w:tbl>
@@ -1150,18 +1077,18 @@
         </w:tblBorders>
       </w:tblPr>
       <w:tblGrid>
-        <w:gridCol w:w="10512"/>
+        <w:gridCol w:w="10800"/>
       </w:tblGrid>
       <w:tr>
         <w:tc>
           <w:tcPr>
-            <w:tcW w:type="dxa" w:w="10512"/>
+            <w:tcW w:type="dxa" w:w="10800"/>
             <w:shd w:val="clear" w:color="auto" w:fill="0EA5E9"/>
             <w:tcMar>
-              <w:top w:w="30" w:type="dxa"/>
-              <w:bottom w:w="30" w:type="dxa"/>
-              <w:start w:w="110" w:type="dxa"/>
-              <w:end w:w="110" w:type="dxa"/>
+              <w:top w:w="8" w:type="dxa"/>
+              <w:bottom w:w="8" w:type="dxa"/>
+              <w:start w:w="100" w:type="dxa"/>
+              <w:end w:w="100" w:type="dxa"/>
             </w:tcMar>
           </w:tcPr>
           <w:p>
@@ -1170,13 +1097,13 @@
             </w:pPr>
             <w:r>
               <w:rPr>
-                <w:rFonts w:ascii="Calibri" w:hAnsi="Calibri"/>
+                <w:rFonts w:ascii="Times New Roman" w:hAnsi="Times New Roman"/>
                 <w:b/>
                 <w:i w:val="0"/>
                 <w:color w:val="FFFFFF"/>
-                <w:sz w:val="22"/>
+                <w:sz w:val="20"/>
               </w:rPr>
-              <w:t>PROJECTS</w:t>
+              <w:t>EXPERIENCE</w:t>
             </w:r>
           </w:p>
         </w:tc>
@@ -1184,627 +1111,107 @@
     </w:tbl>
     <w:p>
       <w:pPr>
-        <w:spacing w:before="0" w:after="40" w:line="240" w:lineRule="auto"/>
+        <w:spacing w:before="0" w:after="20" w:lineRule="exact" w:line="60"/>
       </w:pPr>
     </w:p>
     <w:p>
       <w:pPr>
-        <w:spacing w:before="60" w:after="20" w:line="252" w:lineRule="auto"/>
+        <w:tabs>
+          <w:tab w:pos="10800" w:val="right"/>
+        </w:tabs>
+        <w:spacing w:before="0" w:after="20" w:lineRule="exact" w:line="240"/>
       </w:pPr>
       <w:r>
         <w:rPr>
-          <w:rFonts w:ascii="Calibri" w:hAnsi="Calibri"/>
+          <w:rFonts w:ascii="Times New Roman" w:hAnsi="Times New Roman"/>
           <w:b/>
           <w:i w:val="0"/>
-          <w:color w:val="1F2937"/>
-          <w:sz w:val="21"/>
+          <w:color w:val="1A1A1A"/>
+          <w:sz w:val="19"/>
         </w:rPr>
-        <w:t>NyayaSim</w:t>
+        <w:t>AI Automation Intern</w:t>
       </w:r>
       <w:r>
         <w:rPr>
-          <w:rFonts w:ascii="Calibri" w:hAnsi="Calibri"/>
+          <w:rFonts w:ascii="Times New Roman" w:hAnsi="Times New Roman"/>
+          <w:b/>
+          <w:i w:val="0"/>
+          <w:color w:val="0369A1"/>
+          <w:sz w:val="19"/>
+        </w:rPr>
+        <w:t xml:space="preserve">  |  D2 Automation</w:t>
+      </w:r>
+      <w:r>
+        <w:rPr>
+          <w:rFonts w:ascii="Times New Roman" w:hAnsi="Times New Roman"/>
           <w:b w:val="0"/>
           <w:i w:val="0"/>
-          <w:color w:val="0369A1"/>
-          <w:sz w:val="20"/>
+          <w:color w:val="1A1A1A"/>
+          <w:sz w:val="18"/>
         </w:rPr>
-        <w:t xml:space="preserve">  –  AI-Powered Virtual Courtroom</w:t>
+        <w:tab/>
+      </w:r>
+      <w:r>
+        <w:rPr>
+          <w:rFonts w:ascii="Times New Roman" w:hAnsi="Times New Roman"/>
+          <w:b w:val="0"/>
+          <w:i/>
+          <w:color w:val="333333"/>
+          <w:sz w:val="17"/>
+        </w:rPr>
+        <w:t>June 2025 – July 2025</w:t>
       </w:r>
     </w:p>
     <w:p>
       <w:pPr>
-        <w:spacing w:before="0" w:after="40" w:line="252" w:lineRule="auto"/>
-        <w:ind w:left="144"/>
+        <w:spacing w:before="0" w:after="20" w:lineRule="exact" w:line="206"/>
+        <w:ind w:left="317" w:hanging="202"/>
       </w:pPr>
       <w:r>
         <w:rPr>
-          <w:rFonts w:ascii="Calibri" w:hAnsi="Calibri"/>
+          <w:rFonts w:ascii="Times New Roman" w:hAnsi="Times New Roman"/>
           <w:b/>
           <w:i w:val="0"/>
-          <w:color w:val="1F2937"/>
+          <w:color w:val="0369A1"/>
           <w:sz w:val="18"/>
-        </w:rPr>
-        <w:t xml:space="preserve">Tech Stack: </w:t>
-      </w:r>
-      <w:r>
-        <w:rPr>
-          <w:rFonts w:ascii="Calibri" w:hAnsi="Calibri"/>
-          <w:b w:val="0"/>
-          <w:i/>
-          <w:color w:val="4B5563"/>
-          <w:sz w:val="18"/>
-        </w:rPr>
-        <w:t>React, Node.js, Express.js, Supabase, PostgreSQL, OpenAI API, Gemini API</w:t>
-      </w:r>
-    </w:p>
-    <w:p>
-      <w:pPr>
-        <w:spacing w:before="0" w:after="50" w:line="254" w:lineRule="auto"/>
-        <w:ind w:left="403" w:hanging="230"/>
-      </w:pPr>
-      <w:r>
-        <w:rPr>
-          <w:rFonts w:ascii="Calibri" w:hAnsi="Calibri"/>
-          <w:b/>
-          <w:i w:val="0"/>
-          <w:color w:val="0EA5E9"/>
-          <w:sz w:val="21"/>
         </w:rPr>
         <w:t xml:space="preserve">•  </w:t>
       </w:r>
       <w:r>
         <w:rPr>
-          <w:rFonts w:ascii="Calibri" w:hAnsi="Calibri"/>
+          <w:rFonts w:ascii="Times New Roman" w:hAnsi="Times New Roman"/>
           <w:b w:val="0"/>
           <w:i w:val="0"/>
-          <w:color w:val="4B5563"/>
-          <w:sz w:val="21"/>
+          <w:color w:val="333333"/>
+          <w:sz w:val="18"/>
         </w:rPr>
-        <w:t>Developed an AI-powered virtual courtroom platform leveraging Generative and Agentic AI to simulate realistic legal proceedings.</w:t>
+        <w:t>Built AI automation workflows in n8n and integrated the OpenAI and Gemini APIs to orchestrate multi-step, LLM-driven business processes.</w:t>
       </w:r>
     </w:p>
     <w:p>
       <w:pPr>
-        <w:spacing w:before="0" w:after="50" w:line="254" w:lineRule="auto"/>
-        <w:ind w:left="403" w:hanging="230"/>
+        <w:spacing w:before="0" w:after="20" w:lineRule="exact" w:line="206"/>
+        <w:ind w:left="317" w:hanging="202"/>
       </w:pPr>
       <w:r>
         <w:rPr>
-          <w:rFonts w:ascii="Calibri" w:hAnsi="Calibri"/>
+          <w:rFonts w:ascii="Times New Roman" w:hAnsi="Times New Roman"/>
           <w:b/>
           <w:i w:val="0"/>
-          <w:color w:val="0EA5E9"/>
-          <w:sz w:val="21"/>
+          <w:color w:val="0369A1"/>
+          <w:sz w:val="18"/>
         </w:rPr>
         <w:t xml:space="preserve">•  </w:t>
       </w:r>
       <w:r>
         <w:rPr>
-          <w:rFonts w:ascii="Calibri" w:hAnsi="Calibri"/>
+          <w:rFonts w:ascii="Times New Roman" w:hAnsi="Times New Roman"/>
           <w:b w:val="0"/>
           <w:i w:val="0"/>
-          <w:color w:val="4B5563"/>
-          <w:sz w:val="21"/>
-        </w:rPr>
-        <w:t>Engineered secure authentication, case management, and digital evidence modules backed by Supabase and PostgreSQL.</w:t>
-      </w:r>
-    </w:p>
-    <w:p>
-      <w:pPr>
-        <w:spacing w:before="0" w:after="50" w:line="254" w:lineRule="auto"/>
-        <w:ind w:left="403" w:hanging="230"/>
-      </w:pPr>
-      <w:r>
-        <w:rPr>
-          <w:rFonts w:ascii="Calibri" w:hAnsi="Calibri"/>
-          <w:b/>
-          <w:i w:val="0"/>
-          <w:color w:val="0EA5E9"/>
-          <w:sz w:val="21"/>
-        </w:rPr>
-        <w:t xml:space="preserve">•  </w:t>
-      </w:r>
-      <w:r>
-        <w:rPr>
-          <w:rFonts w:ascii="Calibri" w:hAnsi="Calibri"/>
-          <w:b w:val="0"/>
-          <w:i w:val="0"/>
-          <w:color w:val="4B5563"/>
-          <w:sz w:val="21"/>
-        </w:rPr>
-        <w:t>Designed scalable REST APIs following Clean Architecture and SOLID principles for maintainable backend services.</w:t>
-      </w:r>
-    </w:p>
-    <w:p>
-      <w:pPr>
-        <w:spacing w:before="0" w:after="50" w:line="254" w:lineRule="auto"/>
-        <w:ind w:left="403" w:hanging="230"/>
-      </w:pPr>
-      <w:r>
-        <w:rPr>
-          <w:rFonts w:ascii="Calibri" w:hAnsi="Calibri"/>
-          <w:b/>
-          <w:i w:val="0"/>
-          <w:color w:val="0EA5E9"/>
-          <w:sz w:val="21"/>
-        </w:rPr>
-        <w:t xml:space="preserve">•  </w:t>
-      </w:r>
-      <w:r>
-        <w:rPr>
-          <w:rFonts w:ascii="Calibri" w:hAnsi="Calibri"/>
-          <w:b w:val="0"/>
-          <w:i w:val="0"/>
-          <w:color w:val="4B5563"/>
-          <w:sz w:val="21"/>
-        </w:rPr>
-        <w:t>Integrated OpenAI and Gemini models to simulate judges, witnesses, and legal arguments through coordinated AI agents.</w:t>
-      </w:r>
-    </w:p>
-    <w:p>
-      <w:pPr>
-        <w:spacing w:before="60" w:after="20" w:line="252" w:lineRule="auto"/>
-      </w:pPr>
-      <w:r>
-        <w:rPr>
-          <w:rFonts w:ascii="Calibri" w:hAnsi="Calibri"/>
-          <w:b/>
-          <w:i w:val="0"/>
-          <w:color w:val="1F2937"/>
-          <w:sz w:val="21"/>
-        </w:rPr>
-        <w:t>Smart Glasses for the Visually Impaired</w:t>
-      </w:r>
-      <w:r>
-        <w:rPr>
-          <w:rFonts w:ascii="Calibri" w:hAnsi="Calibri"/>
-          <w:b w:val="0"/>
-          <w:i w:val="0"/>
-          <w:color w:val="0369A1"/>
-          <w:sz w:val="20"/>
-        </w:rPr>
-        <w:t xml:space="preserve">  –  Embedded AI &amp; Computer Vision</w:t>
-      </w:r>
-    </w:p>
-    <w:p>
-      <w:pPr>
-        <w:spacing w:before="0" w:after="40" w:line="252" w:lineRule="auto"/>
-        <w:ind w:left="144"/>
-      </w:pPr>
-      <w:r>
-        <w:rPr>
-          <w:rFonts w:ascii="Calibri" w:hAnsi="Calibri"/>
-          <w:b/>
-          <w:i w:val="0"/>
-          <w:color w:val="1F2937"/>
+          <w:color w:val="333333"/>
           <w:sz w:val="18"/>
         </w:rPr>
-        <w:t xml:space="preserve">Tech Stack: </w:t>
-      </w:r>
-      <w:r>
-        <w:rPr>
-          <w:rFonts w:ascii="Calibri" w:hAnsi="Calibri"/>
-          <w:b w:val="0"/>
-          <w:i/>
-          <w:color w:val="4B5563"/>
-          <w:sz w:val="18"/>
-        </w:rPr>
-        <w:t>Raspberry Pi, Python, YOLO, Computer Vision, Text-to-Speech</w:t>
-      </w:r>
-    </w:p>
-    <w:p>
-      <w:pPr>
-        <w:spacing w:before="0" w:after="50" w:line="254" w:lineRule="auto"/>
-        <w:ind w:left="403" w:hanging="230"/>
-      </w:pPr>
-      <w:r>
-        <w:rPr>
-          <w:rFonts w:ascii="Calibri" w:hAnsi="Calibri"/>
-          <w:b/>
-          <w:i w:val="0"/>
-          <w:color w:val="0EA5E9"/>
-          <w:sz w:val="21"/>
-        </w:rPr>
-        <w:t xml:space="preserve">•  </w:t>
-      </w:r>
-      <w:r>
-        <w:rPr>
-          <w:rFonts w:ascii="Calibri" w:hAnsi="Calibri"/>
-          <w:b w:val="0"/>
-          <w:i w:val="0"/>
-          <w:color w:val="4B5563"/>
-          <w:sz w:val="21"/>
-        </w:rPr>
-        <w:t>Built a real-time object detection system using YOLO on Raspberry Pi to identify surroundings and support safe navigation.</w:t>
-      </w:r>
-    </w:p>
-    <w:p>
-      <w:pPr>
-        <w:spacing w:before="0" w:after="50" w:line="254" w:lineRule="auto"/>
-        <w:ind w:left="403" w:hanging="230"/>
-      </w:pPr>
-      <w:r>
-        <w:rPr>
-          <w:rFonts w:ascii="Calibri" w:hAnsi="Calibri"/>
-          <w:b/>
-          <w:i w:val="0"/>
-          <w:color w:val="0EA5E9"/>
-          <w:sz w:val="21"/>
-        </w:rPr>
-        <w:t xml:space="preserve">•  </w:t>
-      </w:r>
-      <w:r>
-        <w:rPr>
-          <w:rFonts w:ascii="Calibri" w:hAnsi="Calibri"/>
-          <w:b w:val="0"/>
-          <w:i w:val="0"/>
-          <w:color w:val="4B5563"/>
-          <w:sz w:val="21"/>
-        </w:rPr>
-        <w:t>Implemented an agentic decision layer that prioritizes hazards by proximity and context to deliver relevant guidance.</w:t>
-      </w:r>
-    </w:p>
-    <w:p>
-      <w:pPr>
-        <w:spacing w:before="0" w:after="50" w:line="254" w:lineRule="auto"/>
-        <w:ind w:left="403" w:hanging="230"/>
-      </w:pPr>
-      <w:r>
-        <w:rPr>
-          <w:rFonts w:ascii="Calibri" w:hAnsi="Calibri"/>
-          <w:b/>
-          <w:i w:val="0"/>
-          <w:color w:val="0EA5E9"/>
-          <w:sz w:val="21"/>
-        </w:rPr>
-        <w:t xml:space="preserve">•  </w:t>
-      </w:r>
-      <w:r>
-        <w:rPr>
-          <w:rFonts w:ascii="Calibri" w:hAnsi="Calibri"/>
-          <w:b w:val="0"/>
-          <w:i w:val="0"/>
-          <w:color w:val="4B5563"/>
-          <w:sz w:val="21"/>
-        </w:rPr>
-        <w:t>Converted visual detections into spoken audio cues, enabling hands-free assistive feedback for visually impaired users.</w:t>
-      </w:r>
-    </w:p>
-    <w:p>
-      <w:pPr>
-        <w:spacing w:before="0" w:after="50" w:line="254" w:lineRule="auto"/>
-        <w:ind w:left="403" w:hanging="230"/>
-      </w:pPr>
-      <w:r>
-        <w:rPr>
-          <w:rFonts w:ascii="Calibri" w:hAnsi="Calibri"/>
-          <w:b/>
-          <w:i w:val="0"/>
-          <w:color w:val="0EA5E9"/>
-          <w:sz w:val="21"/>
-        </w:rPr>
-        <w:t xml:space="preserve">•  </w:t>
-      </w:r>
-      <w:r>
-        <w:rPr>
-          <w:rFonts w:ascii="Calibri" w:hAnsi="Calibri"/>
-          <w:b w:val="0"/>
-          <w:i w:val="0"/>
-          <w:color w:val="4B5563"/>
-          <w:sz w:val="21"/>
-        </w:rPr>
-        <w:t>Optimized the computer vision pipeline for low latency and power efficiency on a resource-constrained edge device.</w:t>
-      </w:r>
-    </w:p>
-    <w:p>
-      <w:pPr>
-        <w:spacing w:before="60" w:after="20" w:line="252" w:lineRule="auto"/>
-      </w:pPr>
-      <w:r>
-        <w:rPr>
-          <w:rFonts w:ascii="Calibri" w:hAnsi="Calibri"/>
-          <w:b/>
-          <w:i w:val="0"/>
-          <w:color w:val="1F2937"/>
-          <w:sz w:val="21"/>
-        </w:rPr>
-        <w:t>DealHunt</w:t>
-      </w:r>
-      <w:r>
-        <w:rPr>
-          <w:rFonts w:ascii="Calibri" w:hAnsi="Calibri"/>
-          <w:b w:val="0"/>
-          <w:i w:val="0"/>
-          <w:color w:val="0369A1"/>
-          <w:sz w:val="20"/>
-        </w:rPr>
-        <w:t xml:space="preserve">  –  AI-Powered Deal Discovery Platform</w:t>
-      </w:r>
-    </w:p>
-    <w:p>
-      <w:pPr>
-        <w:spacing w:before="0" w:after="40" w:line="252" w:lineRule="auto"/>
-        <w:ind w:left="144"/>
-      </w:pPr>
-      <w:r>
-        <w:rPr>
-          <w:rFonts w:ascii="Calibri" w:hAnsi="Calibri"/>
-          <w:b/>
-          <w:i w:val="0"/>
-          <w:color w:val="1F2937"/>
-          <w:sz w:val="18"/>
-        </w:rPr>
-        <w:t xml:space="preserve">Tech Stack: </w:t>
-      </w:r>
-      <w:r>
-        <w:rPr>
-          <w:rFonts w:ascii="Calibri" w:hAnsi="Calibri"/>
-          <w:b w:val="0"/>
-          <w:i/>
-          <w:color w:val="4B5563"/>
-          <w:sz w:val="18"/>
-        </w:rPr>
-        <w:t>React, Node.js, Express.js, MongoDB, Firebase</w:t>
-      </w:r>
-    </w:p>
-    <w:p>
-      <w:pPr>
-        <w:spacing w:before="0" w:after="50" w:line="254" w:lineRule="auto"/>
-        <w:ind w:left="403" w:hanging="230"/>
-      </w:pPr>
-      <w:r>
-        <w:rPr>
-          <w:rFonts w:ascii="Calibri" w:hAnsi="Calibri"/>
-          <w:b/>
-          <w:i w:val="0"/>
-          <w:color w:val="0EA5E9"/>
-          <w:sz w:val="21"/>
-        </w:rPr>
-        <w:t xml:space="preserve">•  </w:t>
-      </w:r>
-      <w:r>
-        <w:rPr>
-          <w:rFonts w:ascii="Calibri" w:hAnsi="Calibri"/>
-          <w:b w:val="0"/>
-          <w:i w:val="0"/>
-          <w:color w:val="4B5563"/>
-          <w:sz w:val="21"/>
-        </w:rPr>
-        <w:t>Built a full-stack platform for discovering and sharing local and online deals within an engaged user community.</w:t>
-      </w:r>
-    </w:p>
-    <w:p>
-      <w:pPr>
-        <w:spacing w:before="0" w:after="50" w:line="254" w:lineRule="auto"/>
-        <w:ind w:left="403" w:hanging="230"/>
-      </w:pPr>
-      <w:r>
-        <w:rPr>
-          <w:rFonts w:ascii="Calibri" w:hAnsi="Calibri"/>
-          <w:b/>
-          <w:i w:val="0"/>
-          <w:color w:val="0EA5E9"/>
-          <w:sz w:val="21"/>
-        </w:rPr>
-        <w:t xml:space="preserve">•  </w:t>
-      </w:r>
-      <w:r>
-        <w:rPr>
-          <w:rFonts w:ascii="Calibri" w:hAnsi="Calibri"/>
-          <w:b w:val="0"/>
-          <w:i w:val="0"/>
-          <w:color w:val="4B5563"/>
-          <w:sz w:val="21"/>
-        </w:rPr>
-        <w:t>Implemented secure authentication, user profiles, and deal management features across the stack.</w:t>
-      </w:r>
-    </w:p>
-    <w:p>
-      <w:pPr>
-        <w:spacing w:before="0" w:after="50" w:line="254" w:lineRule="auto"/>
-        <w:ind w:left="403" w:hanging="230"/>
-      </w:pPr>
-      <w:r>
-        <w:rPr>
-          <w:rFonts w:ascii="Calibri" w:hAnsi="Calibri"/>
-          <w:b/>
-          <w:i w:val="0"/>
-          <w:color w:val="0EA5E9"/>
-          <w:sz w:val="21"/>
-        </w:rPr>
-        <w:t xml:space="preserve">•  </w:t>
-      </w:r>
-      <w:r>
-        <w:rPr>
-          <w:rFonts w:ascii="Calibri" w:hAnsi="Calibri"/>
-          <w:b w:val="0"/>
-          <w:i w:val="0"/>
-          <w:color w:val="4B5563"/>
-          <w:sz w:val="21"/>
-        </w:rPr>
-        <w:t>Integrated AI-powered personalized deal recommendations based on user preferences and behavior.</w:t>
-      </w:r>
-    </w:p>
-    <w:p>
-      <w:pPr>
-        <w:spacing w:before="0" w:after="50" w:line="254" w:lineRule="auto"/>
-        <w:ind w:left="403" w:hanging="230"/>
-      </w:pPr>
-      <w:r>
-        <w:rPr>
-          <w:rFonts w:ascii="Calibri" w:hAnsi="Calibri"/>
-          <w:b/>
-          <w:i w:val="0"/>
-          <w:color w:val="0EA5E9"/>
-          <w:sz w:val="21"/>
-        </w:rPr>
-        <w:t xml:space="preserve">•  </w:t>
-      </w:r>
-      <w:r>
-        <w:rPr>
-          <w:rFonts w:ascii="Calibri" w:hAnsi="Calibri"/>
-          <w:b w:val="0"/>
-          <w:i w:val="0"/>
-          <w:color w:val="4B5563"/>
-          <w:sz w:val="21"/>
-        </w:rPr>
-        <w:t>Designed responsive interfaces and scalable backend REST APIs for a seamless user experience.</w:t>
-      </w:r>
-    </w:p>
-    <w:p>
-      <w:pPr>
-        <w:spacing w:before="60" w:after="20" w:line="252" w:lineRule="auto"/>
-      </w:pPr>
-      <w:r>
-        <w:rPr>
-          <w:rFonts w:ascii="Calibri" w:hAnsi="Calibri"/>
-          <w:b/>
-          <w:i w:val="0"/>
-          <w:color w:val="1F2937"/>
-          <w:sz w:val="21"/>
-        </w:rPr>
-        <w:t>AI Telegram News Assistant</w:t>
-      </w:r>
-      <w:r>
-        <w:rPr>
-          <w:rFonts w:ascii="Calibri" w:hAnsi="Calibri"/>
-          <w:b w:val="0"/>
-          <w:i w:val="0"/>
-          <w:color w:val="0369A1"/>
-          <w:sz w:val="20"/>
-        </w:rPr>
-        <w:t xml:space="preserve">  –  Automated AI News Pipeline</w:t>
-      </w:r>
-    </w:p>
-    <w:p>
-      <w:pPr>
-        <w:spacing w:before="0" w:after="40" w:line="252" w:lineRule="auto"/>
-        <w:ind w:left="144"/>
-      </w:pPr>
-      <w:r>
-        <w:rPr>
-          <w:rFonts w:ascii="Calibri" w:hAnsi="Calibri"/>
-          <w:b/>
-          <w:i w:val="0"/>
-          <w:color w:val="1F2937"/>
-          <w:sz w:val="18"/>
-        </w:rPr>
-        <w:t xml:space="preserve">Tech Stack: </w:t>
-      </w:r>
-      <w:r>
-        <w:rPr>
-          <w:rFonts w:ascii="Calibri" w:hAnsi="Calibri"/>
-          <w:b w:val="0"/>
-          <w:i/>
-          <w:color w:val="4B5563"/>
-          <w:sz w:val="18"/>
-        </w:rPr>
-        <w:t>Python, n8n, Telegram Bot API, OpenAI API, Gemini API</w:t>
-      </w:r>
-    </w:p>
-    <w:p>
-      <w:pPr>
-        <w:spacing w:before="0" w:after="50" w:line="254" w:lineRule="auto"/>
-        <w:ind w:left="403" w:hanging="230"/>
-      </w:pPr>
-      <w:r>
-        <w:rPr>
-          <w:rFonts w:ascii="Calibri" w:hAnsi="Calibri"/>
-          <w:b/>
-          <w:i w:val="0"/>
-          <w:color w:val="0EA5E9"/>
-          <w:sz w:val="21"/>
-        </w:rPr>
-        <w:t xml:space="preserve">•  </w:t>
-      </w:r>
-      <w:r>
-        <w:rPr>
-          <w:rFonts w:ascii="Calibri" w:hAnsi="Calibri"/>
-          <w:b w:val="0"/>
-          <w:i w:val="0"/>
-          <w:color w:val="4B5563"/>
-          <w:sz w:val="21"/>
-        </w:rPr>
-        <w:t>Developed an Agentic AI Telegram bot that automates personalized news delivery from multiple sources.</w:t>
-      </w:r>
-    </w:p>
-    <w:p>
-      <w:pPr>
-        <w:spacing w:before="0" w:after="50" w:line="254" w:lineRule="auto"/>
-        <w:ind w:left="403" w:hanging="230"/>
-      </w:pPr>
-      <w:r>
-        <w:rPr>
-          <w:rFonts w:ascii="Calibri" w:hAnsi="Calibri"/>
-          <w:b/>
-          <w:i w:val="0"/>
-          <w:color w:val="0EA5E9"/>
-          <w:sz w:val="21"/>
-        </w:rPr>
-        <w:t xml:space="preserve">•  </w:t>
-      </w:r>
-      <w:r>
-        <w:rPr>
-          <w:rFonts w:ascii="Calibri" w:hAnsi="Calibri"/>
-          <w:b w:val="0"/>
-          <w:i w:val="0"/>
-          <w:color w:val="4B5563"/>
-          <w:sz w:val="21"/>
-        </w:rPr>
-        <w:t>Built AI workflows to fetch, summarize, and categorize news using LLM-driven processing.</w:t>
-      </w:r>
-    </w:p>
-    <w:p>
-      <w:pPr>
-        <w:spacing w:before="0" w:after="50" w:line="254" w:lineRule="auto"/>
-        <w:ind w:left="403" w:hanging="230"/>
-      </w:pPr>
-      <w:r>
-        <w:rPr>
-          <w:rFonts w:ascii="Calibri" w:hAnsi="Calibri"/>
-          <w:b/>
-          <w:i w:val="0"/>
-          <w:color w:val="0EA5E9"/>
-          <w:sz w:val="21"/>
-        </w:rPr>
-        <w:t xml:space="preserve">•  </w:t>
-      </w:r>
-      <w:r>
-        <w:rPr>
-          <w:rFonts w:ascii="Calibri" w:hAnsi="Calibri"/>
-          <w:b w:val="0"/>
-          <w:i w:val="0"/>
-          <w:color w:val="4B5563"/>
-          <w:sz w:val="21"/>
-        </w:rPr>
-        <w:t>Automated scheduling and content delivery through event-driven n8n workflows.</w:t>
-      </w:r>
-    </w:p>
-    <w:p>
-      <w:pPr>
-        <w:spacing w:before="0" w:after="50" w:line="254" w:lineRule="auto"/>
-        <w:ind w:left="403" w:hanging="230"/>
-      </w:pPr>
-      <w:r>
-        <w:rPr>
-          <w:rFonts w:ascii="Calibri" w:hAnsi="Calibri"/>
-          <w:b/>
-          <w:i w:val="0"/>
-          <w:color w:val="0EA5E9"/>
-          <w:sz w:val="21"/>
-        </w:rPr>
-        <w:t xml:space="preserve">•  </w:t>
-      </w:r>
-      <w:r>
-        <w:rPr>
-          <w:rFonts w:ascii="Calibri" w:hAnsi="Calibri"/>
-          <w:b w:val="0"/>
-          <w:i w:val="0"/>
-          <w:color w:val="4B5563"/>
-          <w:sz w:val="21"/>
-        </w:rPr>
-        <w:t>Leveraged LLMs to generate concise, accurate, and reader-friendly news summaries.</w:t>
+        <w:t>Developed a Telegram chatbot and Python automation scripts to handle user queries and eliminate repetitive manual tasks through API integrations.</w:t>
       </w:r>
     </w:p>
     <w:tbl>
@@ -1822,18 +1229,18 @@
         </w:tblBorders>
       </w:tblPr>
       <w:tblGrid>
-        <w:gridCol w:w="10512"/>
+        <w:gridCol w:w="10800"/>
       </w:tblGrid>
       <w:tr>
         <w:tc>
           <w:tcPr>
-            <w:tcW w:type="dxa" w:w="10512"/>
+            <w:tcW w:type="dxa" w:w="10800"/>
             <w:shd w:val="clear" w:color="auto" w:fill="0EA5E9"/>
             <w:tcMar>
-              <w:top w:w="30" w:type="dxa"/>
-              <w:bottom w:w="30" w:type="dxa"/>
-              <w:start w:w="110" w:type="dxa"/>
-              <w:end w:w="110" w:type="dxa"/>
+              <w:top w:w="8" w:type="dxa"/>
+              <w:bottom w:w="8" w:type="dxa"/>
+              <w:start w:w="100" w:type="dxa"/>
+              <w:end w:w="100" w:type="dxa"/>
             </w:tcMar>
           </w:tcPr>
           <w:p>
@@ -1842,13 +1249,13 @@
             </w:pPr>
             <w:r>
               <w:rPr>
-                <w:rFonts w:ascii="Calibri" w:hAnsi="Calibri"/>
+                <w:rFonts w:ascii="Times New Roman" w:hAnsi="Times New Roman"/>
                 <w:b/>
                 <w:i w:val="0"/>
                 <w:color w:val="FFFFFF"/>
-                <w:sz w:val="22"/>
+                <w:sz w:val="20"/>
               </w:rPr>
-              <w:t>CERTIFICATIONS</w:t>
+              <w:t>PROJECTS</w:t>
             </w:r>
           </w:p>
         </w:tc>
@@ -1856,191 +1263,419 @@
     </w:tbl>
     <w:p>
       <w:pPr>
-        <w:spacing w:before="0" w:after="40" w:line="240" w:lineRule="auto"/>
+        <w:spacing w:before="0" w:after="20" w:lineRule="exact" w:line="60"/>
       </w:pPr>
     </w:p>
     <w:p>
       <w:pPr>
-        <w:spacing w:before="0" w:after="60" w:line="259" w:lineRule="auto"/>
-        <w:ind w:left="403" w:hanging="230"/>
+        <w:spacing w:before="40" w:after="0" w:lineRule="exact" w:line="240"/>
       </w:pPr>
       <w:r>
         <w:rPr>
-          <w:rFonts w:ascii="Calibri" w:hAnsi="Calibri"/>
+          <w:rFonts w:ascii="Times New Roman" w:hAnsi="Times New Roman"/>
           <w:b/>
           <w:i w:val="0"/>
-          <w:color w:val="0EA5E9"/>
-          <w:sz w:val="21"/>
+          <w:color w:val="1A1A1A"/>
+          <w:sz w:val="18"/>
+        </w:rPr>
+        <w:t>NyayaSim</w:t>
+      </w:r>
+      <w:r>
+        <w:rPr>
+          <w:rFonts w:ascii="Times New Roman" w:hAnsi="Times New Roman"/>
+          <w:b w:val="0"/>
+          <w:i/>
+          <w:color w:val="0369A1"/>
+          <w:sz w:val="18"/>
+        </w:rPr>
+        <w:t xml:space="preserve">  –  AI-Powered Virtual Courtroom</w:t>
+      </w:r>
+    </w:p>
+    <w:p>
+      <w:pPr>
+        <w:spacing w:before="0" w:after="20" w:lineRule="exact" w:line="180"/>
+        <w:ind w:left="72"/>
+      </w:pPr>
+      <w:r>
+        <w:rPr>
+          <w:rFonts w:ascii="Times New Roman" w:hAnsi="Times New Roman"/>
+          <w:b/>
+          <w:i w:val="0"/>
+          <w:color w:val="1A1A1A"/>
+          <w:sz w:val="16"/>
+        </w:rPr>
+        <w:t xml:space="preserve">Tech Stack: </w:t>
+      </w:r>
+      <w:r>
+        <w:rPr>
+          <w:rFonts w:ascii="Times New Roman" w:hAnsi="Times New Roman"/>
+          <w:b w:val="0"/>
+          <w:i/>
+          <w:color w:val="333333"/>
+          <w:sz w:val="16"/>
+        </w:rPr>
+        <w:t>React, Node.js, Express.js, Supabase, PostgreSQL, OpenAI API, Gemini API</w:t>
+      </w:r>
+    </w:p>
+    <w:p>
+      <w:pPr>
+        <w:spacing w:before="0" w:after="20" w:lineRule="exact" w:line="206"/>
+        <w:ind w:left="317" w:hanging="202"/>
+      </w:pPr>
+      <w:r>
+        <w:rPr>
+          <w:rFonts w:ascii="Times New Roman" w:hAnsi="Times New Roman"/>
+          <w:b/>
+          <w:i w:val="0"/>
+          <w:color w:val="0369A1"/>
+          <w:sz w:val="18"/>
         </w:rPr>
         <w:t xml:space="preserve">•  </w:t>
       </w:r>
       <w:r>
         <w:rPr>
-          <w:rFonts w:ascii="Calibri" w:hAnsi="Calibri"/>
-          <w:b/>
-          <w:i w:val="0"/>
-          <w:color w:val="1F2937"/>
-          <w:sz w:val="20"/>
-        </w:rPr>
-        <w:t xml:space="preserve">100 Days of Code: The Complete Python Pro Bootcamp </w:t>
-      </w:r>
-      <w:r>
-        <w:rPr>
-          <w:rFonts w:ascii="Calibri" w:hAnsi="Calibri"/>
+          <w:rFonts w:ascii="Times New Roman" w:hAnsi="Times New Roman"/>
           <w:b w:val="0"/>
           <w:i w:val="0"/>
-          <w:color w:val="0369A1"/>
-          <w:sz w:val="19"/>
+          <w:color w:val="333333"/>
+          <w:sz w:val="18"/>
         </w:rPr>
-        <w:t xml:space="preserve">(Dr. Angela Yu – Udemy) – </w:t>
-      </w:r>
-      <w:r>
-        <w:rPr>
-          <w:rFonts w:ascii="Calibri" w:hAnsi="Calibri"/>
-          <w:b w:val="0"/>
-          <w:i w:val="0"/>
-          <w:color w:val="4B5563"/>
-          <w:sz w:val="19"/>
-        </w:rPr>
-        <w:t>100 hands-on Python projects spanning automation, APIs, and web apps.</w:t>
+        <w:t>Architected an AI courtroom using Generative and Agentic AI to simulate judges, witnesses, and legal arguments, with secure authentication, case management, and digital evidence modules.</w:t>
       </w:r>
     </w:p>
     <w:p>
       <w:pPr>
-        <w:spacing w:before="0" w:after="60" w:line="259" w:lineRule="auto"/>
-        <w:ind w:left="403" w:hanging="230"/>
+        <w:spacing w:before="0" w:after="20" w:lineRule="exact" w:line="206"/>
+        <w:ind w:left="317" w:hanging="202"/>
       </w:pPr>
       <w:r>
         <w:rPr>
-          <w:rFonts w:ascii="Calibri" w:hAnsi="Calibri"/>
+          <w:rFonts w:ascii="Times New Roman" w:hAnsi="Times New Roman"/>
           <w:b/>
           <w:i w:val="0"/>
-          <w:color w:val="0EA5E9"/>
-          <w:sz w:val="21"/>
+          <w:color w:val="0369A1"/>
+          <w:sz w:val="18"/>
         </w:rPr>
         <w:t xml:space="preserve">•  </w:t>
       </w:r>
       <w:r>
         <w:rPr>
-          <w:rFonts w:ascii="Calibri" w:hAnsi="Calibri"/>
-          <w:b/>
-          <w:i w:val="0"/>
-          <w:color w:val="1F2937"/>
-          <w:sz w:val="20"/>
-        </w:rPr>
-        <w:t xml:space="preserve">Full Stack Generative &amp; Agentic AI with Python </w:t>
-      </w:r>
-      <w:r>
-        <w:rPr>
-          <w:rFonts w:ascii="Calibri" w:hAnsi="Calibri"/>
+          <w:rFonts w:ascii="Times New Roman" w:hAnsi="Times New Roman"/>
           <w:b w:val="0"/>
           <w:i w:val="0"/>
-          <w:color w:val="0369A1"/>
-          <w:sz w:val="19"/>
+          <w:color w:val="333333"/>
+          <w:sz w:val="18"/>
         </w:rPr>
-        <w:t xml:space="preserve">(Hitesh Choudhary – Udemy) – </w:t>
-      </w:r>
-      <w:r>
-        <w:rPr>
-          <w:rFonts w:ascii="Calibri" w:hAnsi="Calibri"/>
-          <w:b w:val="0"/>
-          <w:i w:val="0"/>
-          <w:color w:val="4B5563"/>
-          <w:sz w:val="19"/>
-        </w:rPr>
-        <w:t>Building LLM applications, RAG pipelines, and AI agents with Python.</w:t>
+        <w:t>Designed scalable REST APIs following Clean Architecture and SOLID principles for maintainable backend services.</w:t>
       </w:r>
     </w:p>
     <w:p>
       <w:pPr>
-        <w:spacing w:before="0" w:after="60" w:line="259" w:lineRule="auto"/>
-        <w:ind w:left="403" w:hanging="230"/>
+        <w:spacing w:before="40" w:after="0" w:lineRule="exact" w:line="240"/>
       </w:pPr>
       <w:r>
         <w:rPr>
-          <w:rFonts w:ascii="Calibri" w:hAnsi="Calibri"/>
+          <w:rFonts w:ascii="Times New Roman" w:hAnsi="Times New Roman"/>
           <w:b/>
           <w:i w:val="0"/>
-          <w:color w:val="0EA5E9"/>
-          <w:sz w:val="21"/>
+          <w:color w:val="1A1A1A"/>
+          <w:sz w:val="18"/>
+        </w:rPr>
+        <w:t>Smart Glasses for the Visually Impaired</w:t>
+      </w:r>
+      <w:r>
+        <w:rPr>
+          <w:rFonts w:ascii="Times New Roman" w:hAnsi="Times New Roman"/>
+          <w:b w:val="0"/>
+          <w:i/>
+          <w:color w:val="0369A1"/>
+          <w:sz w:val="18"/>
+        </w:rPr>
+        <w:t xml:space="preserve">  –  Embedded AI &amp; Computer Vision</w:t>
+      </w:r>
+    </w:p>
+    <w:p>
+      <w:pPr>
+        <w:spacing w:before="0" w:after="20" w:lineRule="exact" w:line="180"/>
+        <w:ind w:left="72"/>
+      </w:pPr>
+      <w:r>
+        <w:rPr>
+          <w:rFonts w:ascii="Times New Roman" w:hAnsi="Times New Roman"/>
+          <w:b/>
+          <w:i w:val="0"/>
+          <w:color w:val="1A1A1A"/>
+          <w:sz w:val="16"/>
+        </w:rPr>
+        <w:t xml:space="preserve">Tech Stack: </w:t>
+      </w:r>
+      <w:r>
+        <w:rPr>
+          <w:rFonts w:ascii="Times New Roman" w:hAnsi="Times New Roman"/>
+          <w:b w:val="0"/>
+          <w:i/>
+          <w:color w:val="333333"/>
+          <w:sz w:val="16"/>
+        </w:rPr>
+        <w:t>Python, Raspberry Pi, YOLO, Computer Vision, Text-to-Speech</w:t>
+      </w:r>
+    </w:p>
+    <w:p>
+      <w:pPr>
+        <w:spacing w:before="0" w:after="20" w:lineRule="exact" w:line="206"/>
+        <w:ind w:left="317" w:hanging="202"/>
+      </w:pPr>
+      <w:r>
+        <w:rPr>
+          <w:rFonts w:ascii="Times New Roman" w:hAnsi="Times New Roman"/>
+          <w:b/>
+          <w:i w:val="0"/>
+          <w:color w:val="0369A1"/>
+          <w:sz w:val="18"/>
         </w:rPr>
         <w:t xml:space="preserve">•  </w:t>
       </w:r>
       <w:r>
         <w:rPr>
-          <w:rFonts w:ascii="Calibri" w:hAnsi="Calibri"/>
-          <w:b/>
-          <w:i w:val="0"/>
-          <w:color w:val="1F2937"/>
-          <w:sz w:val="20"/>
-        </w:rPr>
-        <w:t xml:space="preserve">Complete Web Development Course </w:t>
-      </w:r>
-      <w:r>
-        <w:rPr>
-          <w:rFonts w:ascii="Calibri" w:hAnsi="Calibri"/>
+          <w:rFonts w:ascii="Times New Roman" w:hAnsi="Times New Roman"/>
           <w:b w:val="0"/>
           <w:i w:val="0"/>
-          <w:color w:val="0369A1"/>
-          <w:sz w:val="19"/>
+          <w:color w:val="333333"/>
+          <w:sz w:val="18"/>
         </w:rPr>
-        <w:t xml:space="preserve">(Hitesh Choudhary – Udemy) – </w:t>
-      </w:r>
-      <w:r>
-        <w:rPr>
-          <w:rFonts w:ascii="Calibri" w:hAnsi="Calibri"/>
-          <w:b w:val="0"/>
-          <w:i w:val="0"/>
-          <w:color w:val="4B5563"/>
-          <w:sz w:val="19"/>
-        </w:rPr>
-        <w:t>End-to-end full stack web development, from front end to back end.</w:t>
+        <w:t>Built a real-time YOLO object-detection pipeline on Raspberry Pi for obstacle detection, optimized for low-latency inference on a resource-constrained edge device.</w:t>
       </w:r>
     </w:p>
     <w:p>
       <w:pPr>
-        <w:spacing w:before="0" w:after="60" w:line="259" w:lineRule="auto"/>
-        <w:ind w:left="403" w:hanging="230"/>
+        <w:spacing w:before="0" w:after="20" w:lineRule="exact" w:line="206"/>
+        <w:ind w:left="317" w:hanging="202"/>
       </w:pPr>
       <w:r>
         <w:rPr>
-          <w:rFonts w:ascii="Calibri" w:hAnsi="Calibri"/>
+          <w:rFonts w:ascii="Times New Roman" w:hAnsi="Times New Roman"/>
           <w:b/>
           <w:i w:val="0"/>
-          <w:color w:val="0EA5E9"/>
-          <w:sz w:val="21"/>
+          <w:color w:val="0369A1"/>
+          <w:sz w:val="18"/>
         </w:rPr>
         <w:t xml:space="preserve">•  </w:t>
       </w:r>
       <w:r>
         <w:rPr>
-          <w:rFonts w:ascii="Calibri" w:hAnsi="Calibri"/>
+          <w:rFonts w:ascii="Times New Roman" w:hAnsi="Times New Roman"/>
+          <w:b w:val="0"/>
+          <w:i w:val="0"/>
+          <w:color w:val="333333"/>
+          <w:sz w:val="18"/>
+        </w:rPr>
+        <w:t>Implemented voice guidance that converts detections into spoken cues, enabling hands-free assistive navigation.</w:t>
+      </w:r>
+    </w:p>
+    <w:p>
+      <w:pPr>
+        <w:spacing w:before="40" w:after="0" w:lineRule="exact" w:line="240"/>
+      </w:pPr>
+      <w:r>
+        <w:rPr>
+          <w:rFonts w:ascii="Times New Roman" w:hAnsi="Times New Roman"/>
           <w:b/>
           <w:i w:val="0"/>
-          <w:color w:val="1F2937"/>
-          <w:sz w:val="20"/>
+          <w:color w:val="1A1A1A"/>
+          <w:sz w:val="18"/>
         </w:rPr>
-        <w:t xml:space="preserve">DEMA: Drone Engineering, Mechanics &amp; Applications Bootcamp </w:t>
+        <w:t>DealHunt</w:t>
       </w:r>
       <w:r>
         <w:rPr>
-          <w:rFonts w:ascii="Calibri" w:hAnsi="Calibri"/>
+          <w:rFonts w:ascii="Times New Roman" w:hAnsi="Times New Roman"/>
           <w:b w:val="0"/>
+          <w:i/>
+          <w:color w:val="0369A1"/>
+          <w:sz w:val="18"/>
+        </w:rPr>
+        <w:t xml:space="preserve">  –  AI-Powered Deal Discovery Platform</w:t>
+      </w:r>
+    </w:p>
+    <w:p>
+      <w:pPr>
+        <w:spacing w:before="0" w:after="20" w:lineRule="exact" w:line="180"/>
+        <w:ind w:left="72"/>
+      </w:pPr>
+      <w:r>
+        <w:rPr>
+          <w:rFonts w:ascii="Times New Roman" w:hAnsi="Times New Roman"/>
+          <w:b/>
           <w:i w:val="0"/>
-          <w:color w:val="0369A1"/>
-          <w:sz w:val="19"/>
+          <w:color w:val="1A1A1A"/>
+          <w:sz w:val="16"/>
         </w:rPr>
-        <w:t xml:space="preserve">(NIT Jalandhar &amp; CCET – MeitY, Govt. of India) – </w:t>
+        <w:t xml:space="preserve">Tech Stack: </w:t>
       </w:r>
       <w:r>
         <w:rPr>
-          <w:rFonts w:ascii="Calibri" w:hAnsi="Calibri"/>
+          <w:rFonts w:ascii="Times New Roman" w:hAnsi="Times New Roman"/>
+          <w:b w:val="0"/>
+          <w:i/>
+          <w:color w:val="333333"/>
+          <w:sz w:val="16"/>
+        </w:rPr>
+        <w:t>React, Node.js, Express.js, MongoDB, Firebase</w:t>
+      </w:r>
+    </w:p>
+    <w:p>
+      <w:pPr>
+        <w:spacing w:before="0" w:after="20" w:lineRule="exact" w:line="206"/>
+        <w:ind w:left="317" w:hanging="202"/>
+      </w:pPr>
+      <w:r>
+        <w:rPr>
+          <w:rFonts w:ascii="Times New Roman" w:hAnsi="Times New Roman"/>
+          <w:b/>
+          <w:i w:val="0"/>
+          <w:color w:val="0369A1"/>
+          <w:sz w:val="18"/>
+        </w:rPr>
+        <w:t xml:space="preserve">•  </w:t>
+      </w:r>
+      <w:r>
+        <w:rPr>
+          <w:rFonts w:ascii="Times New Roman" w:hAnsi="Times New Roman"/>
           <w:b w:val="0"/>
           <w:i w:val="0"/>
-          <w:color w:val="4B5563"/>
-          <w:sz w:val="19"/>
+          <w:color w:val="333333"/>
+          <w:sz w:val="18"/>
         </w:rPr>
-        <w:t>5-day bootcamp on UAV systems, drone mechanics, and embedded applications; scored 27/30 in the skill test.</w:t>
+        <w:t>Developed a full-stack community platform with secure authentication, user profiles, and deal management backed by scalable REST APIs.</w:t>
+      </w:r>
+    </w:p>
+    <w:p>
+      <w:pPr>
+        <w:spacing w:before="0" w:after="20" w:lineRule="exact" w:line="206"/>
+        <w:ind w:left="317" w:hanging="202"/>
+      </w:pPr>
+      <w:r>
+        <w:rPr>
+          <w:rFonts w:ascii="Times New Roman" w:hAnsi="Times New Roman"/>
+          <w:b/>
+          <w:i w:val="0"/>
+          <w:color w:val="0369A1"/>
+          <w:sz w:val="18"/>
+        </w:rPr>
+        <w:t xml:space="preserve">•  </w:t>
+      </w:r>
+      <w:r>
+        <w:rPr>
+          <w:rFonts w:ascii="Times New Roman" w:hAnsi="Times New Roman"/>
+          <w:b w:val="0"/>
+          <w:i w:val="0"/>
+          <w:color w:val="333333"/>
+          <w:sz w:val="18"/>
+        </w:rPr>
+        <w:t>Integrated AI-powered personalized deal recommendations and a responsive UI for a seamless user experience.</w:t>
+      </w:r>
+    </w:p>
+    <w:p>
+      <w:pPr>
+        <w:spacing w:before="40" w:after="0" w:lineRule="exact" w:line="240"/>
+      </w:pPr>
+      <w:r>
+        <w:rPr>
+          <w:rFonts w:ascii="Times New Roman" w:hAnsi="Times New Roman"/>
+          <w:b/>
+          <w:i w:val="0"/>
+          <w:color w:val="1A1A1A"/>
+          <w:sz w:val="18"/>
+        </w:rPr>
+        <w:t>AI Telegram News Assistant</w:t>
+      </w:r>
+      <w:r>
+        <w:rPr>
+          <w:rFonts w:ascii="Times New Roman" w:hAnsi="Times New Roman"/>
+          <w:b w:val="0"/>
+          <w:i/>
+          <w:color w:val="0369A1"/>
+          <w:sz w:val="18"/>
+        </w:rPr>
+        <w:t xml:space="preserve">  –  Automated AI News Pipeline</w:t>
+      </w:r>
+    </w:p>
+    <w:p>
+      <w:pPr>
+        <w:spacing w:before="0" w:after="20" w:lineRule="exact" w:line="180"/>
+        <w:ind w:left="72"/>
+      </w:pPr>
+      <w:r>
+        <w:rPr>
+          <w:rFonts w:ascii="Times New Roman" w:hAnsi="Times New Roman"/>
+          <w:b/>
+          <w:i w:val="0"/>
+          <w:color w:val="1A1A1A"/>
+          <w:sz w:val="16"/>
+        </w:rPr>
+        <w:t xml:space="preserve">Tech Stack: </w:t>
+      </w:r>
+      <w:r>
+        <w:rPr>
+          <w:rFonts w:ascii="Times New Roman" w:hAnsi="Times New Roman"/>
+          <w:b w:val="0"/>
+          <w:i/>
+          <w:color w:val="333333"/>
+          <w:sz w:val="16"/>
+        </w:rPr>
+        <w:t>Python, n8n, Telegram Bot API, OpenAI API, Gemini API</w:t>
+      </w:r>
+    </w:p>
+    <w:p>
+      <w:pPr>
+        <w:spacing w:before="0" w:after="20" w:lineRule="exact" w:line="206"/>
+        <w:ind w:left="317" w:hanging="202"/>
+      </w:pPr>
+      <w:r>
+        <w:rPr>
+          <w:rFonts w:ascii="Times New Roman" w:hAnsi="Times New Roman"/>
+          <w:b/>
+          <w:i w:val="0"/>
+          <w:color w:val="0369A1"/>
+          <w:sz w:val="18"/>
+        </w:rPr>
+        <w:t xml:space="preserve">•  </w:t>
+      </w:r>
+      <w:r>
+        <w:rPr>
+          <w:rFonts w:ascii="Times New Roman" w:hAnsi="Times New Roman"/>
+          <w:b w:val="0"/>
+          <w:i w:val="0"/>
+          <w:color w:val="333333"/>
+          <w:sz w:val="18"/>
+        </w:rPr>
+        <w:t>Engineered an Agentic AI Telegram bot that fetches, summarizes, and categorizes news from multiple sources using LLM-driven processing.</w:t>
+      </w:r>
+    </w:p>
+    <w:p>
+      <w:pPr>
+        <w:spacing w:before="0" w:after="20" w:lineRule="exact" w:line="206"/>
+        <w:ind w:left="317" w:hanging="202"/>
+      </w:pPr>
+      <w:r>
+        <w:rPr>
+          <w:rFonts w:ascii="Times New Roman" w:hAnsi="Times New Roman"/>
+          <w:b/>
+          <w:i w:val="0"/>
+          <w:color w:val="0369A1"/>
+          <w:sz w:val="18"/>
+        </w:rPr>
+        <w:t xml:space="preserve">•  </w:t>
+      </w:r>
+      <w:r>
+        <w:rPr>
+          <w:rFonts w:ascii="Times New Roman" w:hAnsi="Times New Roman"/>
+          <w:b w:val="0"/>
+          <w:i w:val="0"/>
+          <w:color w:val="333333"/>
+          <w:sz w:val="18"/>
+        </w:rPr>
+        <w:t>Automated scheduling and personalized delivery through event-driven n8n workflows.</w:t>
       </w:r>
     </w:p>
     <w:tbl>
@@ -2058,18 +1693,18 @@
         </w:tblBorders>
       </w:tblPr>
       <w:tblGrid>
-        <w:gridCol w:w="10512"/>
+        <w:gridCol w:w="10800"/>
       </w:tblGrid>
       <w:tr>
         <w:tc>
           <w:tcPr>
-            <w:tcW w:type="dxa" w:w="10512"/>
+            <w:tcW w:type="dxa" w:w="10800"/>
             <w:shd w:val="clear" w:color="auto" w:fill="0EA5E9"/>
             <w:tcMar>
-              <w:top w:w="30" w:type="dxa"/>
-              <w:bottom w:w="30" w:type="dxa"/>
-              <w:start w:w="110" w:type="dxa"/>
-              <w:end w:w="110" w:type="dxa"/>
+              <w:top w:w="8" w:type="dxa"/>
+              <w:bottom w:w="8" w:type="dxa"/>
+              <w:start w:w="100" w:type="dxa"/>
+              <w:end w:w="100" w:type="dxa"/>
             </w:tcMar>
           </w:tcPr>
           <w:p>
@@ -2078,11 +1713,207 @@
             </w:pPr>
             <w:r>
               <w:rPr>
-                <w:rFonts w:ascii="Calibri" w:hAnsi="Calibri"/>
+                <w:rFonts w:ascii="Times New Roman" w:hAnsi="Times New Roman"/>
                 <w:b/>
                 <w:i w:val="0"/>
                 <w:color w:val="FFFFFF"/>
-                <w:sz w:val="22"/>
+                <w:sz w:val="20"/>
+              </w:rPr>
+              <w:t>CERTIFICATIONS</w:t>
+            </w:r>
+          </w:p>
+        </w:tc>
+      </w:tr>
+    </w:tbl>
+    <w:p>
+      <w:pPr>
+        <w:spacing w:before="0" w:after="20" w:lineRule="exact" w:line="60"/>
+      </w:pPr>
+    </w:p>
+    <w:p>
+      <w:pPr>
+        <w:spacing w:before="0" w:after="20" w:lineRule="exact" w:line="206"/>
+        <w:ind w:left="317" w:hanging="202"/>
+      </w:pPr>
+      <w:r>
+        <w:rPr>
+          <w:rFonts w:ascii="Times New Roman" w:hAnsi="Times New Roman"/>
+          <w:b/>
+          <w:i w:val="0"/>
+          <w:color w:val="0369A1"/>
+          <w:sz w:val="18"/>
+        </w:rPr>
+        <w:t xml:space="preserve">•  </w:t>
+      </w:r>
+      <w:r>
+        <w:rPr>
+          <w:rFonts w:ascii="Times New Roman" w:hAnsi="Times New Roman"/>
+          <w:b/>
+          <w:i w:val="0"/>
+          <w:color w:val="1A1A1A"/>
+          <w:sz w:val="18"/>
+        </w:rPr>
+        <w:t xml:space="preserve">100 Days of Code: The Complete Python Pro Bootcamp </w:t>
+      </w:r>
+      <w:r>
+        <w:rPr>
+          <w:rFonts w:ascii="Times New Roman" w:hAnsi="Times New Roman"/>
+          <w:b w:val="0"/>
+          <w:i w:val="0"/>
+          <w:color w:val="333333"/>
+          <w:sz w:val="17"/>
+        </w:rPr>
+        <w:t>– Dr. Angela Yu, Udemy</w:t>
+      </w:r>
+    </w:p>
+    <w:p>
+      <w:pPr>
+        <w:spacing w:before="0" w:after="20" w:lineRule="exact" w:line="206"/>
+        <w:ind w:left="317" w:hanging="202"/>
+      </w:pPr>
+      <w:r>
+        <w:rPr>
+          <w:rFonts w:ascii="Times New Roman" w:hAnsi="Times New Roman"/>
+          <w:b/>
+          <w:i w:val="0"/>
+          <w:color w:val="0369A1"/>
+          <w:sz w:val="18"/>
+        </w:rPr>
+        <w:t xml:space="preserve">•  </w:t>
+      </w:r>
+      <w:r>
+        <w:rPr>
+          <w:rFonts w:ascii="Times New Roman" w:hAnsi="Times New Roman"/>
+          <w:b/>
+          <w:i w:val="0"/>
+          <w:color w:val="1A1A1A"/>
+          <w:sz w:val="18"/>
+        </w:rPr>
+        <w:t xml:space="preserve">Full Stack Generative &amp; Agentic AI with Python </w:t>
+      </w:r>
+      <w:r>
+        <w:rPr>
+          <w:rFonts w:ascii="Times New Roman" w:hAnsi="Times New Roman"/>
+          <w:b w:val="0"/>
+          <w:i w:val="0"/>
+          <w:color w:val="333333"/>
+          <w:sz w:val="17"/>
+        </w:rPr>
+        <w:t>– Hitesh Choudhary, Udemy</w:t>
+      </w:r>
+    </w:p>
+    <w:p>
+      <w:pPr>
+        <w:spacing w:before="0" w:after="20" w:lineRule="exact" w:line="206"/>
+        <w:ind w:left="317" w:hanging="202"/>
+      </w:pPr>
+      <w:r>
+        <w:rPr>
+          <w:rFonts w:ascii="Times New Roman" w:hAnsi="Times New Roman"/>
+          <w:b/>
+          <w:i w:val="0"/>
+          <w:color w:val="0369A1"/>
+          <w:sz w:val="18"/>
+        </w:rPr>
+        <w:t xml:space="preserve">•  </w:t>
+      </w:r>
+      <w:r>
+        <w:rPr>
+          <w:rFonts w:ascii="Times New Roman" w:hAnsi="Times New Roman"/>
+          <w:b/>
+          <w:i w:val="0"/>
+          <w:color w:val="1A1A1A"/>
+          <w:sz w:val="18"/>
+        </w:rPr>
+        <w:t xml:space="preserve">Complete Web Development Course </w:t>
+      </w:r>
+      <w:r>
+        <w:rPr>
+          <w:rFonts w:ascii="Times New Roman" w:hAnsi="Times New Roman"/>
+          <w:b w:val="0"/>
+          <w:i w:val="0"/>
+          <w:color w:val="333333"/>
+          <w:sz w:val="17"/>
+        </w:rPr>
+        <w:t>– Hitesh Choudhary, Udemy</w:t>
+      </w:r>
+    </w:p>
+    <w:p>
+      <w:pPr>
+        <w:spacing w:before="0" w:after="20" w:lineRule="exact" w:line="206"/>
+        <w:ind w:left="317" w:hanging="202"/>
+      </w:pPr>
+      <w:r>
+        <w:rPr>
+          <w:rFonts w:ascii="Times New Roman" w:hAnsi="Times New Roman"/>
+          <w:b/>
+          <w:i w:val="0"/>
+          <w:color w:val="0369A1"/>
+          <w:sz w:val="18"/>
+        </w:rPr>
+        <w:t xml:space="preserve">•  </w:t>
+      </w:r>
+      <w:r>
+        <w:rPr>
+          <w:rFonts w:ascii="Times New Roman" w:hAnsi="Times New Roman"/>
+          <w:b/>
+          <w:i w:val="0"/>
+          <w:color w:val="1A1A1A"/>
+          <w:sz w:val="18"/>
+        </w:rPr>
+        <w:t xml:space="preserve">DEMA: Drone Engineering, Mechanics &amp; Applications Bootcamp </w:t>
+      </w:r>
+      <w:r>
+        <w:rPr>
+          <w:rFonts w:ascii="Times New Roman" w:hAnsi="Times New Roman"/>
+          <w:b w:val="0"/>
+          <w:i w:val="0"/>
+          <w:color w:val="333333"/>
+          <w:sz w:val="17"/>
+        </w:rPr>
+        <w:t>– NIT Jalandhar &amp; CCET (MeitY, Govt. of India) – UAV &amp; embedded systems; scored 27/30</w:t>
+      </w:r>
+    </w:p>
+    <w:tbl>
+      <w:tblPr>
+        <w:tblW w:type="auto" w:w="0"/>
+        <w:jc w:val="center"/>
+        <w:tblLook w:firstColumn="1" w:firstRow="1" w:lastColumn="0" w:lastRow="0" w:noHBand="0" w:noVBand="1" w:val="04A0"/>
+        <w:tblBorders>
+          <w:top w:val="none" w:sz="0"/>
+          <w:left w:val="none" w:sz="0"/>
+          <w:bottom w:val="none" w:sz="0"/>
+          <w:right w:val="none" w:sz="0"/>
+          <w:insideH w:val="none" w:sz="0"/>
+          <w:insideV w:val="none" w:sz="0"/>
+        </w:tblBorders>
+      </w:tblPr>
+      <w:tblGrid>
+        <w:gridCol w:w="10800"/>
+      </w:tblGrid>
+      <w:tr>
+        <w:tc>
+          <w:tcPr>
+            <w:tcW w:type="dxa" w:w="10800"/>
+            <w:shd w:val="clear" w:color="auto" w:fill="0EA5E9"/>
+            <w:tcMar>
+              <w:top w:w="8" w:type="dxa"/>
+              <w:bottom w:w="8" w:type="dxa"/>
+              <w:start w:w="100" w:type="dxa"/>
+              <w:end w:w="100" w:type="dxa"/>
+            </w:tcMar>
+          </w:tcPr>
+          <w:p>
+            <w:pPr>
+              <w:spacing w:before="0" w:after="0" w:line="240" w:lineRule="auto"/>
+            </w:pPr>
+            <w:r>
+              <w:rPr>
+                <w:rFonts w:ascii="Times New Roman" w:hAnsi="Times New Roman"/>
+                <w:b/>
+                <w:i w:val="0"/>
+                <w:color w:val="FFFFFF"/>
+                <w:sz w:val="20"/>
               </w:rPr>
               <w:t>ACHIEVEMENTS</w:t>
             </w:r>
@@ -2092,83 +1923,83 @@
     </w:tbl>
     <w:p>
       <w:pPr>
-        <w:spacing w:before="0" w:after="40" w:line="240" w:lineRule="auto"/>
+        <w:spacing w:before="0" w:after="20" w:lineRule="exact" w:line="60"/>
       </w:pPr>
     </w:p>
     <w:p>
       <w:pPr>
-        <w:spacing w:before="0" w:after="50" w:line="254" w:lineRule="auto"/>
-        <w:ind w:left="403" w:hanging="230"/>
+        <w:spacing w:before="0" w:after="20" w:lineRule="exact" w:line="206"/>
+        <w:ind w:left="317" w:hanging="202"/>
       </w:pPr>
       <w:r>
         <w:rPr>
-          <w:rFonts w:ascii="Calibri" w:hAnsi="Calibri"/>
+          <w:rFonts w:ascii="Times New Roman" w:hAnsi="Times New Roman"/>
           <w:b/>
           <w:i w:val="0"/>
-          <w:color w:val="0EA5E9"/>
-          <w:sz w:val="21"/>
+          <w:color w:val="0369A1"/>
+          <w:sz w:val="18"/>
         </w:rPr>
         <w:t xml:space="preserve">•  </w:t>
       </w:r>
       <w:r>
         <w:rPr>
-          <w:rFonts w:ascii="Calibri" w:hAnsi="Calibri"/>
+          <w:rFonts w:ascii="Times New Roman" w:hAnsi="Times New Roman"/>
           <w:b w:val="0"/>
           <w:i w:val="0"/>
-          <w:color w:val="4B5563"/>
-          <w:sz w:val="21"/>
+          <w:color w:val="333333"/>
+          <w:sz w:val="18"/>
         </w:rPr>
         <w:t>Qualified the GATE Computer Science examination while pursuing a B.E. in Electronics &amp; Communication Engineering.</w:t>
       </w:r>
     </w:p>
     <w:p>
       <w:pPr>
-        <w:spacing w:before="0" w:after="50" w:line="254" w:lineRule="auto"/>
-        <w:ind w:left="403" w:hanging="230"/>
+        <w:spacing w:before="0" w:after="20" w:lineRule="exact" w:line="206"/>
+        <w:ind w:left="317" w:hanging="202"/>
       </w:pPr>
       <w:r>
         <w:rPr>
-          <w:rFonts w:ascii="Calibri" w:hAnsi="Calibri"/>
+          <w:rFonts w:ascii="Times New Roman" w:hAnsi="Times New Roman"/>
           <w:b/>
           <w:i w:val="0"/>
-          <w:color w:val="0EA5E9"/>
-          <w:sz w:val="21"/>
+          <w:color w:val="0369A1"/>
+          <w:sz w:val="18"/>
         </w:rPr>
         <w:t xml:space="preserve">•  </w:t>
       </w:r>
       <w:r>
         <w:rPr>
-          <w:rFonts w:ascii="Calibri" w:hAnsi="Calibri"/>
+          <w:rFonts w:ascii="Times New Roman" w:hAnsi="Times New Roman"/>
           <w:b w:val="0"/>
           <w:i w:val="0"/>
-          <w:color w:val="4B5563"/>
-          <w:sz w:val="21"/>
+          <w:color w:val="333333"/>
+          <w:sz w:val="18"/>
         </w:rPr>
         <w:t>Solved 170+ Data Structures &amp; Algorithms problems on GeeksforGeeks, ranking 16th on the institute leaderboard.</w:t>
       </w:r>
     </w:p>
     <w:p>
       <w:pPr>
-        <w:spacing w:before="0" w:after="50" w:line="254" w:lineRule="auto"/>
-        <w:ind w:left="403" w:hanging="230"/>
+        <w:spacing w:before="0" w:after="20" w:lineRule="exact" w:line="206"/>
+        <w:ind w:left="317" w:hanging="202"/>
       </w:pPr>
       <w:r>
         <w:rPr>
-          <w:rFonts w:ascii="Calibri" w:hAnsi="Calibri"/>
+          <w:rFonts w:ascii="Times New Roman" w:hAnsi="Times New Roman"/>
           <w:b/>
           <w:i w:val="0"/>
-          <w:color w:val="0EA5E9"/>
-          <w:sz w:val="21"/>
+          <w:color w:val="0369A1"/>
+          <w:sz w:val="18"/>
         </w:rPr>
         <w:t xml:space="preserve">•  </w:t>
       </w:r>
       <w:r>
         <w:rPr>
-          <w:rFonts w:ascii="Calibri" w:hAnsi="Calibri"/>
+          <w:rFonts w:ascii="Times New Roman" w:hAnsi="Times New Roman"/>
           <w:b w:val="0"/>
           <w:i w:val="0"/>
-          <w:color w:val="4B5563"/>
-          <w:sz w:val="21"/>
+          <w:color w:val="333333"/>
+          <w:sz w:val="18"/>
         </w:rPr>
         <w:t>Built an AI-powered mental wellness application with a team of two at the Hackfinity 2025 Hackathon.</w:t>
       </w:r>
@@ -2188,18 +2019,18 @@
         </w:tblBorders>
       </w:tblPr>
       <w:tblGrid>
-        <w:gridCol w:w="10512"/>
+        <w:gridCol w:w="10800"/>
       </w:tblGrid>
       <w:tr>
         <w:tc>
           <w:tcPr>
-            <w:tcW w:type="dxa" w:w="10512"/>
+            <w:tcW w:type="dxa" w:w="10800"/>
             <w:shd w:val="clear" w:color="auto" w:fill="0EA5E9"/>
             <w:tcMar>
-              <w:top w:w="30" w:type="dxa"/>
-              <w:bottom w:w="30" w:type="dxa"/>
-              <w:start w:w="110" w:type="dxa"/>
-              <w:end w:w="110" w:type="dxa"/>
+              <w:top w:w="8" w:type="dxa"/>
+              <w:bottom w:w="8" w:type="dxa"/>
+              <w:start w:w="100" w:type="dxa"/>
+              <w:end w:w="100" w:type="dxa"/>
             </w:tcMar>
           </w:tcPr>
           <w:p>
@@ -2208,13 +2039,13 @@
             </w:pPr>
             <w:r>
               <w:rPr>
-                <w:rFonts w:ascii="Calibri" w:hAnsi="Calibri"/>
+                <w:rFonts w:ascii="Times New Roman" w:hAnsi="Times New Roman"/>
                 <w:b/>
                 <w:i w:val="0"/>
                 <w:color w:val="FFFFFF"/>
-                <w:sz w:val="22"/>
+                <w:sz w:val="20"/>
               </w:rPr>
-              <w:t>TECHNICAL INTERESTS</w:t>
+              <w:t>TECHNICAL INTERESTS &amp; ADDITIONAL INFORMATION</w:t>
             </w:r>
           </w:p>
         </w:tc>
@@ -2222,132 +2053,90 @@
     </w:tbl>
     <w:p>
       <w:pPr>
-        <w:spacing w:before="0" w:after="40" w:line="240" w:lineRule="auto"/>
+        <w:spacing w:before="0" w:after="20" w:lineRule="exact" w:line="60"/>
       </w:pPr>
     </w:p>
     <w:p>
       <w:pPr>
-        <w:spacing w:before="0" w:after="40" w:line="269" w:lineRule="auto"/>
-        <w:ind w:left="144"/>
+        <w:spacing w:before="0" w:after="20" w:lineRule="exact" w:line="206"/>
+        <w:ind w:left="72"/>
       </w:pPr>
       <w:r>
         <w:rPr>
-          <w:rFonts w:ascii="Calibri" w:hAnsi="Calibri"/>
-          <w:b w:val="0"/>
-          <w:i w:val="0"/>
-          <w:color w:val="4B5563"/>
-          <w:sz w:val="20"/>
-        </w:rPr>
-        <w:t>Generative AI  •  AI Automation  •  Agentic AI  •  Backend System Design</w:t>
-      </w:r>
-    </w:p>
-    <w:tbl>
-      <w:tblPr>
-        <w:tblW w:type="auto" w:w="0"/>
-        <w:jc w:val="center"/>
-        <w:tblLook w:firstColumn="1" w:firstRow="1" w:lastColumn="0" w:lastRow="0" w:noHBand="0" w:noVBand="1" w:val="04A0"/>
-        <w:tblBorders>
-          <w:top w:val="none" w:sz="0"/>
-          <w:left w:val="none" w:sz="0"/>
-          <w:bottom w:val="none" w:sz="0"/>
-          <w:right w:val="none" w:sz="0"/>
-          <w:insideH w:val="none" w:sz="0"/>
-          <w:insideV w:val="none" w:sz="0"/>
-        </w:tblBorders>
-      </w:tblPr>
-      <w:tblGrid>
-        <w:gridCol w:w="10512"/>
-      </w:tblGrid>
-      <w:tr>
-        <w:tc>
-          <w:tcPr>
-            <w:tcW w:type="dxa" w:w="10512"/>
-            <w:shd w:val="clear" w:color="auto" w:fill="0EA5E9"/>
-            <w:tcMar>
-              <w:top w:w="30" w:type="dxa"/>
-              <w:bottom w:w="30" w:type="dxa"/>
-              <w:start w:w="110" w:type="dxa"/>
-              <w:end w:w="110" w:type="dxa"/>
-            </w:tcMar>
-          </w:tcPr>
-          <w:p>
-            <w:pPr>
-              <w:spacing w:before="0" w:after="0" w:line="240" w:lineRule="auto"/>
-            </w:pPr>
-            <w:r>
-              <w:rPr>
-                <w:rFonts w:ascii="Calibri" w:hAnsi="Calibri"/>
-                <w:b/>
-                <w:i w:val="0"/>
-                <w:color w:val="FFFFFF"/>
-                <w:sz w:val="22"/>
-              </w:rPr>
-              <w:t>EXTRA-CURRICULAR &amp; LANGUAGES</w:t>
-            </w:r>
-          </w:p>
-        </w:tc>
-      </w:tr>
-    </w:tbl>
-    <w:p>
-      <w:pPr>
-        <w:spacing w:before="0" w:after="40" w:line="240" w:lineRule="auto"/>
-      </w:pPr>
-    </w:p>
-    <w:p>
-      <w:pPr>
-        <w:spacing w:before="0" w:after="60" w:line="269" w:lineRule="auto"/>
-        <w:ind w:left="144"/>
-      </w:pPr>
-      <w:r>
-        <w:rPr>
-          <w:rFonts w:ascii="Calibri" w:hAnsi="Calibri"/>
+          <w:rFonts w:ascii="Times New Roman" w:hAnsi="Times New Roman"/>
           <w:b/>
           <w:i w:val="0"/>
           <w:color w:val="0369A1"/>
-          <w:sz w:val="20"/>
+          <w:sz w:val="18"/>
         </w:rPr>
-        <w:t xml:space="preserve">Interests: </w:t>
+        <w:t xml:space="preserve">Technical Interests:  </w:t>
       </w:r>
       <w:r>
         <w:rPr>
-          <w:rFonts w:ascii="Calibri" w:hAnsi="Calibri"/>
+          <w:rFonts w:ascii="Times New Roman" w:hAnsi="Times New Roman"/>
           <w:b w:val="0"/>
           <w:i w:val="0"/>
-          <w:color w:val="4B5563"/>
-          <w:sz w:val="20"/>
+          <w:color w:val="333333"/>
+          <w:sz w:val="18"/>
         </w:rPr>
-        <w:t>Chess  •  Space &amp; Astronomy</w:t>
+        <w:t>Generative AI, AI Automation, Agentic AI, Backend System Design</w:t>
       </w:r>
     </w:p>
     <w:p>
       <w:pPr>
-        <w:spacing w:before="0" w:after="40" w:line="269" w:lineRule="auto"/>
-        <w:ind w:left="144"/>
+        <w:spacing w:before="0" w:after="20" w:lineRule="exact" w:line="206"/>
+        <w:ind w:left="72"/>
       </w:pPr>
       <w:r>
         <w:rPr>
-          <w:rFonts w:ascii="Calibri" w:hAnsi="Calibri"/>
+          <w:rFonts w:ascii="Times New Roman" w:hAnsi="Times New Roman"/>
           <w:b/>
           <w:i w:val="0"/>
           <w:color w:val="0369A1"/>
-          <w:sz w:val="20"/>
+          <w:sz w:val="18"/>
         </w:rPr>
-        <w:t xml:space="preserve">Languages: </w:t>
+        <w:t xml:space="preserve">Extra-Curricular:  </w:t>
       </w:r>
       <w:r>
         <w:rPr>
-          <w:rFonts w:ascii="Calibri" w:hAnsi="Calibri"/>
+          <w:rFonts w:ascii="Times New Roman" w:hAnsi="Times New Roman"/>
           <w:b w:val="0"/>
           <w:i w:val="0"/>
-          <w:color w:val="4B5563"/>
-          <w:sz w:val="20"/>
+          <w:color w:val="333333"/>
+          <w:sz w:val="18"/>
         </w:rPr>
-        <w:t>English  •  Hindi  •  German (Beginner)</w:t>
+        <w:t>Chess, Space &amp; Astronomy</w:t>
+      </w:r>
+    </w:p>
+    <w:p>
+      <w:pPr>
+        <w:spacing w:before="0" w:after="20" w:lineRule="exact" w:line="206"/>
+        <w:ind w:left="72"/>
+      </w:pPr>
+      <w:r>
+        <w:rPr>
+          <w:rFonts w:ascii="Times New Roman" w:hAnsi="Times New Roman"/>
+          <w:b/>
+          <w:i w:val="0"/>
+          <w:color w:val="0369A1"/>
+          <w:sz w:val="18"/>
+        </w:rPr>
+        <w:t xml:space="preserve">Languages:  </w:t>
+      </w:r>
+      <w:r>
+        <w:rPr>
+          <w:rFonts w:ascii="Times New Roman" w:hAnsi="Times New Roman"/>
+          <w:b w:val="0"/>
+          <w:i w:val="0"/>
+          <w:color w:val="333333"/>
+          <w:sz w:val="18"/>
+        </w:rPr>
+        <w:t>English, Hindi, German (Beginner)</w:t>
       </w:r>
     </w:p>
     <w:sectPr>
       <w:pgSz w:w="12240" w:h="15840"/>
-      <w:pgMar w:top="720" w:right="864" w:bottom="720" w:left="864" w:header="720" w:footer="720" w:gutter="0"/>
+      <w:pgMar w:top="576" w:right="720" w:bottom="576" w:left="720" w:header="720" w:footer="720" w:gutter="0"/>
       <w:cols w:space="720"/>
       <w:docGrid w:linePitch="360"/>
     </w:sectPr>
@@ -2719,12 +2508,12 @@
     <w:qFormat/>
     <w:rsid w:val="00FC693F"/>
     <w:pPr>
-      <w:spacing w:after="0" w:line="254" w:lineRule="auto"/>
+      <w:spacing w:after="0" w:line="240" w:lineRule="auto"/>
     </w:pPr>
     <w:rPr>
-      <w:rFonts w:ascii="Calibri" w:hAnsi="Calibri"/>
-      <w:color w:val="1F2937"/>
-      <w:sz w:val="21"/>
+      <w:rFonts w:ascii="Times New Roman" w:hAnsi="Times New Roman"/>
+      <w:color w:val="1A1A1A"/>
+      <w:sz w:val="18"/>
     </w:rPr>
   </w:style>
   <w:style w:type="paragraph" w:styleId="Header">

</xml_diff>

<commit_message>
Move CCET logo to right of contact info; adopt latest content edits
- Header reordered: identity | contact | logo (logo now far right)
- Update summary and project descriptions to match latest edited content
- NyayaSim and Smart Glasses expanded to 3 bullets; News stack trimmed to OpenAI API
- Achievements reduced to GATE + GfG (removed hackathon bullet)
</commit_message>
<xml_diff>
--- a/Rahul_Chaudhary_Resume.docx
+++ b/Rahul_Chaudhary_Resume.docx
@@ -17,72 +17,20 @@
         </w:tblBorders>
       </w:tblPr>
       <w:tblGrid>
-        <w:gridCol w:w="1512"/>
-        <w:gridCol w:w="6264"/>
-        <w:gridCol w:w="3024"/>
+        <w:gridCol w:w="5616"/>
+        <w:gridCol w:w="3528"/>
+        <w:gridCol w:w="1656"/>
       </w:tblGrid>
       <w:tr>
         <w:tc>
           <w:tcPr>
-            <w:tcW w:type="dxa" w:w="1512"/>
+            <w:tcW w:type="dxa" w:w="5616"/>
             <w:vAlign w:val="center"/>
             <w:tcMar>
               <w:top w:w="0" w:type="dxa"/>
               <w:bottom w:w="0" w:type="dxa"/>
               <w:start w:w="0" w:type="dxa"/>
-              <w:end w:w="40" w:type="dxa"/>
-            </w:tcMar>
-          </w:tcPr>
-          <w:p>
-            <w:pPr>
-              <w:spacing w:before="0" w:after="0" w:line="240" w:lineRule="auto"/>
-              <w:jc w:val="left"/>
-            </w:pPr>
-            <w:r>
-              <w:drawing>
-                <wp:inline xmlns:a="http://schemas.openxmlformats.org/drawingml/2006/main" xmlns:pic="http://schemas.openxmlformats.org/drawingml/2006/picture">
-                  <wp:extent cx="868680" cy="844861"/>
-                  <wp:docPr id="1" name="Picture 1"/>
-                  <wp:cNvGraphicFramePr>
-                    <a:graphicFrameLocks noChangeAspect="1"/>
-                  </wp:cNvGraphicFramePr>
-                  <a:graphic>
-                    <a:graphicData uri="http://schemas.openxmlformats.org/drawingml/2006/picture">
-                      <pic:pic>
-                        <pic:nvPicPr>
-                          <pic:cNvPr id="0" name="ccet_logo.png"/>
-                          <pic:cNvPicPr/>
-                        </pic:nvPicPr>
-                        <pic:blipFill>
-                          <a:blip r:embed="rId9"/>
-                          <a:stretch>
-                            <a:fillRect/>
-                          </a:stretch>
-                        </pic:blipFill>
-                        <pic:spPr>
-                          <a:xfrm>
-                            <a:off x="0" y="0"/>
-                            <a:ext cx="868680" cy="844861"/>
-                          </a:xfrm>
-                          <a:prstGeom prst="rect"/>
-                        </pic:spPr>
-                      </pic:pic>
-                    </a:graphicData>
-                  </a:graphic>
-                </wp:inline>
-              </w:drawing>
-            </w:r>
-          </w:p>
-        </w:tc>
-        <w:tc>
-          <w:tcPr>
-            <w:tcW w:type="dxa" w:w="6264"/>
-            <w:vAlign w:val="center"/>
-            <w:tcMar>
-              <w:top w:w="0" w:type="dxa"/>
-              <w:bottom w:w="0" w:type="dxa"/>
-              <w:start w:w="60" w:type="dxa"/>
-              <w:end w:w="60" w:type="dxa"/>
+              <w:end w:w="50" w:type="dxa"/>
             </w:tcMar>
           </w:tcPr>
           <w:p>
@@ -148,13 +96,13 @@
         </w:tc>
         <w:tc>
           <w:tcPr>
-            <w:tcW w:type="dxa" w:w="3024"/>
+            <w:tcW w:type="dxa" w:w="3528"/>
             <w:vAlign w:val="center"/>
             <w:tcMar>
               <w:top w:w="0" w:type="dxa"/>
               <w:bottom w:w="0" w:type="dxa"/>
               <w:start w:w="40" w:type="dxa"/>
-              <w:end w:w="0" w:type="dxa"/>
+              <w:end w:w="40" w:type="dxa"/>
             </w:tcMar>
           </w:tcPr>
           <w:p>
@@ -280,6 +228,58 @@
                 <w:sz w:val="16"/>
               </w:rPr>
               <w:t>Chandigarh, India</w:t>
+            </w:r>
+          </w:p>
+        </w:tc>
+        <w:tc>
+          <w:tcPr>
+            <w:tcW w:type="dxa" w:w="1656"/>
+            <w:vAlign w:val="center"/>
+            <w:tcMar>
+              <w:top w:w="0" w:type="dxa"/>
+              <w:bottom w:w="0" w:type="dxa"/>
+              <w:start w:w="40" w:type="dxa"/>
+              <w:end w:w="0" w:type="dxa"/>
+            </w:tcMar>
+          </w:tcPr>
+          <w:p>
+            <w:pPr>
+              <w:spacing w:before="0" w:after="0" w:line="240" w:lineRule="auto"/>
+              <w:jc w:val="right"/>
+            </w:pPr>
+            <w:r>
+              <w:drawing>
+                <wp:inline xmlns:a="http://schemas.openxmlformats.org/drawingml/2006/main" xmlns:pic="http://schemas.openxmlformats.org/drawingml/2006/picture">
+                  <wp:extent cx="914400" cy="889328"/>
+                  <wp:docPr id="1" name="Picture 1"/>
+                  <wp:cNvGraphicFramePr>
+                    <a:graphicFrameLocks noChangeAspect="1"/>
+                  </wp:cNvGraphicFramePr>
+                  <a:graphic>
+                    <a:graphicData uri="http://schemas.openxmlformats.org/drawingml/2006/picture">
+                      <pic:pic>
+                        <pic:nvPicPr>
+                          <pic:cNvPr id="0" name="ccet_logo.png"/>
+                          <pic:cNvPicPr/>
+                        </pic:nvPicPr>
+                        <pic:blipFill>
+                          <a:blip r:embed="rId9"/>
+                          <a:stretch>
+                            <a:fillRect/>
+                          </a:stretch>
+                        </pic:blipFill>
+                        <pic:spPr>
+                          <a:xfrm>
+                            <a:off x="0" y="0"/>
+                            <a:ext cx="914400" cy="889328"/>
+                          </a:xfrm>
+                          <a:prstGeom prst="rect"/>
+                        </pic:spPr>
+                      </pic:pic>
+                    </a:graphicData>
+                  </a:graphic>
+                </wp:inline>
+              </w:drawing>
             </w:r>
           </w:p>
         </w:tc>
@@ -903,7 +903,7 @@
           <w:color w:val="333333"/>
           <w:sz w:val="18"/>
         </w:rPr>
-        <w:t>Generative AI Engineer and Full Stack Developer who builds complete AI-powered products end to end. Skilled in LLM applications, RAG pipelines, and agentic AI workflows with the OpenAI and Gemini APIs, plus production-ready React and Node.js platforms with secure authentication and scalable REST APIs. Focused on backend engineering, AI automation, and reliable systems that solve real-world problems.</w:t>
+        <w:t>Generative AI Engineer and Full Stack Developer specialising in the design and development of intelligent, scalable software solutions. Experienced in building AI-driven applications, LLM-powered systems, RAG architectures, and agentic workflows, combined with robust full-stack platforms and backend services. Skilled in developing secure, high-performance applications with a focus on automation, system reliability, and solving complex real-world problems through emerging technologies.</w:t>
       </w:r>
     </w:p>
     <w:tbl>
@@ -1340,7 +1340,7 @@
           <w:color w:val="333333"/>
           <w:sz w:val="18"/>
         </w:rPr>
-        <w:t>Architected an AI courtroom using Generative and Agentic AI to simulate judges, witnesses, and legal arguments, with secure authentication, case management, and digital evidence modules.</w:t>
+        <w:t>Built an AI-powered virtual courtroom platform that enables law students to practice real-world litigation through interactive trial simulations.</w:t>
       </w:r>
     </w:p>
     <w:p>
@@ -1366,7 +1366,33 @@
           <w:color w:val="333333"/>
           <w:sz w:val="18"/>
         </w:rPr>
-        <w:t>Designed scalable REST APIs following Clean Architecture and SOLID principles for maintainable backend services.</w:t>
+        <w:t>Developed intelligent courtroom participants, including AI judges, advocates, and witnesses, along with case management, evidence handling, and legal document drafting workflows.</w:t>
+      </w:r>
+    </w:p>
+    <w:p>
+      <w:pPr>
+        <w:spacing w:before="0" w:after="20" w:lineRule="exact" w:line="206"/>
+        <w:ind w:left="317" w:hanging="202"/>
+      </w:pPr>
+      <w:r>
+        <w:rPr>
+          <w:rFonts w:ascii="Times New Roman" w:hAnsi="Times New Roman"/>
+          <w:b/>
+          <w:i w:val="0"/>
+          <w:color w:val="0369A1"/>
+          <w:sz w:val="18"/>
+        </w:rPr>
+        <w:t xml:space="preserve">•  </w:t>
+      </w:r>
+      <w:r>
+        <w:rPr>
+          <w:rFonts w:ascii="Times New Roman" w:hAnsi="Times New Roman"/>
+          <w:b w:val="0"/>
+          <w:i w:val="0"/>
+          <w:color w:val="333333"/>
+          <w:sz w:val="18"/>
+        </w:rPr>
+        <w:t>Designed a scalable full-stack architecture to bridge the gap between classroom legal education and practical courtroom advocacy using modern AI technologies.</w:t>
       </w:r>
     </w:p>
     <w:p>
@@ -1443,7 +1469,7 @@
           <w:color w:val="333333"/>
           <w:sz w:val="18"/>
         </w:rPr>
-        <w:t>Built a real-time YOLO object-detection pipeline on Raspberry Pi for obstacle detection, optimized for low-latency inference on a resource-constrained edge device.</w:t>
+        <w:t>Developed AI-powered smart glasses designed to assist visually impaired individuals by providing real-time object detection and environmental awareness.</w:t>
       </w:r>
     </w:p>
     <w:p>
@@ -1469,7 +1495,33 @@
           <w:color w:val="333333"/>
           <w:sz w:val="18"/>
         </w:rPr>
-        <w:t>Implemented voice guidance that converts detections into spoken cues, enabling hands-free assistive navigation.</w:t>
+        <w:t>Integrated embedded hardware including Raspberry Pi, camera modules, sensors, and audio feedback systems with computer vision models for intelligent assistance.</w:t>
+      </w:r>
+    </w:p>
+    <w:p>
+      <w:pPr>
+        <w:spacing w:before="0" w:after="20" w:lineRule="exact" w:line="206"/>
+        <w:ind w:left="317" w:hanging="202"/>
+      </w:pPr>
+      <w:r>
+        <w:rPr>
+          <w:rFonts w:ascii="Times New Roman" w:hAnsi="Times New Roman"/>
+          <w:b/>
+          <w:i w:val="0"/>
+          <w:color w:val="0369A1"/>
+          <w:sz w:val="18"/>
+        </w:rPr>
+        <w:t xml:space="preserve">•  </w:t>
+      </w:r>
+      <w:r>
+        <w:rPr>
+          <w:rFonts w:ascii="Times New Roman" w:hAnsi="Times New Roman"/>
+          <w:b w:val="0"/>
+          <w:i w:val="0"/>
+          <w:color w:val="333333"/>
+          <w:sz w:val="18"/>
+        </w:rPr>
+        <w:t>Built an edge AI pipeline capable of processing visual information and delivering real-time voice-based insights to improve user independence and accessibility.</w:t>
       </w:r>
     </w:p>
     <w:p>
@@ -1546,7 +1598,7 @@
           <w:color w:val="333333"/>
           <w:sz w:val="18"/>
         </w:rPr>
-        <w:t>Developed a full-stack community platform with secure authentication, user profiles, and deal management backed by scalable REST APIs.</w:t>
+        <w:t>Built an AI-powered e-commerce platform that aggregates products from multiple online retailers, enabling users to compare prices and discover the best deals.</w:t>
       </w:r>
     </w:p>
     <w:p>
@@ -1572,7 +1624,7 @@
           <w:color w:val="333333"/>
           <w:sz w:val="18"/>
         </w:rPr>
-        <w:t>Integrated AI-powered personalized deal recommendations and a responsive UI for a seamless user experience.</w:t>
+        <w:t>Implemented intelligent search, personalized product recommendations, and real-time deal discovery to enhance the shopping experience.</w:t>
       </w:r>
     </w:p>
     <w:p>
@@ -1623,7 +1675,7 @@
           <w:color w:val="333333"/>
           <w:sz w:val="16"/>
         </w:rPr>
-        <w:t>Python, n8n, Telegram Bot API, OpenAI API, Gemini API</w:t>
+        <w:t>Python, n8n, Telegram Bot API, OpenAI API</w:t>
       </w:r>
     </w:p>
     <w:p>
@@ -1978,32 +2030,6 @@
         <w:t>Solved 170+ Data Structures &amp; Algorithms problems on GeeksforGeeks, ranking 16th on the institute leaderboard.</w:t>
       </w:r>
     </w:p>
-    <w:p>
-      <w:pPr>
-        <w:spacing w:before="0" w:after="20" w:lineRule="exact" w:line="206"/>
-        <w:ind w:left="317" w:hanging="202"/>
-      </w:pPr>
-      <w:r>
-        <w:rPr>
-          <w:rFonts w:ascii="Times New Roman" w:hAnsi="Times New Roman"/>
-          <w:b/>
-          <w:i w:val="0"/>
-          <w:color w:val="0369A1"/>
-          <w:sz w:val="18"/>
-        </w:rPr>
-        <w:t xml:space="preserve">•  </w:t>
-      </w:r>
-      <w:r>
-        <w:rPr>
-          <w:rFonts w:ascii="Times New Roman" w:hAnsi="Times New Roman"/>
-          <w:b w:val="0"/>
-          <w:i w:val="0"/>
-          <w:color w:val="333333"/>
-          <w:sz w:val="18"/>
-        </w:rPr>
-        <w:t>Built an AI-powered mental wellness application with a team of two at the Hackfinity 2025 Hackathon.</w:t>
-      </w:r>
-    </w:p>
     <w:tbl>
       <w:tblPr>
         <w:tblW w:type="auto" w:w="0"/>

</xml_diff>

<commit_message>
Reformat Rahul's resume to match Madhu's template style
- Gray section bars with black bold text (was sky-blue with white text)
- Education table: no-fill header, black text, horizontal rules (academic style)
- Black header divider rule; all-black text theme
- Email/LinkedIn/GitHub shown as blue underlined links
- Kept Times New Roman font unchanged
- Tightened spacing/margins to preserve one-page fit

Co-authored-by: Rahul Chaudhary <155357957+RRNauhwar@users.noreply.github.com>
</commit_message>
<xml_diff>
--- a/Rahul_Chaudhary_Resume.docx
+++ b/Rahul_Chaudhary_Resume.docx
@@ -109,7 +109,7 @@
                 <w:rFonts w:ascii="Times New Roman" w:hAnsi="Times New Roman"/>
                 <w:b/>
                 <w:i w:val="0"/>
-                <w:color w:val="0369A1"/>
+                <w:color w:val="1A1A1A"/>
                 <w:sz w:val="20"/>
               </w:rPr>
               <w:t>Generative AI Engineer  |  Full Stack Developer</w:t>
@@ -166,7 +166,7 @@
                 <w:rFonts w:ascii="Times New Roman" w:hAnsi="Times New Roman"/>
                 <w:b/>
                 <w:i w:val="0"/>
-                <w:color w:val="0369A1"/>
+                <w:color w:val="1A1A1A"/>
                 <w:sz w:val="16"/>
               </w:rPr>
               <w:t xml:space="preserve">Phone: </w:t>
@@ -191,7 +191,7 @@
                 <w:rFonts w:ascii="Times New Roman" w:hAnsi="Times New Roman"/>
                 <w:b/>
                 <w:i w:val="0"/>
-                <w:color w:val="0369A1"/>
+                <w:color w:val="1A1A1A"/>
                 <w:sz w:val="16"/>
               </w:rPr>
               <w:t xml:space="preserve">Email: </w:t>
@@ -201,8 +201,9 @@
                 <w:rFonts w:ascii="Times New Roman" w:hAnsi="Times New Roman"/>
                 <w:b w:val="0"/>
                 <w:i w:val="0"/>
-                <w:color w:val="333333"/>
+                <w:color w:val="0563C1"/>
                 <w:sz w:val="16"/>
+                <w:u w:val="single"/>
               </w:rPr>
               <w:t>rahulch19905@gmail.com</w:t>
             </w:r>
@@ -216,7 +217,7 @@
                 <w:rFonts w:ascii="Times New Roman" w:hAnsi="Times New Roman"/>
                 <w:b/>
                 <w:i w:val="0"/>
-                <w:color w:val="0369A1"/>
+                <w:color w:val="1A1A1A"/>
                 <w:sz w:val="16"/>
               </w:rPr>
               <w:t xml:space="preserve">LinkedIn: </w:t>
@@ -226,8 +227,9 @@
                 <w:rFonts w:ascii="Times New Roman" w:hAnsi="Times New Roman"/>
                 <w:b w:val="0"/>
                 <w:i w:val="0"/>
-                <w:color w:val="333333"/>
+                <w:color w:val="0563C1"/>
                 <w:sz w:val="16"/>
+                <w:u w:val="single"/>
               </w:rPr>
               <w:t>in/rahul-chaudhary-9a7b82310</w:t>
             </w:r>
@@ -241,7 +243,7 @@
                 <w:rFonts w:ascii="Times New Roman" w:hAnsi="Times New Roman"/>
                 <w:b/>
                 <w:i w:val="0"/>
-                <w:color w:val="0369A1"/>
+                <w:color w:val="1A1A1A"/>
                 <w:sz w:val="16"/>
               </w:rPr>
               <w:t xml:space="preserve">GitHub: </w:t>
@@ -251,8 +253,9 @@
                 <w:rFonts w:ascii="Times New Roman" w:hAnsi="Times New Roman"/>
                 <w:b w:val="0"/>
                 <w:i w:val="0"/>
-                <w:color w:val="333333"/>
+                <w:color w:val="0563C1"/>
                 <w:sz w:val="16"/>
+                <w:u w:val="single"/>
               </w:rPr>
               <w:t>github.com/RRNauhwar</w:t>
             </w:r>
@@ -266,7 +269,7 @@
                 <w:rFonts w:ascii="Times New Roman" w:hAnsi="Times New Roman"/>
                 <w:b/>
                 <w:i w:val="0"/>
-                <w:color w:val="0369A1"/>
+                <w:color w:val="1A1A1A"/>
                 <w:sz w:val="16"/>
               </w:rPr>
               <w:t xml:space="preserve">Location: </w:t>
@@ -289,7 +292,7 @@
       <w:pPr>
         <w:spacing w:before="60" w:after="60" w:line="240" w:lineRule="auto"/>
         <w:pBdr>
-          <w:bottom w:val="single" w:sz="20" w:space="1" w:color="0369A1"/>
+          <w:bottom w:val="single" w:sz="20" w:space="1" w:color="000000"/>
         </w:pBdr>
       </w:pPr>
     </w:p>
@@ -314,7 +317,7 @@
         <w:tc>
           <w:tcPr>
             <w:tcW w:type="dxa" w:w="10800"/>
-            <w:shd w:val="clear" w:color="auto" w:fill="0EA5E9"/>
+            <w:shd w:val="clear" w:color="auto" w:fill="D9D9D9"/>
             <w:tcMar>
               <w:top w:w="8" w:type="dxa"/>
               <w:bottom w:w="8" w:type="dxa"/>
@@ -331,7 +334,7 @@
                 <w:rFonts w:ascii="Times New Roman" w:hAnsi="Times New Roman"/>
                 <w:b/>
                 <w:i w:val="0"/>
-                <w:color w:val="FFFFFF"/>
+                <w:color w:val="1A1A1A"/>
                 <w:sz w:val="20"/>
               </w:rPr>
               <w:t>EDUCATION</w:t>
@@ -362,13 +365,16 @@
         <w:tc>
           <w:tcPr>
             <w:tcW w:type="dxa" w:w="4392"/>
-            <w:shd w:val="clear" w:color="auto" w:fill="0369A1"/>
             <w:tcMar>
               <w:top w:w="10" w:type="dxa"/>
               <w:bottom w:w="10" w:type="dxa"/>
               <w:start w:w="90" w:type="dxa"/>
               <w:end w:w="90" w:type="dxa"/>
             </w:tcMar>
+            <w:tcBorders>
+              <w:top w:val="single" w:sz="8" w:space="0" w:color="000000"/>
+              <w:bottom w:val="single" w:sz="6" w:space="0" w:color="000000"/>
+            </w:tcBorders>
           </w:tcPr>
           <w:p>
             <w:pPr>
@@ -379,7 +385,7 @@
                 <w:rFonts w:ascii="Times New Roman" w:hAnsi="Times New Roman"/>
                 <w:b/>
                 <w:i w:val="0"/>
-                <w:color w:val="FFFFFF"/>
+                <w:color w:val="1A1A1A"/>
                 <w:sz w:val="17"/>
               </w:rPr>
               <w:t>Qualification</w:t>
@@ -389,13 +395,16 @@
         <w:tc>
           <w:tcPr>
             <w:tcW w:type="dxa" w:w="4104"/>
-            <w:shd w:val="clear" w:color="auto" w:fill="0369A1"/>
             <w:tcMar>
               <w:top w:w="10" w:type="dxa"/>
               <w:bottom w:w="10" w:type="dxa"/>
               <w:start w:w="90" w:type="dxa"/>
               <w:end w:w="90" w:type="dxa"/>
             </w:tcMar>
+            <w:tcBorders>
+              <w:top w:val="single" w:sz="8" w:space="0" w:color="000000"/>
+              <w:bottom w:val="single" w:sz="6" w:space="0" w:color="000000"/>
+            </w:tcBorders>
           </w:tcPr>
           <w:p>
             <w:pPr>
@@ -406,7 +415,7 @@
                 <w:rFonts w:ascii="Times New Roman" w:hAnsi="Times New Roman"/>
                 <w:b/>
                 <w:i w:val="0"/>
-                <w:color w:val="FFFFFF"/>
+                <w:color w:val="1A1A1A"/>
                 <w:sz w:val="17"/>
               </w:rPr>
               <w:t>Institute</w:t>
@@ -416,13 +425,16 @@
         <w:tc>
           <w:tcPr>
             <w:tcW w:type="dxa" w:w="1224"/>
-            <w:shd w:val="clear" w:color="auto" w:fill="0369A1"/>
             <w:tcMar>
               <w:top w:w="10" w:type="dxa"/>
               <w:bottom w:w="10" w:type="dxa"/>
               <w:start w:w="90" w:type="dxa"/>
               <w:end w:w="90" w:type="dxa"/>
             </w:tcMar>
+            <w:tcBorders>
+              <w:top w:val="single" w:sz="8" w:space="0" w:color="000000"/>
+              <w:bottom w:val="single" w:sz="6" w:space="0" w:color="000000"/>
+            </w:tcBorders>
           </w:tcPr>
           <w:p>
             <w:pPr>
@@ -433,7 +445,7 @@
                 <w:rFonts w:ascii="Times New Roman" w:hAnsi="Times New Roman"/>
                 <w:b/>
                 <w:i w:val="0"/>
-                <w:color w:val="FFFFFF"/>
+                <w:color w:val="1A1A1A"/>
                 <w:sz w:val="17"/>
               </w:rPr>
               <w:t>Year</w:t>
@@ -443,13 +455,16 @@
         <w:tc>
           <w:tcPr>
             <w:tcW w:type="dxa" w:w="1080"/>
-            <w:shd w:val="clear" w:color="auto" w:fill="0369A1"/>
             <w:tcMar>
               <w:top w:w="10" w:type="dxa"/>
               <w:bottom w:w="10" w:type="dxa"/>
               <w:start w:w="90" w:type="dxa"/>
               <w:end w:w="90" w:type="dxa"/>
             </w:tcMar>
+            <w:tcBorders>
+              <w:top w:val="single" w:sz="8" w:space="0" w:color="000000"/>
+              <w:bottom w:val="single" w:sz="6" w:space="0" w:color="000000"/>
+            </w:tcBorders>
           </w:tcPr>
           <w:p>
             <w:pPr>
@@ -460,7 +475,7 @@
                 <w:rFonts w:ascii="Times New Roman" w:hAnsi="Times New Roman"/>
                 <w:b/>
                 <w:i w:val="0"/>
-                <w:color w:val="FFFFFF"/>
+                <w:color w:val="1A1A1A"/>
                 <w:sz w:val="17"/>
               </w:rPr>
               <w:t>Score</w:t>
@@ -578,7 +593,7 @@
                 <w:rFonts w:ascii="Times New Roman" w:hAnsi="Times New Roman"/>
                 <w:b/>
                 <w:i w:val="0"/>
-                <w:color w:val="0369A1"/>
+                <w:color w:val="1A1A1A"/>
                 <w:sz w:val="17"/>
               </w:rPr>
               <w:t>7.37</w:t>
@@ -696,7 +711,7 @@
                 <w:rFonts w:ascii="Times New Roman" w:hAnsi="Times New Roman"/>
                 <w:b/>
                 <w:i w:val="0"/>
-                <w:color w:val="0369A1"/>
+                <w:color w:val="1A1A1A"/>
                 <w:sz w:val="17"/>
               </w:rPr>
               <w:t>82%</w:t>
@@ -715,7 +730,7 @@
               <w:end w:w="90" w:type="dxa"/>
             </w:tcMar>
             <w:tcBorders>
-              <w:bottom w:val="single" w:sz="4" w:space="0" w:color="D0D7DE"/>
+              <w:bottom w:val="single" w:sz="6" w:space="0" w:color="000000"/>
             </w:tcBorders>
           </w:tcPr>
           <w:p>
@@ -744,7 +759,7 @@
               <w:end w:w="90" w:type="dxa"/>
             </w:tcMar>
             <w:tcBorders>
-              <w:bottom w:val="single" w:sz="4" w:space="0" w:color="D0D7DE"/>
+              <w:bottom w:val="single" w:sz="6" w:space="0" w:color="000000"/>
             </w:tcBorders>
           </w:tcPr>
           <w:p>
@@ -773,7 +788,7 @@
               <w:end w:w="90" w:type="dxa"/>
             </w:tcMar>
             <w:tcBorders>
-              <w:bottom w:val="single" w:sz="4" w:space="0" w:color="D0D7DE"/>
+              <w:bottom w:val="single" w:sz="6" w:space="0" w:color="000000"/>
             </w:tcBorders>
           </w:tcPr>
           <w:p>
@@ -802,7 +817,7 @@
               <w:end w:w="90" w:type="dxa"/>
             </w:tcMar>
             <w:tcBorders>
-              <w:bottom w:val="single" w:sz="4" w:space="0" w:color="D0D7DE"/>
+              <w:bottom w:val="single" w:sz="6" w:space="0" w:color="000000"/>
             </w:tcBorders>
           </w:tcPr>
           <w:p>
@@ -814,7 +829,7 @@
                 <w:rFonts w:ascii="Times New Roman" w:hAnsi="Times New Roman"/>
                 <w:b/>
                 <w:i w:val="0"/>
-                <w:color w:val="0369A1"/>
+                <w:color w:val="1A1A1A"/>
                 <w:sz w:val="17"/>
               </w:rPr>
               <w:t>91.8%</w:t>
@@ -859,7 +874,7 @@
         <w:tc>
           <w:tcPr>
             <w:tcW w:type="dxa" w:w="10800"/>
-            <w:shd w:val="clear" w:color="auto" w:fill="0EA5E9"/>
+            <w:shd w:val="clear" w:color="auto" w:fill="D9D9D9"/>
             <w:tcMar>
               <w:top w:w="8" w:type="dxa"/>
               <w:bottom w:w="8" w:type="dxa"/>
@@ -876,7 +891,7 @@
                 <w:rFonts w:ascii="Times New Roman" w:hAnsi="Times New Roman"/>
                 <w:b/>
                 <w:i w:val="0"/>
-                <w:color w:val="FFFFFF"/>
+                <w:color w:val="1A1A1A"/>
                 <w:sz w:val="20"/>
               </w:rPr>
               <w:t>PROFESSIONAL SUMMARY</w:t>
@@ -927,7 +942,7 @@
         <w:tc>
           <w:tcPr>
             <w:tcW w:type="dxa" w:w="10800"/>
-            <w:shd w:val="clear" w:color="auto" w:fill="0EA5E9"/>
+            <w:shd w:val="clear" w:color="auto" w:fill="D9D9D9"/>
             <w:tcMar>
               <w:top w:w="8" w:type="dxa"/>
               <w:bottom w:w="8" w:type="dxa"/>
@@ -944,7 +959,7 @@
                 <w:rFonts w:ascii="Times New Roman" w:hAnsi="Times New Roman"/>
                 <w:b/>
                 <w:i w:val="0"/>
-                <w:color w:val="FFFFFF"/>
+                <w:color w:val="1A1A1A"/>
                 <w:sz w:val="20"/>
               </w:rPr>
               <w:t>TECHNICAL SKILLS</w:t>
@@ -968,7 +983,7 @@
           <w:rFonts w:ascii="Times New Roman" w:hAnsi="Times New Roman"/>
           <w:b/>
           <w:i w:val="0"/>
-          <w:color w:val="0369A1"/>
+          <w:color w:val="1A1A1A"/>
           <w:sz w:val="18"/>
         </w:rPr>
         <w:t xml:space="preserve">Languages:  </w:t>
@@ -994,7 +1009,7 @@
           <w:rFonts w:ascii="Times New Roman" w:hAnsi="Times New Roman"/>
           <w:b/>
           <w:i w:val="0"/>
-          <w:color w:val="0369A1"/>
+          <w:color w:val="1A1A1A"/>
           <w:sz w:val="18"/>
         </w:rPr>
         <w:t xml:space="preserve">Web &amp; Databases:  </w:t>
@@ -1020,7 +1035,7 @@
           <w:rFonts w:ascii="Times New Roman" w:hAnsi="Times New Roman"/>
           <w:b/>
           <w:i w:val="0"/>
-          <w:color w:val="0369A1"/>
+          <w:color w:val="1A1A1A"/>
           <w:sz w:val="18"/>
         </w:rPr>
         <w:t xml:space="preserve">Generative AI:  </w:t>
@@ -1046,7 +1061,7 @@
           <w:rFonts w:ascii="Times New Roman" w:hAnsi="Times New Roman"/>
           <w:b/>
           <w:i w:val="0"/>
-          <w:color w:val="0369A1"/>
+          <w:color w:val="1A1A1A"/>
           <w:sz w:val="18"/>
         </w:rPr>
         <w:t xml:space="preserve">Tools &amp; Embedded:  </w:t>
@@ -1083,7 +1098,7 @@
         <w:tc>
           <w:tcPr>
             <w:tcW w:type="dxa" w:w="10800"/>
-            <w:shd w:val="clear" w:color="auto" w:fill="0EA5E9"/>
+            <w:shd w:val="clear" w:color="auto" w:fill="D9D9D9"/>
             <w:tcMar>
               <w:top w:w="8" w:type="dxa"/>
               <w:bottom w:w="8" w:type="dxa"/>
@@ -1100,7 +1115,7 @@
                 <w:rFonts w:ascii="Times New Roman" w:hAnsi="Times New Roman"/>
                 <w:b/>
                 <w:i w:val="0"/>
-                <w:color w:val="FFFFFF"/>
+                <w:color w:val="1A1A1A"/>
                 <w:sz w:val="20"/>
               </w:rPr>
               <w:t>EXPERIENCE</w:t>
@@ -1136,7 +1151,7 @@
           <w:rFonts w:ascii="Times New Roman" w:hAnsi="Times New Roman"/>
           <w:b/>
           <w:i w:val="0"/>
-          <w:color w:val="0369A1"/>
+          <w:color w:val="1A1A1A"/>
           <w:sz w:val="19"/>
         </w:rPr>
         <w:t xml:space="preserve">  |  D2 Automation</w:t>
@@ -1172,7 +1187,7 @@
           <w:rFonts w:ascii="Times New Roman" w:hAnsi="Times New Roman"/>
           <w:b/>
           <w:i w:val="0"/>
-          <w:color w:val="0369A1"/>
+          <w:color w:val="1A1A1A"/>
           <w:sz w:val="18"/>
         </w:rPr>
         <w:t xml:space="preserve">•  </w:t>
@@ -1198,7 +1213,7 @@
           <w:rFonts w:ascii="Times New Roman" w:hAnsi="Times New Roman"/>
           <w:b/>
           <w:i w:val="0"/>
-          <w:color w:val="0369A1"/>
+          <w:color w:val="1A1A1A"/>
           <w:sz w:val="18"/>
         </w:rPr>
         <w:t xml:space="preserve">•  </w:t>
@@ -1235,7 +1250,7 @@
         <w:tc>
           <w:tcPr>
             <w:tcW w:type="dxa" w:w="10800"/>
-            <w:shd w:val="clear" w:color="auto" w:fill="0EA5E9"/>
+            <w:shd w:val="clear" w:color="auto" w:fill="D9D9D9"/>
             <w:tcMar>
               <w:top w:w="8" w:type="dxa"/>
               <w:bottom w:w="8" w:type="dxa"/>
@@ -1252,7 +1267,7 @@
                 <w:rFonts w:ascii="Times New Roman" w:hAnsi="Times New Roman"/>
                 <w:b/>
                 <w:i w:val="0"/>
-                <w:color w:val="FFFFFF"/>
+                <w:color w:val="1A1A1A"/>
                 <w:sz w:val="20"/>
               </w:rPr>
               <w:t>PROJECTS</w:t>
@@ -1285,7 +1300,7 @@
           <w:rFonts w:ascii="Times New Roman" w:hAnsi="Times New Roman"/>
           <w:b w:val="0"/>
           <w:i/>
-          <w:color w:val="0369A1"/>
+          <w:color w:val="1A1A1A"/>
           <w:sz w:val="18"/>
         </w:rPr>
         <w:t xml:space="preserve">  –  AI-Powered Virtual Courtroom</w:t>
@@ -1327,7 +1342,7 @@
           <w:rFonts w:ascii="Times New Roman" w:hAnsi="Times New Roman"/>
           <w:b/>
           <w:i w:val="0"/>
-          <w:color w:val="0369A1"/>
+          <w:color w:val="1A1A1A"/>
           <w:sz w:val="18"/>
         </w:rPr>
         <w:t xml:space="preserve">•  </w:t>
@@ -1353,7 +1368,7 @@
           <w:rFonts w:ascii="Times New Roman" w:hAnsi="Times New Roman"/>
           <w:b/>
           <w:i w:val="0"/>
-          <w:color w:val="0369A1"/>
+          <w:color w:val="1A1A1A"/>
           <w:sz w:val="18"/>
         </w:rPr>
         <w:t xml:space="preserve">•  </w:t>
@@ -1388,7 +1403,7 @@
           <w:rFonts w:ascii="Times New Roman" w:hAnsi="Times New Roman"/>
           <w:b w:val="0"/>
           <w:i/>
-          <w:color w:val="0369A1"/>
+          <w:color w:val="1A1A1A"/>
           <w:sz w:val="18"/>
         </w:rPr>
         <w:t xml:space="preserve">  –  Embedded AI &amp; Computer Vision</w:t>
@@ -1430,7 +1445,7 @@
           <w:rFonts w:ascii="Times New Roman" w:hAnsi="Times New Roman"/>
           <w:b/>
           <w:i w:val="0"/>
-          <w:color w:val="0369A1"/>
+          <w:color w:val="1A1A1A"/>
           <w:sz w:val="18"/>
         </w:rPr>
         <w:t xml:space="preserve">•  </w:t>
@@ -1456,7 +1471,7 @@
           <w:rFonts w:ascii="Times New Roman" w:hAnsi="Times New Roman"/>
           <w:b/>
           <w:i w:val="0"/>
-          <w:color w:val="0369A1"/>
+          <w:color w:val="1A1A1A"/>
           <w:sz w:val="18"/>
         </w:rPr>
         <w:t xml:space="preserve">•  </w:t>
@@ -1491,7 +1506,7 @@
           <w:rFonts w:ascii="Times New Roman" w:hAnsi="Times New Roman"/>
           <w:b w:val="0"/>
           <w:i/>
-          <w:color w:val="0369A1"/>
+          <w:color w:val="1A1A1A"/>
           <w:sz w:val="18"/>
         </w:rPr>
         <w:t xml:space="preserve">  –  AI-Powered Deal Discovery Platform</w:t>
@@ -1533,7 +1548,7 @@
           <w:rFonts w:ascii="Times New Roman" w:hAnsi="Times New Roman"/>
           <w:b/>
           <w:i w:val="0"/>
-          <w:color w:val="0369A1"/>
+          <w:color w:val="1A1A1A"/>
           <w:sz w:val="18"/>
         </w:rPr>
         <w:t xml:space="preserve">•  </w:t>
@@ -1559,7 +1574,7 @@
           <w:rFonts w:ascii="Times New Roman" w:hAnsi="Times New Roman"/>
           <w:b/>
           <w:i w:val="0"/>
-          <w:color w:val="0369A1"/>
+          <w:color w:val="1A1A1A"/>
           <w:sz w:val="18"/>
         </w:rPr>
         <w:t xml:space="preserve">•  </w:t>
@@ -1594,7 +1609,7 @@
           <w:rFonts w:ascii="Times New Roman" w:hAnsi="Times New Roman"/>
           <w:b w:val="0"/>
           <w:i/>
-          <w:color w:val="0369A1"/>
+          <w:color w:val="1A1A1A"/>
           <w:sz w:val="18"/>
         </w:rPr>
         <w:t xml:space="preserve">  –  Automated AI News Pipeline</w:t>
@@ -1636,7 +1651,7 @@
           <w:rFonts w:ascii="Times New Roman" w:hAnsi="Times New Roman"/>
           <w:b/>
           <w:i w:val="0"/>
-          <w:color w:val="0369A1"/>
+          <w:color w:val="1A1A1A"/>
           <w:sz w:val="18"/>
         </w:rPr>
         <w:t xml:space="preserve">•  </w:t>
@@ -1662,7 +1677,7 @@
           <w:rFonts w:ascii="Times New Roman" w:hAnsi="Times New Roman"/>
           <w:b/>
           <w:i w:val="0"/>
-          <w:color w:val="0369A1"/>
+          <w:color w:val="1A1A1A"/>
           <w:sz w:val="18"/>
         </w:rPr>
         <w:t xml:space="preserve">•  </w:t>
@@ -1699,7 +1714,7 @@
         <w:tc>
           <w:tcPr>
             <w:tcW w:type="dxa" w:w="10800"/>
-            <w:shd w:val="clear" w:color="auto" w:fill="0EA5E9"/>
+            <w:shd w:val="clear" w:color="auto" w:fill="D9D9D9"/>
             <w:tcMar>
               <w:top w:w="8" w:type="dxa"/>
               <w:bottom w:w="8" w:type="dxa"/>
@@ -1716,7 +1731,7 @@
                 <w:rFonts w:ascii="Times New Roman" w:hAnsi="Times New Roman"/>
                 <w:b/>
                 <w:i w:val="0"/>
-                <w:color w:val="FFFFFF"/>
+                <w:color w:val="1A1A1A"/>
                 <w:sz w:val="20"/>
               </w:rPr>
               <w:t>CERTIFICATIONS</w:t>
@@ -1740,7 +1755,7 @@
           <w:rFonts w:ascii="Times New Roman" w:hAnsi="Times New Roman"/>
           <w:b/>
           <w:i w:val="0"/>
-          <w:color w:val="0369A1"/>
+          <w:color w:val="1A1A1A"/>
           <w:sz w:val="18"/>
         </w:rPr>
         <w:t xml:space="preserve">•  </w:t>
@@ -1776,7 +1791,7 @@
           <w:rFonts w:ascii="Times New Roman" w:hAnsi="Times New Roman"/>
           <w:b/>
           <w:i w:val="0"/>
-          <w:color w:val="0369A1"/>
+          <w:color w:val="1A1A1A"/>
           <w:sz w:val="18"/>
         </w:rPr>
         <w:t xml:space="preserve">•  </w:t>
@@ -1812,7 +1827,7 @@
           <w:rFonts w:ascii="Times New Roman" w:hAnsi="Times New Roman"/>
           <w:b/>
           <w:i w:val="0"/>
-          <w:color w:val="0369A1"/>
+          <w:color w:val="1A1A1A"/>
           <w:sz w:val="18"/>
         </w:rPr>
         <w:t xml:space="preserve">•  </w:t>
@@ -1848,7 +1863,7 @@
           <w:rFonts w:ascii="Times New Roman" w:hAnsi="Times New Roman"/>
           <w:b/>
           <w:i w:val="0"/>
-          <w:color w:val="0369A1"/>
+          <w:color w:val="1A1A1A"/>
           <w:sz w:val="18"/>
         </w:rPr>
         <w:t xml:space="preserve">•  </w:t>
@@ -1895,7 +1910,7 @@
         <w:tc>
           <w:tcPr>
             <w:tcW w:type="dxa" w:w="10800"/>
-            <w:shd w:val="clear" w:color="auto" w:fill="0EA5E9"/>
+            <w:shd w:val="clear" w:color="auto" w:fill="D9D9D9"/>
             <w:tcMar>
               <w:top w:w="8" w:type="dxa"/>
               <w:bottom w:w="8" w:type="dxa"/>
@@ -1912,7 +1927,7 @@
                 <w:rFonts w:ascii="Times New Roman" w:hAnsi="Times New Roman"/>
                 <w:b/>
                 <w:i w:val="0"/>
-                <w:color w:val="FFFFFF"/>
+                <w:color w:val="1A1A1A"/>
                 <w:sz w:val="20"/>
               </w:rPr>
               <w:t>ACHIEVEMENTS</w:t>
@@ -1936,7 +1951,7 @@
           <w:rFonts w:ascii="Times New Roman" w:hAnsi="Times New Roman"/>
           <w:b/>
           <w:i w:val="0"/>
-          <w:color w:val="0369A1"/>
+          <w:color w:val="1A1A1A"/>
           <w:sz w:val="18"/>
         </w:rPr>
         <w:t xml:space="preserve">•  </w:t>
@@ -1962,7 +1977,7 @@
           <w:rFonts w:ascii="Times New Roman" w:hAnsi="Times New Roman"/>
           <w:b/>
           <w:i w:val="0"/>
-          <w:color w:val="0369A1"/>
+          <w:color w:val="1A1A1A"/>
           <w:sz w:val="18"/>
         </w:rPr>
         <w:t xml:space="preserve">•  </w:t>
@@ -1988,7 +2003,7 @@
           <w:rFonts w:ascii="Times New Roman" w:hAnsi="Times New Roman"/>
           <w:b/>
           <w:i w:val="0"/>
-          <w:color w:val="0369A1"/>
+          <w:color w:val="1A1A1A"/>
           <w:sz w:val="18"/>
         </w:rPr>
         <w:t xml:space="preserve">•  </w:t>
@@ -2025,7 +2040,7 @@
         <w:tc>
           <w:tcPr>
             <w:tcW w:type="dxa" w:w="10800"/>
-            <w:shd w:val="clear" w:color="auto" w:fill="0EA5E9"/>
+            <w:shd w:val="clear" w:color="auto" w:fill="D9D9D9"/>
             <w:tcMar>
               <w:top w:w="8" w:type="dxa"/>
               <w:bottom w:w="8" w:type="dxa"/>
@@ -2042,7 +2057,7 @@
                 <w:rFonts w:ascii="Times New Roman" w:hAnsi="Times New Roman"/>
                 <w:b/>
                 <w:i w:val="0"/>
-                <w:color w:val="FFFFFF"/>
+                <w:color w:val="1A1A1A"/>
                 <w:sz w:val="20"/>
               </w:rPr>
               <w:t>TECHNICAL INTERESTS &amp; ADDITIONAL INFORMATION</w:t>
@@ -2066,7 +2081,7 @@
           <w:rFonts w:ascii="Times New Roman" w:hAnsi="Times New Roman"/>
           <w:b/>
           <w:i w:val="0"/>
-          <w:color w:val="0369A1"/>
+          <w:color w:val="1A1A1A"/>
           <w:sz w:val="18"/>
         </w:rPr>
         <w:t xml:space="preserve">Technical Interests:  </w:t>
@@ -2092,7 +2107,7 @@
           <w:rFonts w:ascii="Times New Roman" w:hAnsi="Times New Roman"/>
           <w:b/>
           <w:i w:val="0"/>
-          <w:color w:val="0369A1"/>
+          <w:color w:val="1A1A1A"/>
           <w:sz w:val="18"/>
         </w:rPr>
         <w:t xml:space="preserve">Extra-Curricular:  </w:t>
@@ -2118,7 +2133,7 @@
           <w:rFonts w:ascii="Times New Roman" w:hAnsi="Times New Roman"/>
           <w:b/>
           <w:i w:val="0"/>
-          <w:color w:val="0369A1"/>
+          <w:color w:val="1A1A1A"/>
           <w:sz w:val="18"/>
         </w:rPr>
         <w:t xml:space="preserve">Languages:  </w:t>
@@ -2136,7 +2151,7 @@
     </w:p>
     <w:sectPr>
       <w:pgSz w:w="12240" w:h="15840"/>
-      <w:pgMar w:top="576" w:right="720" w:bottom="576" w:left="720" w:header="720" w:footer="720" w:gutter="0"/>
+      <w:pgMar w:top="504" w:right="720" w:bottom="504" w:left="720" w:header="720" w:footer="720" w:gutter="0"/>
       <w:cols w:space="720"/>
       <w:docGrid w:linePitch="360"/>
     </w:sectPr>

</xml_diff>

<commit_message>
Add interview prep handbook + align resume claims with actual code
- Add evidence-based interview preparation handbook (HTML + 54-page PDF)
  validated against real repos (NyayaSim/Legal-Ai-App, TradeLab-AI, Bookstore)
- Resume: reword summary/skills to be code-accurate
  * RAG/Agentic AI -> LLM orchestration / prompt-orchestration pipelines
  * add Kotlin, Android (Jetpack Compose/Room/Hilt), Prisma, Redis, Anthropic
  * NyayaSim: accurate stack (Kotlin Android, Supabase Auth, OpenAI/Gemini/Anthropic)
    and provider-agnostic LLM + security bullets
- Keep resume to a single page (verified via WeasyPrint)

Co-authored-by: Rahul Chaudhary <155357957+RRNauhwar@users.noreply.github.com>
</commit_message>
<xml_diff>
--- a/Rahul_Chaudhary_Resume.docx
+++ b/Rahul_Chaudhary_Resume.docx
@@ -918,7 +918,7 @@
           <w:color w:val="333333"/>
           <w:sz w:val="18"/>
         </w:rPr>
-        <w:t>Generative AI Engineer and Full Stack Developer who builds complete AI-powered products end to end. Skilled in LLM applications, RAG pipelines, and agentic AI workflows with the OpenAI and Gemini APIs, plus production-ready React and Node.js platforms with secure authentication and scalable REST APIs. Focused on backend engineering, AI automation, and reliable systems that solve real-world problems.</w:t>
+        <w:t>Generative AI Engineer and Full Stack Developer who builds complete AI products end to end. Skilled in LLM applications and prompt-orchestration pipelines over the OpenAI, Gemini, and Anthropic APIs, plus production-ready React/Node.js and Android apps with secure auth and layered API security. Focused on backend engineering, AI automation, and reliable real-world systems.</w:t>
       </w:r>
     </w:p>
     <w:tbl>
@@ -996,7 +996,7 @@
           <w:color w:val="333333"/>
           <w:sz w:val="18"/>
         </w:rPr>
-        <w:t>Python, JavaScript, Java, C++</w:t>
+        <w:t>Python, JavaScript, Java, Kotlin, C++</w:t>
       </w:r>
     </w:p>
     <w:p>
@@ -1022,7 +1022,7 @@
           <w:color w:val="333333"/>
           <w:sz w:val="18"/>
         </w:rPr>
-        <w:t>React, Node.js, Express.js, REST APIs, MongoDB, PostgreSQL, Supabase</w:t>
+        <w:t>React, Node.js, Express.js, REST APIs, MongoDB, PostgreSQL, Prisma, Redis, Supabase</w:t>
       </w:r>
     </w:p>
     <w:p>
@@ -1048,7 +1048,7 @@
           <w:color w:val="333333"/>
           <w:sz w:val="18"/>
         </w:rPr>
-        <w:t>OpenAI API, Gemini API, Prompt Engineering, RAG, Agentic AI, Workflow Automation</w:t>
+        <w:t>OpenAI, Gemini &amp; Anthropic APIs, Prompt Engineering, LLM Orchestration, Workflow Automation</w:t>
       </w:r>
     </w:p>
     <w:p>
@@ -1064,7 +1064,7 @@
           <w:color w:val="1A1A1A"/>
           <w:sz w:val="18"/>
         </w:rPr>
-        <w:t xml:space="preserve">Tools &amp; Embedded:  </w:t>
+        <w:t xml:space="preserve">Mobile &amp; Tools:  </w:t>
       </w:r>
       <w:r>
         <w:rPr>
@@ -1074,7 +1074,7 @@
           <w:color w:val="333333"/>
           <w:sz w:val="18"/>
         </w:rPr>
-        <w:t>Git, GitHub, Docker, Postman, n8n, Raspberry Pi, Computer Vision, YOLO</w:t>
+        <w:t>Android (Jetpack Compose, Room, Hilt), Docker, Git, Postman, n8n, Raspberry Pi, YOLO</w:t>
       </w:r>
     </w:p>
     <w:tbl>
@@ -1226,7 +1226,7 @@
           <w:color w:val="333333"/>
           <w:sz w:val="18"/>
         </w:rPr>
-        <w:t>Developed a Telegram chatbot and Python automation scripts to handle user queries and eliminate repetitive manual tasks through API integrations.</w:t>
+        <w:t>Built a Telegram chatbot and Python scripts to handle user queries and automate repetitive manual tasks through API integrations.</w:t>
       </w:r>
     </w:p>
     <w:tbl>
@@ -1329,7 +1329,7 @@
           <w:color w:val="333333"/>
           <w:sz w:val="16"/>
         </w:rPr>
-        <w:t>React, Node.js, Express.js, Supabase, PostgreSQL, OpenAI API, Gemini API</w:t>
+        <w:t>React, Node.js, Express.js, Kotlin (Android), Supabase Auth, OpenAI / Gemini / Anthropic APIs</w:t>
       </w:r>
     </w:p>
     <w:p>
@@ -1355,7 +1355,7 @@
           <w:color w:val="333333"/>
           <w:sz w:val="18"/>
         </w:rPr>
-        <w:t>Architected an AI courtroom using Generative and Agentic AI to simulate judges, witnesses, and legal arguments, with secure authentication, case management, and digital evidence modules.</w:t>
+        <w:t>Architected an AI courtroom (React, Node/Express, Kotlin Android) where LLM personas play the judge, opposing counsel, and witnesses in English and Hindi, citing Indian statutes.</w:t>
       </w:r>
     </w:p>
     <w:p>
@@ -1381,7 +1381,7 @@
           <w:color w:val="333333"/>
           <w:sz w:val="18"/>
         </w:rPr>
-        <w:t>Designed scalable REST APIs following Clean Architecture and SOLID principles for maintainable backend services.</w:t>
+        <w:t>Built a provider-agnostic LLM layer (OpenAI/Gemini/Anthropic) with automatic fallback and production-style security (JWT auth, RBAC, CSRF, rate limiting, audit logging), following Clean Architecture and SOLID.</w:t>
       </w:r>
     </w:p>
     <w:p>
@@ -2120,14 +2120,8 @@
           <w:color w:val="333333"/>
           <w:sz w:val="18"/>
         </w:rPr>
-        <w:t>Chess, Space &amp; Astronomy</w:t>
+        <w:t xml:space="preserve">Chess, Space &amp; Astronomy    •    </w:t>
       </w:r>
-    </w:p>
-    <w:p>
-      <w:pPr>
-        <w:spacing w:before="0" w:after="20" w:lineRule="exact" w:line="206"/>
-        <w:ind w:left="72"/>
-      </w:pPr>
       <w:r>
         <w:rPr>
           <w:rFonts w:ascii="Times New Roman" w:hAnsi="Times New Roman"/>

</xml_diff>